<commit_message>
Fix MathType alignment, size scopes and editing markers; document TeX conventions
</commit_message>
<xml_diff>
--- a/examples/long-formula-mathtype.docx
+++ b/examples/long-formula-mathtype.docx
@@ -8,7 +8,7 @@
         <w:ind w:firstLine="0"/>
       </w:pPr>
       <w:r>
-        <w:pict w14:anchorId="06E001C9">
+        <w:pict w14:anchorId="16171EFD">
           <v:shapetype id="_x0000_t202" coordsize="21600,21600" o:spt="202" path="m,l,21600r21600,l21600,xe">
             <v:stroke joinstyle="miter"/>
             <v:path gradientshapeok="t" o:connecttype="rect"/>
@@ -36,7 +36,7 @@
         </w:pict>
       </w:r>
       <w:r>
-        <w:pict w14:anchorId="5AB12395">
+        <w:pict w14:anchorId="100C7B99">
           <v:shape id="native_front_10002" o:spid="_x0000_s2116" type="#_x0000_t202" style="position:absolute;left:0;text-align:left;margin-left:390.05pt;margin-top:74.6pt;width:26pt;height:19.2pt;z-index:251624448;mso-position-horizontal-relative:page;mso-position-vertical-relative:page" filled="f" stroked="f">
             <v:textbox inset="0,0,0,0">
               <w:txbxContent>
@@ -60,7 +60,7 @@
         </w:pict>
       </w:r>
       <w:r>
-        <w:pict w14:anchorId="58AEE15F">
+        <w:pict w14:anchorId="49EE4C16">
           <v:shape id="native_front_10003" o:spid="_x0000_s2115" type="#_x0000_t202" style="position:absolute;left:0;text-align:left;margin-left:89.85pt;margin-top:96.2pt;width:33.35pt;height:19.2pt;z-index:251625472;mso-position-horizontal-relative:page;mso-position-vertical-relative:page" filled="f" stroked="f">
             <v:textbox inset="0,0,0,0">
               <w:txbxContent>
@@ -84,7 +84,7 @@
         </w:pict>
       </w:r>
       <w:r>
-        <w:pict w14:anchorId="4808D5F9">
+        <w:pict w14:anchorId="55E9C7F9">
           <v:shape id="native_front_10004" o:spid="_x0000_s2114" type="#_x0000_t202" style="position:absolute;left:0;text-align:left;margin-left:390.05pt;margin-top:96.2pt;width:26pt;height:19.2pt;z-index:251626496;mso-position-horizontal-relative:page;mso-position-vertical-relative:page" filled="f" stroked="f">
             <v:textbox inset="0,0,0,0">
               <w:txbxContent>
@@ -108,7 +108,7 @@
         </w:pict>
       </w:r>
       <w:r>
-        <w:pict w14:anchorId="160590D8">
+        <w:pict w14:anchorId="04A98F73">
           <v:shape id="native_front_10005" o:spid="_x0000_s2113" type="#_x0000_t202" style="position:absolute;left:0;text-align:left;margin-left:219.65pt;margin-top:202.9pt;width:158pt;height:41.6pt;z-index:251627520;mso-position-horizontal-relative:page;mso-position-vertical-relative:page" filled="f" stroked="f">
             <v:textbox inset="0,0,0,0">
               <w:txbxContent>
@@ -133,7 +133,7 @@
         </w:pict>
       </w:r>
       <w:r>
-        <w:pict w14:anchorId="6E926AB5">
+        <w:pict w14:anchorId="77F0E925">
           <v:shape id="native_front_10006" o:spid="_x0000_s2112" type="#_x0000_t202" style="position:absolute;left:0;text-align:left;margin-left:167.65pt;margin-top:284.95pt;width:262pt;height:41.6pt;z-index:251628544;mso-position-horizontal-relative:page;mso-position-vertical-relative:page" filled="f" stroked="f">
             <v:textbox inset="0,0,0,0">
               <w:txbxContent>
@@ -158,7 +158,7 @@
         </w:pict>
       </w:r>
       <w:r>
-        <w:pict w14:anchorId="0214A375">
+        <w:pict w14:anchorId="702D1D62">
           <v:shape id="native_front_10007" o:spid="_x0000_s2111" type="#_x0000_t202" style="position:absolute;left:0;text-align:left;margin-left:222.55pt;margin-top:450.85pt;width:74pt;height:19.2pt;z-index:251629568;mso-position-horizontal-relative:page;mso-position-vertical-relative:page" filled="f" stroked="f">
             <v:textbox inset="0,0,0,0">
               <w:txbxContent>
@@ -182,7 +182,7 @@
         </w:pict>
       </w:r>
       <w:r>
-        <w:pict w14:anchorId="6CCF8329">
+        <w:pict w14:anchorId="0DCD3D01">
           <v:shape id="native_front_10008" o:spid="_x0000_s2110" type="#_x0000_t202" style="position:absolute;left:0;text-align:left;margin-left:297.7pt;margin-top:450.85pt;width:50pt;height:19.2pt;z-index:251630592;mso-position-horizontal-relative:page;mso-position-vertical-relative:page" filled="f" stroked="f">
             <v:textbox inset="0,0,0,0">
               <w:txbxContent>
@@ -206,7 +206,7 @@
         </w:pict>
       </w:r>
       <w:r>
-        <w:pict w14:anchorId="6FE7BCEC">
+        <w:pict w14:anchorId="15AA0158">
           <v:shape id="native_front_10009" o:spid="_x0000_s2109" type="#_x0000_t202" style="position:absolute;left:0;text-align:left;margin-left:234.55pt;margin-top:487.55pt;width:62pt;height:19.2pt;z-index:251631616;mso-position-horizontal-relative:page;mso-position-vertical-relative:page" filled="f" stroked="f">
             <v:textbox inset="0,0,0,0">
               <w:txbxContent>
@@ -230,7 +230,7 @@
         </w:pict>
       </w:r>
       <w:r>
-        <w:pict w14:anchorId="28479269">
+        <w:pict w14:anchorId="3602465D">
           <v:shape id="native_front_10010" o:spid="_x0000_s2108" type="#_x0000_t202" style="position:absolute;left:0;text-align:left;margin-left:297.7pt;margin-top:487.55pt;width:50pt;height:19.2pt;z-index:251632640;mso-position-horizontal-relative:page;mso-position-vertical-relative:page" filled="f" stroked="f">
             <v:textbox inset="0,0,0,0">
               <w:txbxContent>
@@ -254,7 +254,7 @@
         </w:pict>
       </w:r>
       <w:r>
-        <w:pict w14:anchorId="5CC8968B">
+        <w:pict w14:anchorId="10523CDF">
           <v:shape id="native_front_10011" o:spid="_x0000_s2107" type="#_x0000_t202" style="position:absolute;left:0;text-align:left;margin-left:348.7pt;margin-top:487.55pt;width:26pt;height:19.2pt;z-index:251633664;mso-position-horizontal-relative:page;mso-position-vertical-relative:page" filled="f" stroked="f">
             <v:textbox inset="0,0,0,0">
               <w:txbxContent>
@@ -278,7 +278,7 @@
         </w:pict>
       </w:r>
       <w:r>
-        <w:pict w14:anchorId="16442884">
+        <w:pict w14:anchorId="3DF5FDBF">
           <v:shape id="native_front_10012" o:spid="_x0000_s2106" type="#_x0000_t202" style="position:absolute;left:0;text-align:left;margin-left:234.55pt;margin-top:524.25pt;width:62pt;height:19.2pt;z-index:251634688;mso-position-horizontal-relative:page;mso-position-vertical-relative:page" filled="f" stroked="f">
             <v:textbox inset="0,0,0,0">
               <w:txbxContent>
@@ -302,7 +302,7 @@
         </w:pict>
       </w:r>
       <w:r>
-        <w:pict w14:anchorId="4FD31782">
+        <w:pict w14:anchorId="21144DD9">
           <v:shape id="native_front_10013" o:spid="_x0000_s2105" type="#_x0000_t202" style="position:absolute;left:0;text-align:left;margin-left:297.7pt;margin-top:524.25pt;width:74pt;height:19.2pt;z-index:251635712;mso-position-horizontal-relative:page;mso-position-vertical-relative:page" filled="f" stroked="f">
             <v:textbox inset="0,0,0,0">
               <w:txbxContent>
@@ -326,7 +326,7 @@
         </w:pict>
       </w:r>
       <w:r>
-        <w:pict w14:anchorId="7039C1F9">
+        <w:pict w14:anchorId="22FB3FEC">
           <v:shape id="native_front_10014" o:spid="_x0000_s2104" type="#_x0000_t202" style="position:absolute;left:0;text-align:left;margin-left:234.55pt;margin-top:561pt;width:62pt;height:19.2pt;z-index:251636736;mso-position-horizontal-relative:page;mso-position-vertical-relative:page" filled="f" stroked="f">
             <v:textbox inset="0,0,0,0">
               <w:txbxContent>
@@ -350,7 +350,7 @@
         </w:pict>
       </w:r>
       <w:r>
-        <w:pict w14:anchorId="72D34EF0">
+        <w:pict w14:anchorId="1BCFFC28">
           <v:shape id="native_front_10015" o:spid="_x0000_s2103" type="#_x0000_t202" style="position:absolute;left:0;text-align:left;margin-left:297.7pt;margin-top:561pt;width:74pt;height:19.2pt;z-index:251637760;mso-position-horizontal-relative:page;mso-position-vertical-relative:page" filled="f" stroked="f">
             <v:textbox inset="0,0,0,0">
               <w:txbxContent>
@@ -374,7 +374,7 @@
         </w:pict>
       </w:r>
       <w:r>
-        <w:pict w14:anchorId="2F88332B">
+        <w:pict w14:anchorId="15093F95">
           <v:shape id="native_front_10016" o:spid="_x0000_s2102" type="#_x0000_t202" style="position:absolute;left:0;text-align:left;margin-left:234.55pt;margin-top:597.7pt;width:62pt;height:19.2pt;z-index:251638784;mso-position-horizontal-relative:page;mso-position-vertical-relative:page" filled="f" stroked="f">
             <v:textbox inset="0,0,0,0">
               <w:txbxContent>
@@ -398,7 +398,7 @@
         </w:pict>
       </w:r>
       <w:r>
-        <w:pict w14:anchorId="171FB457">
+        <w:pict w14:anchorId="1ED901AF">
           <v:shape id="native_front_10017" o:spid="_x0000_s2101" type="#_x0000_t202" style="position:absolute;left:0;text-align:left;margin-left:297.7pt;margin-top:597.7pt;width:74pt;height:19.2pt;z-index:251639808;mso-position-horizontal-relative:page;mso-position-vertical-relative:page" filled="f" stroked="f">
             <v:textbox inset="0,0,0,0">
               <w:txbxContent>
@@ -422,7 +422,7 @@
         </w:pict>
       </w:r>
       <w:r>
-        <w:pict w14:anchorId="36563E87">
+        <w:pict w14:anchorId="06226627">
           <v:shape id="native_front_10018" o:spid="_x0000_s2100" type="#_x0000_t202" style="position:absolute;left:0;text-align:left;margin-left:257.4pt;margin-top:740.9pt;width:30pt;height:22.4pt;z-index:251640832;mso-position-horizontal-relative:page;mso-position-vertical-relative:page" filled="f" stroked="f">
             <v:textbox inset="0,0,0,0">
               <w:txbxContent>
@@ -447,7 +447,7 @@
         </w:pict>
       </w:r>
       <w:r>
-        <w:pict w14:anchorId="25A9A17A">
+        <w:pict w14:anchorId="70B595E5">
           <v:shape id="native_front_10019" o:spid="_x0000_s2099" type="#_x0000_t202" style="position:absolute;left:0;text-align:left;margin-left:285.4pt;margin-top:740.9pt;width:19.5pt;height:22.4pt;z-index:251641856;mso-position-horizontal-relative:page;mso-position-vertical-relative:page" filled="f" stroked="f">
             <v:textbox inset="0,0,0,0">
               <w:txbxContent>
@@ -483,7 +483,7 @@
         </w:pict>
       </w:r>
       <w:r>
-        <w:pict w14:anchorId="77A49664">
+        <w:pict w14:anchorId="01446715">
           <v:shape id="native_front_10020" o:spid="_x0000_s2098" type="#_x0000_t202" style="position:absolute;left:0;text-align:left;margin-left:306.4pt;margin-top:740.9pt;width:16pt;height:22.4pt;z-index:251642880;mso-position-horizontal-relative:page;mso-position-vertical-relative:page" filled="f" stroked="f">
             <v:textbox inset="0,0,0,0">
               <w:txbxContent>
@@ -508,7 +508,7 @@
         </w:pict>
       </w:r>
       <w:r>
-        <w:pict w14:anchorId="002A68B4">
+        <w:pict w14:anchorId="383351E4">
           <v:shape id="native_front_10021" o:spid="_x0000_s2097" type="#_x0000_t202" style="position:absolute;left:0;text-align:left;margin-left:320.4pt;margin-top:740.9pt;width:19.5pt;height:22.4pt;z-index:251643904;mso-position-horizontal-relative:page;mso-position-vertical-relative:page" filled="f" stroked="f">
             <v:textbox inset="0,0,0,0">
               <w:txbxContent>
@@ -544,7 +544,7 @@
         </w:pict>
       </w:r>
       <w:r>
-        <w:pict w14:anchorId="75FF63EE">
+        <w:pict w14:anchorId="23D979B0">
           <v:shape id="native_front_10022" o:spid="_x0000_s2096" type="#_x0000_t202" style="position:absolute;left:0;text-align:left;margin-left:55.75pt;margin-top:136.9pt;width:14pt;height:19.2pt;z-index:251644928;mso-position-horizontal-relative:page;mso-position-vertical-relative:page" filled="f" stroked="f">
             <v:textbox inset="0,0,0,0">
               <w:txbxContent>
@@ -568,7 +568,7 @@
         </w:pict>
       </w:r>
       <w:r>
-        <w:pict w14:anchorId="61A9978C">
+        <w:pict w14:anchorId="691E1C6B">
           <v:shape id="native_front_10023" o:spid="_x0000_s2095" type="#_x0000_t202" style="position:absolute;left:0;text-align:left;margin-left:55.75pt;margin-top:154.9pt;width:14pt;height:19.2pt;z-index:251645952;mso-position-horizontal-relative:page;mso-position-vertical-relative:page" filled="f" stroked="f">
             <v:textbox inset="0,0,0,0">
               <w:txbxContent>
@@ -592,7 +592,7 @@
         </w:pict>
       </w:r>
       <w:r>
-        <w:pict w14:anchorId="4227C846">
+        <w:pict w14:anchorId="433519A6">
           <v:shape id="native_front_10024" o:spid="_x0000_s2094" type="#_x0000_t202" style="position:absolute;left:0;text-align:left;margin-left:55.75pt;margin-top:172.9pt;width:14pt;height:19.2pt;z-index:251646976;mso-position-horizontal-relative:page;mso-position-vertical-relative:page" filled="f" stroked="f">
             <v:textbox inset="0,0,0,0">
               <w:txbxContent>
@@ -616,7 +616,7 @@
         </w:pict>
       </w:r>
       <w:r>
-        <w:pict w14:anchorId="0B3B0D49">
+        <w:pict w14:anchorId="6725DAE8">
           <v:shape id="native_front_10025" o:spid="_x0000_s2093" type="#_x0000_t202" style="position:absolute;left:0;text-align:left;margin-left:55.75pt;margin-top:190.9pt;width:14pt;height:19.2pt;z-index:251648000;mso-position-horizontal-relative:page;mso-position-vertical-relative:page" filled="f" stroked="f">
             <v:textbox inset="0,0,0,0">
               <w:txbxContent>
@@ -640,7 +640,7 @@
         </w:pict>
       </w:r>
       <w:r>
-        <w:pict w14:anchorId="7379538D">
+        <w:pict w14:anchorId="324BDBCF">
           <v:shape id="native_front_10026" o:spid="_x0000_s2092" type="#_x0000_t202" style="position:absolute;left:0;text-align:left;margin-left:55.75pt;margin-top:208.9pt;width:14pt;height:19.2pt;z-index:251649024;mso-position-horizontal-relative:page;mso-position-vertical-relative:page" filled="f" stroked="f">
             <v:textbox inset="0,0,0,0">
               <w:txbxContent>
@@ -664,7 +664,7 @@
         </w:pict>
       </w:r>
       <w:r>
-        <w:pict w14:anchorId="1087449B">
+        <w:pict w14:anchorId="233C72C3">
           <v:shape id="native_front_10027" o:spid="_x0000_s2091" type="#_x0000_t202" style="position:absolute;left:0;text-align:left;margin-left:55.75pt;margin-top:226.9pt;width:14pt;height:19.2pt;z-index:251650048;mso-position-horizontal-relative:page;mso-position-vertical-relative:page" filled="f" stroked="f">
             <v:textbox inset="0,0,0,0">
               <w:txbxContent>
@@ -688,7 +688,7 @@
         </w:pict>
       </w:r>
       <w:r>
-        <w:pict w14:anchorId="305FB5DE">
+        <w:pict w14:anchorId="610B5F28">
           <v:shape id="native_front_10028" o:spid="_x0000_s2090" type="#_x0000_t202" style="position:absolute;left:0;text-align:left;margin-left:55.75pt;margin-top:244.9pt;width:14pt;height:19.2pt;z-index:251651072;mso-position-horizontal-relative:page;mso-position-vertical-relative:page" filled="f" stroked="f">
             <v:textbox inset="0,0,0,0">
               <w:txbxContent>
@@ -712,7 +712,7 @@
         </w:pict>
       </w:r>
       <w:r>
-        <w:pict w14:anchorId="62D0CB08">
+        <w:pict w14:anchorId="0C4E63D7">
           <v:shape id="native_front_10029" o:spid="_x0000_s2089" type="#_x0000_t202" style="position:absolute;left:0;text-align:left;margin-left:55.75pt;margin-top:262.9pt;width:14pt;height:19.2pt;z-index:251652096;mso-position-horizontal-relative:page;mso-position-vertical-relative:page" filled="f" stroked="f">
             <v:textbox inset="0,0,0,0">
               <w:txbxContent>
@@ -736,7 +736,7 @@
         </w:pict>
       </w:r>
       <w:r>
-        <w:pict w14:anchorId="7F09D362">
+        <w:pict w14:anchorId="3658EE92">
           <v:shape id="native_front_10030" o:spid="_x0000_s2088" type="#_x0000_t202" style="position:absolute;left:0;text-align:left;margin-left:55.75pt;margin-top:280.9pt;width:14pt;height:19.2pt;z-index:251653120;mso-position-horizontal-relative:page;mso-position-vertical-relative:page" filled="f" stroked="f">
             <v:textbox inset="0,0,0,0">
               <w:txbxContent>
@@ -760,7 +760,7 @@
         </w:pict>
       </w:r>
       <w:r>
-        <w:pict w14:anchorId="36FF62DE">
+        <w:pict w14:anchorId="0CC52B1D">
           <v:shape id="native_front_10031" o:spid="_x0000_s2087" type="#_x0000_t202" style="position:absolute;left:0;text-align:left;margin-left:55.75pt;margin-top:298.9pt;width:14pt;height:19.2pt;z-index:251654144;mso-position-horizontal-relative:page;mso-position-vertical-relative:page" filled="f" stroked="f">
             <v:textbox inset="0,0,0,0">
               <w:txbxContent>
@@ -784,7 +784,7 @@
         </w:pict>
       </w:r>
       <w:r>
-        <w:pict w14:anchorId="7E80B9AF">
+        <w:pict w14:anchorId="0313A35F">
           <v:shape id="native_front_10032" o:spid="_x0000_s2086" type="#_x0000_t202" style="position:absolute;left:0;text-align:left;margin-left:55.75pt;margin-top:352.9pt;width:14pt;height:19.2pt;z-index:251655168;mso-position-horizontal-relative:page;mso-position-vertical-relative:page" filled="f" stroked="f">
             <v:textbox inset="0,0,0,0">
               <w:txbxContent>
@@ -808,7 +808,7 @@
         </w:pict>
       </w:r>
       <w:r>
-        <w:pict w14:anchorId="2B606304">
+        <w:pict w14:anchorId="236F30F4">
           <v:shape id="native_front_10033" o:spid="_x0000_s2085" type="#_x0000_t202" style="position:absolute;left:0;text-align:left;margin-left:55.75pt;margin-top:370.9pt;width:14pt;height:19.2pt;z-index:251656192;mso-position-horizontal-relative:page;mso-position-vertical-relative:page" filled="f" stroked="f">
             <v:textbox inset="0,0,0,0">
               <w:txbxContent>
@@ -832,7 +832,7 @@
         </w:pict>
       </w:r>
       <w:r>
-        <w:pict w14:anchorId="2BC34E6C">
+        <w:pict w14:anchorId="7BB5D861">
           <v:shape id="native_front_10034" o:spid="_x0000_s2084" type="#_x0000_t202" style="position:absolute;left:0;text-align:left;margin-left:55.75pt;margin-top:388.9pt;width:14pt;height:19.2pt;z-index:251657216;mso-position-horizontal-relative:page;mso-position-vertical-relative:page" filled="f" stroked="f">
             <v:textbox inset="0,0,0,0">
               <w:txbxContent>
@@ -856,7 +856,7 @@
         </w:pict>
       </w:r>
       <w:r>
-        <w:pict w14:anchorId="7EA44106">
+        <w:pict w14:anchorId="0A3B0CFC">
           <v:shape id="native_front_10035" o:spid="_x0000_s2083" type="#_x0000_t202" style="position:absolute;left:0;text-align:left;margin-left:55.75pt;margin-top:406.9pt;width:14pt;height:19.2pt;z-index:251658240;mso-position-horizontal-relative:page;mso-position-vertical-relative:page" filled="f" stroked="f">
             <v:textbox inset="0,0,0,0">
               <w:txbxContent>
@@ -880,28 +880,28 @@
         </w:pict>
       </w:r>
       <w:r>
-        <w:pict w14:anchorId="7E5F816E">
+        <w:pict w14:anchorId="166DC9E2">
           <v:line id="_x0000_s2082" style="position:absolute;left:0;text-align:left;z-index:251682816;mso-position-horizontal-relative:page;mso-position-vertical-relative:page" from="137.85pt,89.45pt" to="217.25pt,89.45pt" strokeweight=".5pt">
             <w10:wrap anchorx="page" anchory="page"/>
           </v:line>
         </w:pict>
       </w:r>
       <w:r>
-        <w:pict w14:anchorId="30F55BB6">
+        <w:pict w14:anchorId="0CE6AEA2">
           <v:line id="_x0000_s2081" style="position:absolute;left:0;text-align:left;z-index:251683840;mso-position-horizontal-relative:page;mso-position-vertical-relative:page" from="426.05pt,89.45pt" to="505.4pt,89.45pt" strokeweight=".5pt">
             <w10:wrap anchorx="page" anchory="page"/>
           </v:line>
         </w:pict>
       </w:r>
       <w:r>
-        <w:pict w14:anchorId="4FCC2D9B">
+        <w:pict w14:anchorId="08C633ED">
           <v:line id="_x0000_s2080" style="position:absolute;left:0;text-align:left;z-index:251684864;mso-position-horizontal-relative:page;mso-position-vertical-relative:page" from="137.85pt,111.05pt" to="217.25pt,111.05pt" strokeweight=".5pt">
             <w10:wrap anchorx="page" anchory="page"/>
           </v:line>
         </w:pict>
       </w:r>
       <w:r>
-        <w:pict w14:anchorId="66FE8100">
+        <w:pict w14:anchorId="36C2D1FB">
           <v:line id="_x0000_s2079" style="position:absolute;left:0;text-align:left;z-index:251685888;mso-position-horizontal-relative:page;mso-position-vertical-relative:page" from="426.05pt,111.05pt" to="505.4pt,111.05pt" strokeweight=".5pt">
             <w10:wrap anchorx="page" anchory="page"/>
           </v:line>
@@ -916,7 +916,7 @@
       </w:pPr>
       <w:r>
         <w:lastRenderedPageBreak/>
-        <w:pict w14:anchorId="4CA7DA34">
+        <w:pict w14:anchorId="6AFE5D94">
           <v:shape id="native_front_10036" o:spid="_x0000_s2078" type="#_x0000_t202" style="position:absolute;left:0;text-align:left;margin-left:208.1pt;margin-top:138.55pt;width:181.1pt;height:25.6pt;z-index:251659264;mso-position-horizontal-relative:page;mso-position-vertical-relative:page" filled="f" stroked="f">
             <v:textbox inset="0,0,0,0">
               <w:txbxContent>
@@ -941,7 +941,7 @@
         </w:pict>
       </w:r>
       <w:r>
-        <w:pict w14:anchorId="5E6AEABC">
+        <w:pict w14:anchorId="3B58D6F9">
           <v:shape id="native_front_10037" o:spid="_x0000_s2077" type="#_x0000_t202" style="position:absolute;left:0;text-align:left;margin-left:249.65pt;margin-top:176.95pt;width:98pt;height:25.6pt;z-index:251660288;mso-position-horizontal-relative:page;mso-position-vertical-relative:page" filled="f" stroked="f">
             <v:textbox inset="0,0,0,0">
               <w:txbxContent>
@@ -966,7 +966,7 @@
         </w:pict>
       </w:r>
       <w:r>
-        <w:pict w14:anchorId="46BC1313">
+        <w:pict w14:anchorId="5A3BF0FD">
           <v:shape id="native_front_10038" o:spid="_x0000_s2076" type="#_x0000_t202" style="position:absolute;left:0;text-align:left;margin-left:99.25pt;margin-top:261.3pt;width:398.75pt;height:35.2pt;z-index:251661312;mso-position-horizontal-relative:page;mso-position-vertical-relative:page" filled="f" stroked="f">
             <v:textbox inset="0,0,0,0">
               <w:txbxContent>
@@ -992,7 +992,7 @@
         </w:pict>
       </w:r>
       <w:r>
-        <w:pict w14:anchorId="3834A582">
+        <w:pict w14:anchorId="4898EE47">
           <v:shape id="native_front_10039" o:spid="_x0000_s2075" type="#_x0000_t202" style="position:absolute;left:0;text-align:left;margin-left:286.55pt;margin-top:432.45pt;width:24.25pt;height:25.6pt;z-index:251662336;mso-position-horizontal-relative:page;mso-position-vertical-relative:page" filled="f" stroked="f">
             <v:textbox inset="0,0,0,0">
               <w:txbxContent>
@@ -1017,7 +1017,7 @@
         </w:pict>
       </w:r>
       <w:r>
-        <w:pict w14:anchorId="56BE2B64">
+        <w:pict w14:anchorId="2DFA07DD">
           <v:shape id="native_front_10040" o:spid="_x0000_s2074" type="#_x0000_t202" style="position:absolute;left:0;text-align:left;margin-left:265.65pt;margin-top:474.05pt;width:66pt;height:25.6pt;z-index:251663360;mso-position-horizontal-relative:page;mso-position-vertical-relative:page" filled="f" stroked="f">
             <v:textbox inset="0,0,0,0">
               <w:txbxContent>
@@ -1042,7 +1042,7 @@
         </w:pict>
       </w:r>
       <w:r>
-        <w:pict w14:anchorId="589379E3">
+        <w:pict w14:anchorId="6C0C7C9A">
           <v:shape id="native_front_10041" o:spid="_x0000_s2073" type="#_x0000_t202" style="position:absolute;left:0;text-align:left;margin-left:252.1pt;margin-top:553.9pt;width:93.1pt;height:25.6pt;z-index:251664384;mso-position-horizontal-relative:page;mso-position-vertical-relative:page" filled="f" stroked="f">
             <v:textbox inset="0,0,0,0">
               <w:txbxContent>
@@ -1067,7 +1067,7 @@
         </w:pict>
       </w:r>
       <w:r>
-        <w:pict w14:anchorId="2CB7DC26">
+        <w:pict w14:anchorId="36151F8D">
           <v:shape id="native_front_10042" o:spid="_x0000_s2072" type="#_x0000_t202" style="position:absolute;left:0;text-align:left;margin-left:247.65pt;margin-top:595.5pt;width:66pt;height:25.6pt;z-index:251665408;mso-position-horizontal-relative:page;mso-position-vertical-relative:page" filled="f" stroked="f">
             <v:textbox inset="0,0,0,0">
               <w:txbxContent>
@@ -1092,7 +1092,7 @@
         </w:pict>
       </w:r>
       <w:r>
-        <w:pict w14:anchorId="248559C0">
+        <w:pict w14:anchorId="63682496">
           <v:shape id="native_front_10043" o:spid="_x0000_s2071" type="#_x0000_t202" style="position:absolute;left:0;text-align:left;margin-left:315.6pt;margin-top:595.5pt;width:34pt;height:25.6pt;z-index:251666432;mso-position-horizontal-relative:page;mso-position-vertical-relative:page" filled="f" stroked="f">
             <v:textbox inset="0,0,0,0">
               <w:txbxContent>
@@ -1117,7 +1117,7 @@
         </w:pict>
       </w:r>
       <w:r>
-        <w:pict w14:anchorId="2AD0DA37">
+        <w:pict w14:anchorId="2D506975">
           <v:shape id="native_front_10044" o:spid="_x0000_s2070" type="#_x0000_t202" style="position:absolute;left:0;text-align:left;margin-left:259.35pt;margin-top:755.25pt;width:78.6pt;height:22.4pt;z-index:251667456;mso-position-horizontal-relative:page;mso-position-vertical-relative:page" filled="f" stroked="f">
             <v:textbox inset="0,0,0,0">
               <w:txbxContent>
@@ -1164,7 +1164,7 @@
       </w:pPr>
       <w:r>
         <w:lastRenderedPageBreak/>
-        <w:pict w14:anchorId="2950440D">
+        <w:pict w14:anchorId="00EA749D">
           <v:shape id="native_front_10045" o:spid="_x0000_s2069" type="#_x0000_t202" style="position:absolute;left:0;text-align:left;margin-left:225.65pt;margin-top:96.05pt;width:146pt;height:25.6pt;z-index:251668480;mso-position-horizontal-relative:page;mso-position-vertical-relative:page" filled="f" stroked="f">
             <v:textbox inset="0,0,0,0">
               <w:txbxContent>
@@ -1189,7 +1189,7 @@
         </w:pict>
       </w:r>
       <w:r>
-        <w:pict w14:anchorId="074F78EC">
+        <w:pict w14:anchorId="3D886CF9">
           <v:shape id="native_front_10046" o:spid="_x0000_s2068" type="#_x0000_t202" style="position:absolute;left:0;text-align:left;margin-left:113.85pt;margin-top:145.75pt;width:393.55pt;height:19.2pt;z-index:251669504;mso-position-horizontal-relative:page;mso-position-vertical-relative:page" filled="f" stroked="f">
             <v:textbox inset="0,0,0,0">
               <w:txbxContent>
@@ -1222,7 +1222,7 @@
         </w:pict>
       </w:r>
       <w:r>
-        <w:pict w14:anchorId="0EDEB32E">
+        <w:pict w14:anchorId="35C9604E">
           <v:shape id="native_front_10047" o:spid="_x0000_s2067" type="#_x0000_t202" style="position:absolute;left:0;text-align:left;margin-left:89.85pt;margin-top:167.35pt;width:417.55pt;height:19.2pt;z-index:251670528;mso-position-horizontal-relative:page;mso-position-vertical-relative:page" filled="f" stroked="f">
             <v:textbox inset="0,0,0,0">
               <w:txbxContent>
@@ -1256,7 +1256,7 @@
         </w:pict>
       </w:r>
       <w:r>
-        <w:pict w14:anchorId="108C9D18">
+        <w:pict w14:anchorId="09805918">
           <v:shape id="native_front_10048" o:spid="_x0000_s2066" type="#_x0000_t202" style="position:absolute;left:0;text-align:left;margin-left:89.85pt;margin-top:188.95pt;width:134pt;height:19.2pt;z-index:251671552;mso-position-horizontal-relative:page;mso-position-vertical-relative:page" filled="f" stroked="f">
             <v:textbox inset="0,0,0,0">
               <w:txbxContent>
@@ -1280,7 +1280,7 @@
         </w:pict>
       </w:r>
       <w:r>
-        <w:pict w14:anchorId="7D7349BA">
+        <w:pict w14:anchorId="1BE6AF82">
           <v:shape id="native_front_10049" o:spid="_x0000_s2065" type="#_x0000_t202" style="position:absolute;left:0;text-align:left;margin-left:113.85pt;margin-top:267.2pt;width:74pt;height:19.2pt;z-index:251672576;mso-position-horizontal-relative:page;mso-position-vertical-relative:page" filled="f" stroked="f">
             <v:textbox inset="0,0,0,0">
               <w:txbxContent>
@@ -1304,7 +1304,7 @@
         </w:pict>
       </w:r>
       <w:r>
-        <w:pict w14:anchorId="4AE0649F">
+        <w:pict w14:anchorId="7BE7D422">
           <v:shape id="native_front_10050" o:spid="_x0000_s2064" type="#_x0000_t202" style="position:absolute;left:0;text-align:left;margin-left:384.4pt;margin-top:267.2pt;width:38pt;height:19.2pt;z-index:251673600;mso-position-horizontal-relative:page;mso-position-vertical-relative:page" filled="f" stroked="f">
             <v:textbox inset="0,0,0,0">
               <w:txbxContent>
@@ -1328,14 +1328,14 @@
         </w:pict>
       </w:r>
       <w:r>
-        <w:pict w14:anchorId="1D8111F0">
+        <w:pict w14:anchorId="07C20841">
           <v:line id="_x0000_s2063" style="position:absolute;left:0;text-align:left;z-index:251686912;mso-position-horizontal-relative:page;mso-position-vertical-relative:page" from="185.85pt,282.1pt" to="299.25pt,282.1pt" strokeweight=".5pt">
             <w10:wrap anchorx="page" anchory="page"/>
           </v:line>
         </w:pict>
       </w:r>
       <w:r>
-        <w:pict w14:anchorId="7B99E66C">
+        <w:pict w14:anchorId="39C3484E">
           <v:line id="_x0000_s2062" style="position:absolute;left:0;text-align:left;z-index:251687936;mso-position-horizontal-relative:page;mso-position-vertical-relative:page" from="420.4pt,282.1pt" to="505.4pt,282.1pt" strokeweight=".5pt">
             <w10:wrap anchorx="page" anchory="page"/>
           </v:line>
@@ -1361,7 +1361,7 @@
       </w:pPr>
       <w:r>
         <w:lastRenderedPageBreak/>
-        <w:pict w14:anchorId="5A29ACF4">
+        <w:pict w14:anchorId="13B9B600">
           <v:shape id="native_front_10051" o:spid="_x0000_s2061" type="#_x0000_t202" style="position:absolute;left:0;text-align:left;margin-left:209.65pt;margin-top:96.05pt;width:178pt;height:25.6pt;z-index:251674624;mso-position-horizontal-relative:page;mso-position-vertical-relative:page" filled="f" stroked="f">
             <v:textbox inset="0,0,0,0">
               <w:txbxContent>
@@ -1386,7 +1386,7 @@
         </w:pict>
       </w:r>
       <w:r>
-        <w:pict w14:anchorId="0BDCDFE4">
+        <w:pict w14:anchorId="5687D36C">
           <v:shape id="native_front_10052" o:spid="_x0000_s2060" type="#_x0000_t202" style="position:absolute;left:0;text-align:left;margin-left:113.85pt;margin-top:145.75pt;width:393.55pt;height:19.2pt;z-index:251675648;mso-position-horizontal-relative:page;mso-position-vertical-relative:page" filled="f" stroked="f">
             <v:textbox inset="0,0,0,0">
               <w:txbxContent>
@@ -1419,7 +1419,7 @@
         </w:pict>
       </w:r>
       <w:r>
-        <w:pict w14:anchorId="3385D9BD">
+        <w:pict w14:anchorId="33C6C3A1">
           <v:shape id="native_front_10053" o:spid="_x0000_s2059" type="#_x0000_t202" style="position:absolute;left:0;text-align:left;margin-left:89.85pt;margin-top:167.35pt;width:417.55pt;height:19.2pt;z-index:251676672;mso-position-horizontal-relative:page;mso-position-vertical-relative:page" filled="f" stroked="f">
             <v:textbox inset="0,0,0,0">
               <w:txbxContent>
@@ -1452,7 +1452,7 @@
         </w:pict>
       </w:r>
       <w:r>
-        <w:pict w14:anchorId="30FEEC12">
+        <w:pict w14:anchorId="6B4BD8D1">
           <v:shape id="native_front_10054" o:spid="_x0000_s2058" type="#_x0000_t202" style="position:absolute;left:0;text-align:left;margin-left:89.85pt;margin-top:188.95pt;width:26pt;height:19.2pt;z-index:251677696;mso-position-horizontal-relative:page;mso-position-vertical-relative:page" filled="f" stroked="f">
             <v:textbox inset="0,0,0,0">
               <w:txbxContent>
@@ -1476,7 +1476,7 @@
         </w:pict>
       </w:r>
       <w:r>
-        <w:pict w14:anchorId="3EB34229">
+        <w:pict w14:anchorId="57C9C841">
           <v:shape id="native_front_10055" o:spid="_x0000_s2057" type="#_x0000_t202" style="position:absolute;left:0;text-align:left;margin-left:113.85pt;margin-top:267.2pt;width:74pt;height:19.2pt;z-index:251678720;mso-position-horizontal-relative:page;mso-position-vertical-relative:page" filled="f" stroked="f">
             <v:textbox inset="0,0,0,0">
               <w:txbxContent>
@@ -1500,7 +1500,7 @@
         </w:pict>
       </w:r>
       <w:r>
-        <w:pict w14:anchorId="7DFDEDA4">
+        <w:pict w14:anchorId="7314490A">
           <v:shape id="native_front_10056" o:spid="_x0000_s2056" type="#_x0000_t202" style="position:absolute;left:0;text-align:left;margin-left:360.4pt;margin-top:267.2pt;width:62pt;height:19.2pt;z-index:251679744;mso-position-horizontal-relative:page;mso-position-vertical-relative:page" filled="f" stroked="f">
             <v:textbox inset="0,0,0,0">
               <w:txbxContent>
@@ -1524,7 +1524,7 @@
         </w:pict>
       </w:r>
       <w:r>
-        <w:pict w14:anchorId="1192A91D">
+        <w:pict w14:anchorId="6C430642">
           <v:shape id="native_front_10057" o:spid="_x0000_s2055" type="#_x0000_t202" style="position:absolute;left:0;text-align:left;margin-left:113.85pt;margin-top:317.15pt;width:38pt;height:19.2pt;z-index:251680768;mso-position-horizontal-relative:page;mso-position-vertical-relative:page" filled="f" stroked="f">
             <v:textbox inset="0,0,0,0">
               <w:txbxContent>
@@ -1548,7 +1548,7 @@
         </w:pict>
       </w:r>
       <w:r>
-        <w:pict w14:anchorId="426E6CD1">
+        <w:pict w14:anchorId="6253F51B">
           <v:shape id="native_front_10058" o:spid="_x0000_s2054" type="#_x0000_t202" style="position:absolute;left:0;text-align:left;margin-left:384.4pt;margin-top:317.15pt;width:38pt;height:19.2pt;z-index:251681792;mso-position-horizontal-relative:page;mso-position-vertical-relative:page" filled="f" stroked="f">
             <v:textbox inset="0,0,0,0">
               <w:txbxContent>
@@ -1572,28 +1572,28 @@
         </w:pict>
       </w:r>
       <w:r>
-        <w:pict w14:anchorId="21515902">
+        <w:pict w14:anchorId="49EEF2A3">
           <v:line id="_x0000_s2053" style="position:absolute;left:0;text-align:left;z-index:251688960;mso-position-horizontal-relative:page;mso-position-vertical-relative:page" from="185.85pt,282.1pt" to="270.9pt,282.1pt" strokeweight=".5pt">
             <w10:wrap anchorx="page" anchory="page"/>
           </v:line>
         </w:pict>
       </w:r>
       <w:r>
-        <w:pict w14:anchorId="48D0555A">
+        <w:pict w14:anchorId="6EDF2B48">
           <v:line id="_x0000_s2052" style="position:absolute;left:0;text-align:left;z-index:251689984;mso-position-horizontal-relative:page;mso-position-vertical-relative:page" from="420.4pt,282.1pt" to="505.4pt,282.1pt" strokeweight=".5pt">
             <w10:wrap anchorx="page" anchory="page"/>
           </v:line>
         </w:pict>
       </w:r>
       <w:r>
-        <w:pict w14:anchorId="7B673D4D">
+        <w:pict w14:anchorId="028C61B8">
           <v:line id="_x0000_s2051" style="position:absolute;left:0;text-align:left;z-index:251691008;mso-position-horizontal-relative:page;mso-position-vertical-relative:page" from="149.85pt,332.05pt" to="234.9pt,332.05pt" strokeweight=".5pt">
             <w10:wrap anchorx="page" anchory="page"/>
           </v:line>
         </w:pict>
       </w:r>
       <w:r>
-        <w:pict w14:anchorId="42A7AA7C">
+        <w:pict w14:anchorId="5E8D8D5C">
           <v:line id="_x0000_s2050" style="position:absolute;left:0;text-align:left;z-index:251692032;mso-position-horizontal-relative:page;mso-position-vertical-relative:page" from="420.4pt,332.05pt" to="505.4pt,332.05pt" strokeweight=".5pt">
             <w10:wrap anchorx="page" anchory="page"/>
           </v:line>
@@ -1605,7 +1605,7 @@
         <w:pStyle w:val="1"/>
         <w:pageBreakBefore w:val="0"/>
       </w:pPr>
-      <w:bookmarkStart w:id="0" w:name="_Toc242725214"/>
+      <w:bookmarkStart w:id="0" w:name="_Toc242728501"/>
       <w:r>
         <w:lastRenderedPageBreak/>
         <w:t>摘</w:t>
@@ -1688,7 +1688,7 @@
       <w:pPr>
         <w:pStyle w:val="1"/>
       </w:pPr>
-      <w:bookmarkStart w:id="2" w:name="_Toc242725215"/>
+      <w:bookmarkStart w:id="2" w:name="_Toc242728502"/>
       <w:r>
         <w:lastRenderedPageBreak/>
         <w:t>ABSTRACT</w:t>
@@ -1792,7 +1792,7 @@
         </w:rPr>
         <w:fldChar w:fldCharType="separate"/>
       </w:r>
-      <w:hyperlink w:anchor="_Toc242725214" w:history="1">
+      <w:hyperlink w:anchor="_Toc242728501" w:history="1">
         <w:r>
           <w:rPr>
             <w:rStyle w:val="af"/>
@@ -1857,7 +1857,7 @@
             <w:webHidden/>
             <w:bCs w:val="0"/>
           </w:rPr>
-          <w:instrText>PAGEREF _Toc242725214 \h</w:instrText>
+          <w:instrText>PAGEREF _Toc242728501 \h</w:instrText>
         </w:r>
         <w:r>
           <w:rPr>
@@ -1924,7 +1924,7 @@
           <w14:ligatures w14:val="standardContextual"/>
         </w:rPr>
       </w:pPr>
-      <w:hyperlink w:anchor="_Toc242725215" w:history="1">
+      <w:hyperlink w:anchor="_Toc242728502" w:history="1">
         <w:r>
           <w:rPr>
             <w:rStyle w:val="af"/>
@@ -1971,7 +1971,7 @@
             <w:webHidden/>
             <w:bCs w:val="0"/>
           </w:rPr>
-          <w:instrText>PAGEREF _Toc242725215 \h</w:instrText>
+          <w:instrText>PAGEREF _Toc242728502 \h</w:instrText>
         </w:r>
         <w:r>
           <w:rPr>
@@ -2038,7 +2038,7 @@
           <w14:ligatures w14:val="standardContextual"/>
         </w:rPr>
       </w:pPr>
-      <w:hyperlink w:anchor="_Toc242725216" w:history="1">
+      <w:hyperlink w:anchor="_Toc242728503" w:history="1">
         <w:r>
           <w:rPr>
             <w:rStyle w:val="af"/>
@@ -2103,7 +2103,7 @@
             <w:webHidden/>
             <w:bCs w:val="0"/>
           </w:rPr>
-          <w:instrText>PAGEREF _Toc242725216 \h</w:instrText>
+          <w:instrText>PAGEREF _Toc242728503 \h</w:instrText>
         </w:r>
         <w:r>
           <w:rPr>
@@ -2171,7 +2171,7 @@
           <w14:ligatures w14:val="standardContextual"/>
         </w:rPr>
       </w:pPr>
-      <w:hyperlink w:anchor="_Toc242725217" w:history="1">
+      <w:hyperlink w:anchor="_Toc242728504" w:history="1">
         <w:r>
           <w:rPr>
             <w:rStyle w:val="af"/>
@@ -2215,7 +2215,7 @@
             <w:noProof/>
             <w:webHidden/>
           </w:rPr>
-          <w:instrText>PAGEREF _Toc242725217 \h</w:instrText>
+          <w:instrText>PAGEREF _Toc242728504 \h</w:instrText>
         </w:r>
         <w:r>
           <w:rPr>
@@ -2273,7 +2273,7 @@
           <w14:ligatures w14:val="standardContextual"/>
         </w:rPr>
       </w:pPr>
-      <w:hyperlink w:anchor="_Toc242725218" w:history="1">
+      <w:hyperlink w:anchor="_Toc242728505" w:history="1">
         <w:r>
           <w:rPr>
             <w:rStyle w:val="af"/>
@@ -2317,7 +2317,7 @@
             <w:noProof/>
             <w:webHidden/>
           </w:rPr>
-          <w:instrText>PAGEREF _Toc242725218 \h</w:instrText>
+          <w:instrText>PAGEREF _Toc242728505 \h</w:instrText>
         </w:r>
         <w:r>
           <w:rPr>
@@ -2375,7 +2375,7 @@
           <w14:ligatures w14:val="standardContextual"/>
         </w:rPr>
       </w:pPr>
-      <w:hyperlink w:anchor="_Toc242725219" w:history="1">
+      <w:hyperlink w:anchor="_Toc242728506" w:history="1">
         <w:r>
           <w:rPr>
             <w:rStyle w:val="af"/>
@@ -2419,7 +2419,7 @@
             <w:noProof/>
             <w:webHidden/>
           </w:rPr>
-          <w:instrText>PAGEREF _Toc242725219 \h</w:instrText>
+          <w:instrText>PAGEREF _Toc242728506 \h</w:instrText>
         </w:r>
         <w:r>
           <w:rPr>
@@ -2477,7 +2477,7 @@
           <w14:ligatures w14:val="standardContextual"/>
         </w:rPr>
       </w:pPr>
-      <w:hyperlink w:anchor="_Toc242725220" w:history="1">
+      <w:hyperlink w:anchor="_Toc242728507" w:history="1">
         <w:r>
           <w:rPr>
             <w:rStyle w:val="af"/>
@@ -2521,7 +2521,7 @@
             <w:noProof/>
             <w:webHidden/>
           </w:rPr>
-          <w:instrText>PAGEREF _Toc242725220 \h</w:instrText>
+          <w:instrText>PAGEREF _Toc242728507 \h</w:instrText>
         </w:r>
         <w:r>
           <w:rPr>
@@ -2578,7 +2578,7 @@
           <w14:ligatures w14:val="standardContextual"/>
         </w:rPr>
       </w:pPr>
-      <w:hyperlink w:anchor="_Toc242725221" w:history="1">
+      <w:hyperlink w:anchor="_Toc242728508" w:history="1">
         <w:r>
           <w:rPr>
             <w:rStyle w:val="af"/>
@@ -2643,7 +2643,7 @@
             <w:webHidden/>
             <w:bCs w:val="0"/>
           </w:rPr>
-          <w:instrText>PAGEREF _Toc242725221 \h</w:instrText>
+          <w:instrText>PAGEREF _Toc242728508 \h</w:instrText>
         </w:r>
         <w:r>
           <w:rPr>
@@ -2711,7 +2711,7 @@
           <w14:ligatures w14:val="standardContextual"/>
         </w:rPr>
       </w:pPr>
-      <w:hyperlink w:anchor="_Toc242725222" w:history="1">
+      <w:hyperlink w:anchor="_Toc242728509" w:history="1">
         <w:r>
           <w:rPr>
             <w:rStyle w:val="af"/>
@@ -2755,7 +2755,7 @@
             <w:noProof/>
             <w:webHidden/>
           </w:rPr>
-          <w:instrText>PAGEREF _Toc242725222 \h</w:instrText>
+          <w:instrText>PAGEREF _Toc242728509 \h</w:instrText>
         </w:r>
         <w:r>
           <w:rPr>
@@ -2813,7 +2813,7 @@
           <w14:ligatures w14:val="standardContextual"/>
         </w:rPr>
       </w:pPr>
-      <w:hyperlink w:anchor="_Toc242725223" w:history="1">
+      <w:hyperlink w:anchor="_Toc242728510" w:history="1">
         <w:r>
           <w:rPr>
             <w:rStyle w:val="af"/>
@@ -2857,7 +2857,7 @@
             <w:noProof/>
             <w:webHidden/>
           </w:rPr>
-          <w:instrText>PAGEREF _Toc242725223 \h</w:instrText>
+          <w:instrText>PAGEREF _Toc242728510 \h</w:instrText>
         </w:r>
         <w:r>
           <w:rPr>
@@ -2914,7 +2914,7 @@
           <w14:ligatures w14:val="standardContextual"/>
         </w:rPr>
       </w:pPr>
-      <w:hyperlink w:anchor="_Toc242725224" w:history="1">
+      <w:hyperlink w:anchor="_Toc242728511" w:history="1">
         <w:r>
           <w:rPr>
             <w:rStyle w:val="af"/>
@@ -2979,7 +2979,7 @@
             <w:webHidden/>
             <w:bCs w:val="0"/>
           </w:rPr>
-          <w:instrText>PAGEREF _Toc242725224 \h</w:instrText>
+          <w:instrText>PAGEREF _Toc242728511 \h</w:instrText>
         </w:r>
         <w:r>
           <w:rPr>
@@ -3047,7 +3047,7 @@
           <w14:ligatures w14:val="standardContextual"/>
         </w:rPr>
       </w:pPr>
-      <w:hyperlink w:anchor="_Toc242725225" w:history="1">
+      <w:hyperlink w:anchor="_Toc242728512" w:history="1">
         <w:r>
           <w:rPr>
             <w:rStyle w:val="af"/>
@@ -3091,7 +3091,7 @@
             <w:noProof/>
             <w:webHidden/>
           </w:rPr>
-          <w:instrText>PAGEREF _Toc242725225 \h</w:instrText>
+          <w:instrText>PAGEREF _Toc242728512 \h</w:instrText>
         </w:r>
         <w:r>
           <w:rPr>
@@ -3149,7 +3149,7 @@
           <w14:ligatures w14:val="standardContextual"/>
         </w:rPr>
       </w:pPr>
-      <w:hyperlink w:anchor="_Toc242725226" w:history="1">
+      <w:hyperlink w:anchor="_Toc242728513" w:history="1">
         <w:r>
           <w:rPr>
             <w:rStyle w:val="af"/>
@@ -3193,7 +3193,7 @@
             <w:noProof/>
             <w:webHidden/>
           </w:rPr>
-          <w:instrText>PAGEREF _Toc242725226 \h</w:instrText>
+          <w:instrText>PAGEREF _Toc242728513 \h</w:instrText>
         </w:r>
         <w:r>
           <w:rPr>
@@ -3251,7 +3251,7 @@
           <w14:ligatures w14:val="standardContextual"/>
         </w:rPr>
       </w:pPr>
-      <w:hyperlink w:anchor="_Toc242725227" w:history="1">
+      <w:hyperlink w:anchor="_Toc242728514" w:history="1">
         <w:r>
           <w:rPr>
             <w:rStyle w:val="af"/>
@@ -3295,7 +3295,7 @@
             <w:noProof/>
             <w:webHidden/>
           </w:rPr>
-          <w:instrText>PAGEREF _Toc242725227 \h</w:instrText>
+          <w:instrText>PAGEREF _Toc242728514 \h</w:instrText>
         </w:r>
         <w:r>
           <w:rPr>
@@ -3352,7 +3352,7 @@
           <w14:ligatures w14:val="standardContextual"/>
         </w:rPr>
       </w:pPr>
-      <w:hyperlink w:anchor="_Toc242725228" w:history="1">
+      <w:hyperlink w:anchor="_Toc242728515" w:history="1">
         <w:r>
           <w:rPr>
             <w:rStyle w:val="af"/>
@@ -3417,7 +3417,7 @@
             <w:webHidden/>
             <w:bCs w:val="0"/>
           </w:rPr>
-          <w:instrText>PAGEREF _Toc242725228 \h</w:instrText>
+          <w:instrText>PAGEREF _Toc242728515 \h</w:instrText>
         </w:r>
         <w:r>
           <w:rPr>
@@ -3484,7 +3484,7 @@
           <w14:ligatures w14:val="standardContextual"/>
         </w:rPr>
       </w:pPr>
-      <w:hyperlink w:anchor="_Toc242725229" w:history="1">
+      <w:hyperlink w:anchor="_Toc242728516" w:history="1">
         <w:r>
           <w:rPr>
             <w:rStyle w:val="af"/>
@@ -3549,7 +3549,7 @@
             <w:webHidden/>
             <w:bCs w:val="0"/>
           </w:rPr>
-          <w:instrText>PAGEREF _Toc242725229 \h</w:instrText>
+          <w:instrText>PAGEREF _Toc242728516 \h</w:instrText>
         </w:r>
         <w:r>
           <w:rPr>
@@ -3616,7 +3616,7 @@
           <w14:ligatures w14:val="standardContextual"/>
         </w:rPr>
       </w:pPr>
-      <w:hyperlink w:anchor="_Toc242725230" w:history="1">
+      <w:hyperlink w:anchor="_Toc242728517" w:history="1">
         <w:r>
           <w:rPr>
             <w:rStyle w:val="af"/>
@@ -3663,7 +3663,7 @@
             <w:webHidden/>
             <w:bCs w:val="0"/>
           </w:rPr>
-          <w:instrText>PAGEREF _Toc242725230 \h</w:instrText>
+          <w:instrText>PAGEREF _Toc242728517 \h</w:instrText>
         </w:r>
         <w:r>
           <w:rPr>
@@ -3730,7 +3730,7 @@
           <w14:ligatures w14:val="standardContextual"/>
         </w:rPr>
       </w:pPr>
-      <w:hyperlink w:anchor="_Toc242725231" w:history="1">
+      <w:hyperlink w:anchor="_Toc242728518" w:history="1">
         <w:r>
           <w:rPr>
             <w:rStyle w:val="af"/>
@@ -3777,7 +3777,7 @@
             <w:webHidden/>
             <w:bCs w:val="0"/>
           </w:rPr>
-          <w:instrText>PAGEREF _Toc242725231 \h</w:instrText>
+          <w:instrText>PAGEREF _Toc242728518 \h</w:instrText>
         </w:r>
         <w:r>
           <w:rPr>
@@ -3844,7 +3844,7 @@
           <w14:ligatures w14:val="standardContextual"/>
         </w:rPr>
       </w:pPr>
-      <w:hyperlink w:anchor="_Toc242725232" w:history="1">
+      <w:hyperlink w:anchor="_Toc242728519" w:history="1">
         <w:r>
           <w:rPr>
             <w:rStyle w:val="af"/>
@@ -3909,7 +3909,7 @@
             <w:webHidden/>
             <w:bCs w:val="0"/>
           </w:rPr>
-          <w:instrText>PAGEREF _Toc242725232 \h</w:instrText>
+          <w:instrText>PAGEREF _Toc242728519 \h</w:instrText>
         </w:r>
         <w:r>
           <w:rPr>
@@ -3986,7 +3986,7 @@
         <w:pStyle w:val="1"/>
         <w:pageBreakBefore w:val="0"/>
       </w:pPr>
-      <w:bookmarkStart w:id="4" w:name="_Toc242725216"/>
+      <w:bookmarkStart w:id="4" w:name="_Toc242728503"/>
       <w:r>
         <w:lastRenderedPageBreak/>
         <w:t>第一章</w:t>
@@ -4003,7 +4003,7 @@
       <w:pPr>
         <w:pStyle w:val="2"/>
       </w:pPr>
-      <w:bookmarkStart w:id="5" w:name="_Toc242725217"/>
+      <w:bookmarkStart w:id="5" w:name="_Toc242728504"/>
       <w:bookmarkStart w:id="6" w:name="研究背景与意义"/>
       <w:r>
         <w:t xml:space="preserve">1.1  </w:t>
@@ -4017,7 +4017,7 @@
       <w:pPr>
         <w:pStyle w:val="3"/>
       </w:pPr>
-      <w:bookmarkStart w:id="7" w:name="_Toc242725218"/>
+      <w:bookmarkStart w:id="7" w:name="_Toc242728505"/>
       <w:bookmarkStart w:id="8" w:name="研究背景"/>
       <w:r>
         <w:t xml:space="preserve">1.1.1  </w:t>
@@ -4078,7 +4078,7 @@
       <w:pPr>
         <w:pStyle w:val="3"/>
       </w:pPr>
-      <w:bookmarkStart w:id="9" w:name="_Toc242725219"/>
+      <w:bookmarkStart w:id="9" w:name="_Toc242728506"/>
       <w:bookmarkStart w:id="10" w:name="研究意义"/>
       <w:bookmarkEnd w:id="8"/>
       <w:r>
@@ -4100,9 +4100,7 @@
         </w:rPr>
         <w:t>模板中的公式、图片、表格均按章编号，并支持交叉引用。式</w:t>
       </w:r>
-      <w:r>
-        <w:t> </w:t>
-      </w:r>
+      <w:r/>
       <w:hyperlink w:anchor="eq:model">
         <w:r>
           <w:rPr>
@@ -4137,7 +4135,7 @@
         <w:rPr>
           <w:position w:val="-28"/>
         </w:rPr>
-        <w:object w:dxaOrig="2680" w:dyaOrig="680" w14:anchorId="61DA2ECE">
+        <w:object w:dxaOrig="2680" w:dyaOrig="680" w14:anchorId="5D38CC84">
           <v:shapetype id="_x0000_t75" coordsize="21600,21600" o:spt="75" o:preferrelative="t" path="m@4@5l@4@11@9@11@9@5xe" filled="f" stroked="f">
             <v:stroke joinstyle="miter"/>
             <v:formulas>
@@ -4160,7 +4158,7 @@
           <v:shape id="_x0000_mtshape0" o:spid="_x0000_i1025" type="#_x0000_t75" style="width:134pt;height:34pt" o:ole="">
             <v:imagedata r:id="rId29" o:title=""/>
           </v:shape>
-          <o:OLEObject Type="Embed" ProgID="Equation.DSMT4" ShapeID="_x0000_mtshape0" DrawAspect="Content" ObjectID="_1853338071" r:id="rId30"/>
+          <o:OLEObject Type="Embed" ProgID="Equation.DSMT4" ShapeID="_x0000_mtshape0" DrawAspect="Content" ObjectID="_1853341262" r:id="rId30"/>
         </w:object>
       </w:r>
       <w:r>
@@ -4182,7 +4180,7 @@
           <w:noProof/>
         </w:rPr>
         <w:drawing>
-          <wp:inline distT="0" distB="0" distL="0" distR="0" wp14:anchorId="35442619" wp14:editId="127658C3">
+          <wp:inline distT="0" distB="0" distL="0" distR="0" wp14:anchorId="7774E121" wp14:editId="59EDB69B">
             <wp:extent cx="3588807" cy="2063027"/>
             <wp:effectExtent l="0" t="0" r="0" b="0"/>
             <wp:docPr id="17" name="Picture"/>
@@ -4191,7 +4189,7 @@
               <a:graphicData uri="http://schemas.openxmlformats.org/drawingml/2006/picture">
                 <pic:pic xmlns:pic="http://schemas.openxmlformats.org/drawingml/2006/picture">
                   <pic:nvPicPr>
-                    <pic:cNvPr id="18" name="Picture" descr="._thesis_build/media/_pdf_c0d9f670ac.png"/>
+                    <pic:cNvPr id="18" name="Picture" descr="._thesis_build/media/_pdf_1cfe2f7513.png"/>
                     <pic:cNvPicPr>
                       <a:picLocks noChangeAspect="1" noChangeArrowheads="1"/>
                     </pic:cNvPicPr>
@@ -4309,7 +4307,7 @@
       <w:pPr>
         <w:pStyle w:val="2"/>
       </w:pPr>
-      <w:bookmarkStart w:id="13" w:name="_Toc242725220"/>
+      <w:bookmarkStart w:id="13" w:name="_Toc242728507"/>
       <w:bookmarkStart w:id="14" w:name="研究内容与技术路线"/>
       <w:bookmarkEnd w:id="6"/>
       <w:bookmarkEnd w:id="10"/>
@@ -4365,11 +4363,11 @@
         <w:rPr>
           <w:position w:val="-12"/>
         </w:rPr>
-        <w:object w:dxaOrig="240" w:dyaOrig="360" w14:anchorId="6E46F2CE">
+        <w:object w:dxaOrig="240" w:dyaOrig="360" w14:anchorId="23BD2F15">
           <v:shape id="_x0000_mtshape1" o:spid="_x0000_i1026" type="#_x0000_t75" style="width:12pt;height:18pt" o:ole="">
             <v:imagedata r:id="rId32" o:title=""/>
           </v:shape>
-          <o:OLEObject Type="Embed" ProgID="Equation.DSMT4" ShapeID="_x0000_mtshape1" DrawAspect="Content" ObjectID="_1853338072" r:id="rId33"/>
+          <o:OLEObject Type="Embed" ProgID="Equation.DSMT4" ShapeID="_x0000_mtshape1" DrawAspect="Content" ObjectID="_1853341263" r:id="rId33"/>
         </w:object>
       </w:r>
       <w:r>
@@ -4437,11 +4435,11 @@
         <w:rPr>
           <w:position w:val="-12"/>
         </w:rPr>
-        <w:object w:dxaOrig="1480" w:dyaOrig="360" w14:anchorId="1B82FEEB">
+        <w:object w:dxaOrig="1480" w:dyaOrig="360" w14:anchorId="7A8AC68D">
           <v:shape id="_x0000_mtshape2" o:spid="_x0000_i1027" type="#_x0000_t75" style="width:74pt;height:18pt" o:ole="">
             <v:imagedata r:id="rId34" o:title=""/>
           </v:shape>
-          <o:OLEObject Type="Embed" ProgID="Equation.DSMT4" ShapeID="_x0000_mtshape2" DrawAspect="Content" ObjectID="_1853338073" r:id="rId35"/>
+          <o:OLEObject Type="Embed" ProgID="Equation.DSMT4" ShapeID="_x0000_mtshape2" DrawAspect="Content" ObjectID="_1853341264" r:id="rId35"/>
         </w:object>
       </w:r>
       <w:r>
@@ -4450,9 +4448,7 @@
         </w:rPr>
         <w:t>，样本均值和离散程度分别由式</w:t>
       </w:r>
-      <w:r>
-        <w:t> </w:t>
-      </w:r>
+      <w:r/>
       <w:hyperlink w:anchor="eq:mean">
         <w:r>
           <w:rPr>
@@ -4467,9 +4463,7 @@
         </w:rPr>
         <w:t>与式</w:t>
       </w:r>
-      <w:r>
-        <w:t> </w:t>
-      </w:r>
+      <w:r/>
       <w:hyperlink w:anchor="eq:variance">
         <w:r>
           <w:rPr>
@@ -4513,11 +4507,11 @@
         <w:rPr>
           <w:position w:val="-28"/>
         </w:rPr>
-        <w:object w:dxaOrig="1180" w:dyaOrig="680" w14:anchorId="5B39FBFB">
+        <w:object w:dxaOrig="1180" w:dyaOrig="680" w14:anchorId="5F3E9E10">
           <v:shape id="_x0000_mtshape3" o:spid="_x0000_i1028" type="#_x0000_t75" style="width:59.2pt;height:34pt" o:ole="">
             <v:imagedata r:id="rId36" o:title=""/>
           </v:shape>
-          <o:OLEObject Type="Embed" ProgID="Equation.DSMT4" ShapeID="_x0000_mtshape3" DrawAspect="Content" ObjectID="_1853338074" r:id="rId37"/>
+          <o:OLEObject Type="Embed" ProgID="Equation.DSMT4" ShapeID="_x0000_mtshape3" DrawAspect="Content" ObjectID="_1853341265" r:id="rId37"/>
         </w:object>
       </w:r>
       <w:r>
@@ -4544,11 +4538,11 @@
         <w:rPr>
           <w:position w:val="-28"/>
         </w:rPr>
-        <w:object w:dxaOrig="2120" w:dyaOrig="680" w14:anchorId="37F13E4E">
+        <w:object w:dxaOrig="2120" w:dyaOrig="680" w14:anchorId="2BB29F68">
           <v:shape id="_x0000_mtshape4" o:spid="_x0000_i1029" type="#_x0000_t75" style="width:106pt;height:34pt" o:ole="">
             <v:imagedata r:id="rId38" o:title=""/>
           </v:shape>
-          <o:OLEObject Type="Embed" ProgID="Equation.DSMT4" ShapeID="_x0000_mtshape4" DrawAspect="Content" ObjectID="_1853338075" r:id="rId39"/>
+          <o:OLEObject Type="Embed" ProgID="Equation.DSMT4" ShapeID="_x0000_mtshape4" DrawAspect="Content" ObjectID="_1853341266" r:id="rId39"/>
         </w:object>
       </w:r>
       <w:r>
@@ -4571,7 +4565,7 @@
           <w:noProof/>
         </w:rPr>
         <w:drawing>
-          <wp:inline distT="0" distB="0" distL="0" distR="0" wp14:anchorId="6137F5D9" wp14:editId="3ADF6AD6">
+          <wp:inline distT="0" distB="0" distL="0" distR="0" wp14:anchorId="0F834FD3" wp14:editId="3B99FA44">
             <wp:extent cx="3958243" cy="1868290"/>
             <wp:effectExtent l="0" t="0" r="0" b="0"/>
             <wp:docPr id="25" name="Picture"/>
@@ -5181,7 +5175,7 @@
       <w:pPr>
         <w:pStyle w:val="1"/>
       </w:pPr>
-      <w:bookmarkStart w:id="20" w:name="_Toc242725221"/>
+      <w:bookmarkStart w:id="20" w:name="_Toc242728508"/>
       <w:r>
         <w:lastRenderedPageBreak/>
         <w:t>第二章</w:t>
@@ -5198,7 +5192,7 @@
       <w:pPr>
         <w:pStyle w:val="2"/>
       </w:pPr>
-      <w:bookmarkStart w:id="21" w:name="_Toc242725222"/>
+      <w:bookmarkStart w:id="21" w:name="_Toc242728509"/>
       <w:bookmarkStart w:id="22" w:name="基本理论"/>
       <w:r>
         <w:t xml:space="preserve">2.1  </w:t>
@@ -5415,18 +5409,17 @@
               <w:rPr>
                 <w:position w:val="-10"/>
               </w:rPr>
-              <w:object w:dxaOrig="279" w:dyaOrig="360" w14:anchorId="1561C40D">
+              <w:object w:dxaOrig="279" w:dyaOrig="360" w14:anchorId="234CD69E">
                 <v:shape id="_x0000_mtshape5" o:spid="_x0000_i1030" type="#_x0000_t75" style="width:12pt;height:16pt" o:ole="">
                   <v:imagedata r:id="rId45" o:title=""/>
                 </v:shape>
-                <o:OLEObject Type="Embed" ProgID="Equation.DSMT4" ShapeID="_x0000_mtshape5" DrawAspect="Content" ObjectID="_1853338076" r:id="rId46"/>
+                <o:OLEObject Type="Embed" ProgID="Equation.DSMT4" ShapeID="_x0000_mtshape5" DrawAspect="Content" ObjectID="_1853341267" r:id="rId46"/>
               </w:object>
             </w:r>
             <w:r>
               <w:rPr>
                 <w:sz w:val="21"/>
               </w:rPr>
-              <w:t>​</w:t>
             </w:r>
           </w:p>
         </w:tc>
@@ -5511,18 +5504,17 @@
               <w:rPr>
                 <w:position w:val="-5"/>
               </w:rPr>
-              <w:object w:dxaOrig="200" w:dyaOrig="220" w14:anchorId="537D4712">
+              <w:object w:dxaOrig="200" w:dyaOrig="220" w14:anchorId="70BA1505">
                 <v:shape id="_x0000_mtshape6" o:spid="_x0000_i1031" type="#_x0000_t75" style="width:9.2pt;height:10pt" o:ole="">
                   <v:imagedata r:id="rId47" o:title=""/>
                 </v:shape>
-                <o:OLEObject Type="Embed" ProgID="Equation.DSMT4" ShapeID="_x0000_mtshape6" DrawAspect="Content" ObjectID="_1853338077" r:id="rId48"/>
+                <o:OLEObject Type="Embed" ProgID="Equation.DSMT4" ShapeID="_x0000_mtshape6" DrawAspect="Content" ObjectID="_1853341268" r:id="rId48"/>
               </w:object>
             </w:r>
             <w:r>
               <w:rPr>
                 <w:sz w:val="21"/>
               </w:rPr>
-              <w:t>​</w:t>
             </w:r>
           </w:p>
         </w:tc>
@@ -5557,7 +5549,7 @@
       <w:pPr>
         <w:pStyle w:val="2"/>
       </w:pPr>
-      <w:bookmarkStart w:id="24" w:name="_Toc242725223"/>
+      <w:bookmarkStart w:id="24" w:name="_Toc242728510"/>
       <w:bookmarkStart w:id="25" w:name="模型表示与计算步骤"/>
       <w:bookmarkEnd w:id="22"/>
       <w:bookmarkEnd w:id="23"/>
@@ -5581,9 +5573,7 @@
         </w:rPr>
         <w:t>在统一的图结构中，邻接矩阵记录节点间的连接关系。式</w:t>
       </w:r>
-      <w:r>
-        <w:t> </w:t>
-      </w:r>
+      <w:r/>
       <w:hyperlink w:anchor="eq:matrix">
         <w:r>
           <w:rPr>
@@ -5689,11 +5679,11 @@
         <w:rPr>
           <w:position w:val="-50"/>
         </w:rPr>
-        <w:object w:dxaOrig="3060" w:dyaOrig="1120" w14:anchorId="1D521417">
+        <w:object w:dxaOrig="3060" w:dyaOrig="1120" w14:anchorId="6A0CD916">
           <v:shape id="_x0000_mtshape7" o:spid="_x0000_i1032" type="#_x0000_t75" style="width:153.2pt;height:56pt" o:ole="">
             <v:imagedata r:id="rId49" o:title=""/>
           </v:shape>
-          <o:OLEObject Type="Embed" ProgID="Equation.DSMT4" ShapeID="_x0000_mtshape7" DrawAspect="Content" ObjectID="_1853338078" r:id="rId50"/>
+          <o:OLEObject Type="Embed" ProgID="Equation.DSMT4" ShapeID="_x0000_mtshape7" DrawAspect="Content" ObjectID="_1853341269" r:id="rId50"/>
         </w:object>
       </w:r>
       <w:r>
@@ -5731,11 +5721,11 @@
         <w:rPr>
           <w:position w:val="-18"/>
         </w:rPr>
-        <w:object w:dxaOrig="3320" w:dyaOrig="520" w14:anchorId="14BAF81B">
+        <w:object w:dxaOrig="3320" w:dyaOrig="520" w14:anchorId="2706E364">
           <v:shape id="_x0000_mtshape8" o:spid="_x0000_i1033" type="#_x0000_t75" style="width:166pt;height:26pt" o:ole="">
             <v:imagedata r:id="rId51" o:title=""/>
           </v:shape>
-          <o:OLEObject Type="Embed" ProgID="Equation.DSMT4" ShapeID="_x0000_mtshape8" DrawAspect="Content" ObjectID="_1853338079" r:id="rId52"/>
+          <o:OLEObject Type="Embed" ProgID="Equation.DSMT4" ShapeID="_x0000_mtshape8" DrawAspect="Content" ObjectID="_1853341270" r:id="rId52"/>
         </w:object>
       </w:r>
       <w:r>
@@ -5759,7 +5749,7 @@
         </w:rPr>
         <w:lastRenderedPageBreak/>
         <w:drawing>
-          <wp:inline distT="0" distB="0" distL="0" distR="0" wp14:anchorId="281267E3" wp14:editId="652848A1">
+          <wp:inline distT="0" distB="0" distL="0" distR="0" wp14:anchorId="1D22C76A" wp14:editId="5A48F6A3">
             <wp:extent cx="3958243" cy="1868290"/>
             <wp:effectExtent l="0" t="0" r="0" b="0"/>
             <wp:docPr id="36" name="Picture"/>
@@ -5895,9 +5885,7 @@
         </w:rPr>
         <w:t>算法首先读取数据并计算式</w:t>
       </w:r>
-      <w:r>
-        <w:t> </w:t>
-      </w:r>
+      <w:r/>
       <w:hyperlink w:anchor="eq:matrix">
         <w:r>
           <w:rPr>
@@ -5912,9 +5900,7 @@
         </w:rPr>
         <w:t>中的节点度，然后根据式</w:t>
       </w:r>
-      <w:r>
-        <w:t> </w:t>
-      </w:r>
+      <w:r/>
       <w:hyperlink w:anchor="eq:integral">
         <w:r>
           <w:rPr>
@@ -5977,7 +5963,7 @@
       <w:pPr>
         <w:pStyle w:val="1"/>
       </w:pPr>
-      <w:bookmarkStart w:id="30" w:name="_Toc242725224"/>
+      <w:bookmarkStart w:id="30" w:name="_Toc242728511"/>
       <w:r>
         <w:lastRenderedPageBreak/>
         <w:t>第三章</w:t>
@@ -5994,7 +5980,7 @@
       <w:pPr>
         <w:pStyle w:val="2"/>
       </w:pPr>
-      <w:bookmarkStart w:id="31" w:name="_Toc242725225"/>
+      <w:bookmarkStart w:id="31" w:name="_Toc242728512"/>
       <w:bookmarkStart w:id="32" w:name="模型构建"/>
       <w:r>
         <w:t xml:space="preserve">3.1  </w:t>
@@ -6034,11 +6020,11 @@
         <w:rPr>
           <w:position w:val="-4"/>
         </w:rPr>
-        <w:object w:dxaOrig="200" w:dyaOrig="200" w14:anchorId="4DFF7856">
+        <w:object w:dxaOrig="200" w:dyaOrig="200" w14:anchorId="15DD729E">
           <v:shape id="_x0000_mtshape9" o:spid="_x0000_i1034" type="#_x0000_t75" style="width:10pt;height:10pt" o:ole="">
             <v:imagedata r:id="rId58" o:title=""/>
           </v:shape>
-          <o:OLEObject Type="Embed" ProgID="Equation.DSMT4" ShapeID="_x0000_mtshape9" DrawAspect="Content" ObjectID="_1853338080" r:id="rId59"/>
+          <o:OLEObject Type="Embed" ProgID="Equation.DSMT4" ShapeID="_x0000_mtshape9" DrawAspect="Content" ObjectID="_1853341271" r:id="rId59"/>
         </w:object>
       </w:r>
       <w:r>
@@ -6047,9 +6033,7 @@
         </w:rPr>
         <w:t>，目标同时考虑误差与正则项。式</w:t>
       </w:r>
-      <w:r>
-        <w:t> </w:t>
-      </w:r>
+      <w:r/>
       <w:hyperlink w:anchor="eq:objective">
         <w:r>
           <w:rPr>
@@ -6064,9 +6048,7 @@
         </w:rPr>
         <w:t>中出现二范数、转置和分式，式</w:t>
       </w:r>
-      <w:r>
-        <w:t> </w:t>
-      </w:r>
+      <w:r/>
       <w:hyperlink w:anchor="eq:constraints">
         <w:r>
           <w:rPr>
@@ -6110,11 +6092,11 @@
         <w:rPr>
           <w:position w:val="-24"/>
         </w:rPr>
-        <w:object w:dxaOrig="2640" w:dyaOrig="620" w14:anchorId="7728504E">
+        <w:object w:dxaOrig="2640" w:dyaOrig="620" w14:anchorId="3EAEF60D">
           <v:shape id="_x0000_mtshape10" o:spid="_x0000_i1035" type="#_x0000_t75" style="width:132pt;height:31.2pt" o:ole="">
             <v:imagedata r:id="rId60" o:title=""/>
           </v:shape>
-          <o:OLEObject Type="Embed" ProgID="Equation.DSMT4" ShapeID="_x0000_mtshape10" DrawAspect="Content" ObjectID="_1853338081" r:id="rId61"/>
+          <o:OLEObject Type="Embed" ProgID="Equation.DSMT4" ShapeID="_x0000_mtshape10" DrawAspect="Content" ObjectID="_1853341272" r:id="rId61"/>
         </w:object>
       </w:r>
       <w:r>
@@ -6141,11 +6123,11 @@
         <w:rPr>
           <w:position w:val="-46"/>
         </w:rPr>
-        <w:object w:dxaOrig="2320" w:dyaOrig="1040" w14:anchorId="56F74CE0">
-          <v:shape id="_x0000_mtshape11" o:spid="_x0000_i1036" type="#_x0000_t75" style="width:116pt;height:52pt" o:ole="">
+        <w:object w:dxaOrig="2320" w:dyaOrig="1040" w14:anchorId="0E8CC52D">
+          <v:shape id="_x0000_mtshape11" o:spid="_x0000_i1036" type="#_x0000_t75" style="width:125.2pt;height:52pt" o:ole="">
             <v:imagedata r:id="rId62" o:title=""/>
           </v:shape>
-          <o:OLEObject Type="Embed" ProgID="Equation.DSMT4" ShapeID="_x0000_mtshape11" DrawAspect="Content" ObjectID="_1853338082" r:id="rId63"/>
+          <o:OLEObject Type="Embed" ProgID="Equation.DSMT4" ShapeID="_x0000_mtshape11" DrawAspect="Content" ObjectID="_1853341273" r:id="rId63"/>
         </w:object>
       </w:r>
       <w:r>
@@ -6157,7 +6139,7 @@
       <w:pPr>
         <w:pStyle w:val="2"/>
       </w:pPr>
-      <w:bookmarkStart w:id="35" w:name="_Toc242725226"/>
+      <w:bookmarkStart w:id="35" w:name="_Toc242728513"/>
       <w:bookmarkStart w:id="36" w:name="实验设计与结果比较"/>
       <w:bookmarkEnd w:id="32"/>
       <w:bookmarkEnd w:id="33"/>
@@ -6701,7 +6683,7 @@
           <w:noProof/>
         </w:rPr>
         <w:drawing>
-          <wp:inline distT="0" distB="0" distL="0" distR="0" wp14:anchorId="5577282C" wp14:editId="574CF819">
+          <wp:inline distT="0" distB="0" distL="0" distR="0" wp14:anchorId="3C2AAFD8" wp14:editId="4CA8C922">
             <wp:extent cx="4486006" cy="3623313"/>
             <wp:effectExtent l="0" t="0" r="0" b="0"/>
             <wp:docPr id="46" name="Picture"/>
@@ -6710,7 +6692,7 @@
               <a:graphicData uri="http://schemas.openxmlformats.org/drawingml/2006/picture">
                 <pic:pic xmlns:pic="http://schemas.openxmlformats.org/drawingml/2006/picture">
                   <pic:nvPicPr>
-                    <pic:cNvPr id="47" name="Picture" descr="._thesis_build/media/test-new-panels-abcd_f6cf824783.png"/>
+                    <pic:cNvPr id="47" name="Picture" descr="._thesis_build/media/test-new-panels-abcd_04ed7b222e.png"/>
                     <pic:cNvPicPr>
                       <a:picLocks noChangeAspect="1" noChangeArrowheads="1"/>
                     </pic:cNvPicPr>
@@ -7000,7 +6982,7 @@
       <w:pPr>
         <w:pStyle w:val="2"/>
       </w:pPr>
-      <w:bookmarkStart w:id="39" w:name="_Toc242725227"/>
+      <w:bookmarkStart w:id="39" w:name="_Toc242728514"/>
       <w:bookmarkStart w:id="40" w:name="本章小结"/>
       <w:bookmarkEnd w:id="36"/>
       <w:r>
@@ -7054,7 +7036,7 @@
       <w:pPr>
         <w:pStyle w:val="1"/>
       </w:pPr>
-      <w:bookmarkStart w:id="42" w:name="_Toc242725228"/>
+      <w:bookmarkStart w:id="42" w:name="_Toc242728515"/>
       <w:r>
         <w:lastRenderedPageBreak/>
         <w:t>第四章</w:t>
@@ -7077,9 +7059,7 @@
         </w:rPr>
         <w:t>本章用于检查长分数线、长根号及多行公式的边界。式</w:t>
       </w:r>
-      <w:r>
-        <w:t> </w:t>
-      </w:r>
+      <w:r/>
       <w:hyperlink w:anchor="eq:long-fraction">
         <w:r>
           <w:rPr>
@@ -7094,9 +7074,7 @@
         </w:rPr>
         <w:t>和式</w:t>
       </w:r>
-      <w:r>
-        <w:t> </w:t>
-      </w:r>
+      <w:r/>
       <w:hyperlink w:anchor="eq:long-system">
         <w:r>
           <w:rPr>
@@ -7132,11 +7110,11 @@
         <w:rPr>
           <w:position w:val="-70"/>
         </w:rPr>
-        <w:object w:dxaOrig="3540" w:dyaOrig="1460" w14:anchorId="73648667">
+        <w:object w:dxaOrig="3540" w:dyaOrig="1460" w14:anchorId="1FF33E2E">
           <v:shape id="_x0000_mtshape12" o:spid="_x0000_i1037" type="#_x0000_t75" style="width:177.2pt;height:1in" o:ole="">
             <v:imagedata r:id="rId69" o:title=""/>
           </v:shape>
-          <o:OLEObject Type="Embed" ProgID="Equation.DSMT4" ShapeID="_x0000_mtshape12" DrawAspect="Content" ObjectID="_1853338083" r:id="rId70"/>
+          <o:OLEObject Type="Embed" ProgID="Equation.DSMT4" ShapeID="_x0000_mtshape12" DrawAspect="Content" ObjectID="_1853341274" r:id="rId70"/>
         </w:object>
       </w:r>
       <w:r>
@@ -7176,11 +7154,11 @@
         <w:rPr>
           <w:position w:val="-30"/>
         </w:rPr>
-        <w:object w:dxaOrig="6640" w:dyaOrig="680" w14:anchorId="6CCD87D5">
+        <w:object w:dxaOrig="6640" w:dyaOrig="680" w14:anchorId="2F70174F">
           <v:shape id="_x0000_mtshape13" o:spid="_x0000_i1038" type="#_x0000_t75" style="width:332pt;height:34pt" o:ole="">
             <v:imagedata r:id="rId71" o:title=""/>
           </v:shape>
-          <o:OLEObject Type="Embed" ProgID="Equation.DSMT4" ShapeID="_x0000_mtshape13" DrawAspect="Content" ObjectID="_1853338084" r:id="rId72"/>
+          <o:OLEObject Type="Embed" ProgID="Equation.DSMT4" ShapeID="_x0000_mtshape13" DrawAspect="Content" ObjectID="_1853341275" r:id="rId72"/>
         </w:object>
       </w:r>
       <w:r>
@@ -7220,11 +7198,11 @@
         <w:rPr>
           <w:position w:val="-32"/>
         </w:rPr>
-        <w:object w:dxaOrig="4760" w:dyaOrig="780" w14:anchorId="29E4B030">
+        <w:object w:dxaOrig="4760" w:dyaOrig="780" w14:anchorId="576E065C">
           <v:shape id="_x0000_mtshape14" o:spid="_x0000_i1039" type="#_x0000_t75" style="width:238pt;height:39.2pt" o:ole="">
             <v:imagedata r:id="rId73" o:title=""/>
           </v:shape>
-          <o:OLEObject Type="Embed" ProgID="Equation.DSMT4" ShapeID="_x0000_mtshape14" DrawAspect="Content" ObjectID="_1853338085" r:id="rId74"/>
+          <o:OLEObject Type="Embed" ProgID="Equation.DSMT4" ShapeID="_x0000_mtshape14" DrawAspect="Content" ObjectID="_1853341276" r:id="rId74"/>
         </w:object>
       </w:r>
       <w:r>
@@ -7264,11 +7242,11 @@
         <w:rPr>
           <w:position w:val="-80"/>
         </w:rPr>
-        <w:object w:dxaOrig="3180" w:dyaOrig="1719" w14:anchorId="619174E1">
-          <v:shape id="_x0000_mtshape15" o:spid="_x0000_i1040" type="#_x0000_t75" style="width:159.2pt;height:86pt" o:ole="">
+        <w:object w:dxaOrig="3180" w:dyaOrig="1719" w14:anchorId="131C818D">
+          <v:shape id="_x0000_mtshape15" o:spid="_x0000_i1040" type="#_x0000_t75" style="width:151.2pt;height:88.8pt" o:ole="">
             <v:imagedata r:id="rId75" o:title=""/>
           </v:shape>
-          <o:OLEObject Type="Embed" ProgID="Equation.DSMT4" ShapeID="_x0000_mtshape15" DrawAspect="Content" ObjectID="_1853338086" r:id="rId76"/>
+          <o:OLEObject Type="Embed" ProgID="Equation.DSMT4" ShapeID="_x0000_mtshape15" DrawAspect="Content" ObjectID="_1853341277" r:id="rId76"/>
         </w:object>
       </w:r>
       <w:r>
@@ -7308,11 +7286,11 @@
         <w:rPr>
           <w:position w:val="-118"/>
         </w:rPr>
-        <w:object w:dxaOrig="3100" w:dyaOrig="2480" w14:anchorId="576B321A">
+        <w:object w:dxaOrig="3100" w:dyaOrig="2480" w14:anchorId="24B93B49">
           <v:shape id="_x0000_mtshape16" o:spid="_x0000_i1041" type="#_x0000_t75" style="width:155.2pt;height:124pt" o:ole="">
             <v:imagedata r:id="rId77" o:title=""/>
           </v:shape>
-          <o:OLEObject Type="Embed" ProgID="Equation.DSMT4" ShapeID="_x0000_mtshape16" DrawAspect="Content" ObjectID="_1853338087" r:id="rId78"/>
+          <o:OLEObject Type="Embed" ProgID="Equation.DSMT4" ShapeID="_x0000_mtshape16" DrawAspect="Content" ObjectID="_1853341278" r:id="rId78"/>
         </w:object>
       </w:r>
       <w:r>
@@ -7497,18 +7475,17 @@
               <w:rPr>
                 <w:position w:val="-24"/>
               </w:rPr>
-              <w:object w:dxaOrig="1440" w:dyaOrig="680" w14:anchorId="5429D740">
+              <w:object w:dxaOrig="1440" w:dyaOrig="680" w14:anchorId="0B06D127">
                 <v:shape id="_x0000_mtshape17" o:spid="_x0000_i1042" type="#_x0000_t75" style="width:1in;height:31.2pt" o:ole="">
                   <v:imagedata r:id="rId79" o:title=""/>
                 </v:shape>
-                <o:OLEObject Type="Embed" ProgID="Equation.DSMT4" ShapeID="_x0000_mtshape17" DrawAspect="Content" ObjectID="_1853338088" r:id="rId80"/>
+                <o:OLEObject Type="Embed" ProgID="Equation.DSMT4" ShapeID="_x0000_mtshape17" DrawAspect="Content" ObjectID="_1853341279" r:id="rId80"/>
               </w:object>
             </w:r>
             <w:r>
               <w:rPr>
                 <w:sz w:val="21"/>
               </w:rPr>
-              <w:t>​</w:t>
             </w:r>
           </w:p>
         </w:tc>
@@ -7566,18 +7543,17 @@
               <w:rPr>
                 <w:position w:val="-28"/>
               </w:rPr>
-              <w:object w:dxaOrig="1480" w:dyaOrig="780" w14:anchorId="10B0C555">
+              <w:object w:dxaOrig="1480" w:dyaOrig="780" w14:anchorId="1EC2ACF7">
                 <v:shape id="_x0000_mtshape18" o:spid="_x0000_i1043" type="#_x0000_t75" style="width:66pt;height:34.8pt" o:ole="">
                   <v:imagedata r:id="rId81" o:title=""/>
                 </v:shape>
-                <o:OLEObject Type="Embed" ProgID="Equation.DSMT4" ShapeID="_x0000_mtshape18" DrawAspect="Content" ObjectID="_1853338089" r:id="rId82"/>
+                <o:OLEObject Type="Embed" ProgID="Equation.DSMT4" ShapeID="_x0000_mtshape18" DrawAspect="Content" ObjectID="_1853341280" r:id="rId82"/>
               </w:object>
             </w:r>
             <w:r>
               <w:rPr>
                 <w:sz w:val="21"/>
               </w:rPr>
-              <w:t>​</w:t>
             </w:r>
           </w:p>
         </w:tc>
@@ -7601,11 +7577,11 @@
         <w:rPr>
           <w:position w:val="-24"/>
         </w:rPr>
-        <w:object w:dxaOrig="580" w:dyaOrig="620" w14:anchorId="53B69FFD">
+        <w:object w:dxaOrig="580" w:dyaOrig="620" w14:anchorId="285E777A">
           <v:shape id="_x0000_mtshape19" o:spid="_x0000_i1044" type="#_x0000_t75" style="width:29.2pt;height:31.2pt" o:ole="">
             <v:imagedata r:id="rId83" o:title=""/>
           </v:shape>
-          <o:OLEObject Type="Embed" ProgID="Equation.DSMT4" ShapeID="_x0000_mtshape19" DrawAspect="Content" ObjectID="_1853338090" r:id="rId84"/>
+          <o:OLEObject Type="Embed" ProgID="Equation.DSMT4" ShapeID="_x0000_mtshape19" DrawAspect="Content" ObjectID="_1853341281" r:id="rId84"/>
         </w:object>
       </w:r>
       <w:r>
@@ -7617,9 +7593,7 @@
         </w:rPr>
         <w:t>同时出现时，应分别采用对应的字号，并保持引用</w:t>
       </w:r>
-      <w:r>
-        <w:t> </w:t>
-      </w:r>
+      <w:r/>
       <w:hyperlink w:anchor="eq:long-system">
         <w:r>
           <w:rPr>
@@ -7634,9 +7608,7 @@
         </w:rPr>
         <w:t>及</w:t>
       </w:r>
-      <w:r>
-        <w:t> </w:t>
-      </w:r>
+      <w:r/>
       <w:hyperlink w:anchor="eq:long-cases">
         <w:r>
           <w:rPr>
@@ -7674,7 +7646,7 @@
       <w:pPr>
         <w:pStyle w:val="1"/>
       </w:pPr>
-      <w:bookmarkStart w:id="50" w:name="_Toc242725229"/>
+      <w:bookmarkStart w:id="50" w:name="_Toc242728516"/>
       <w:r>
         <w:lastRenderedPageBreak/>
         <w:t>附录</w:t>
@@ -7739,11 +7711,11 @@
         <w:rPr>
           <w:position w:val="-30"/>
         </w:rPr>
-        <w:object w:dxaOrig="2560" w:dyaOrig="760" w14:anchorId="601A726C">
+        <w:object w:dxaOrig="2560" w:dyaOrig="760" w14:anchorId="23A4A471">
           <v:shape id="_x0000_mtshape20" o:spid="_x0000_i1045" type="#_x0000_t75" style="width:126.8pt;height:38pt" o:ole="">
             <v:imagedata r:id="rId89" o:title=""/>
           </v:shape>
-          <o:OLEObject Type="Embed" ProgID="Equation.DSMT4" ShapeID="_x0000_mtshape20" DrawAspect="Content" ObjectID="_1853338091" r:id="rId90"/>
+          <o:OLEObject Type="Embed" ProgID="Equation.DSMT4" ShapeID="_x0000_mtshape20" DrawAspect="Content" ObjectID="_1853341282" r:id="rId90"/>
         </w:object>
       </w:r>
       <w:r>
@@ -7774,7 +7746,7 @@
       <w:pPr>
         <w:pStyle w:val="1"/>
       </w:pPr>
-      <w:bookmarkStart w:id="53" w:name="_Toc242725230"/>
+      <w:bookmarkStart w:id="53" w:name="_Toc242728517"/>
       <w:r>
         <w:lastRenderedPageBreak/>
         <w:t>参考文献</w:t>
@@ -8198,7 +8170,7 @@
       <w:pPr>
         <w:pStyle w:val="1"/>
       </w:pPr>
-      <w:bookmarkStart w:id="54" w:name="_Toc242725231"/>
+      <w:bookmarkStart w:id="54" w:name="_Toc242728518"/>
       <w:r>
         <w:lastRenderedPageBreak/>
         <w:t>攻读博士学位期间的科研成果</w:t>
@@ -8292,7 +8264,7 @@
       <w:pPr>
         <w:pStyle w:val="1"/>
       </w:pPr>
-      <w:bookmarkStart w:id="56" w:name="_Toc242725232"/>
+      <w:bookmarkStart w:id="56" w:name="_Toc242728519"/>
       <w:r>
         <w:lastRenderedPageBreak/>
         <w:t>致</w:t>
@@ -9682,7 +9654,7 @@
   <w:abstractNum w:abstractNumId="0" w15:restartNumberingAfterBreak="0">
     <w:nsid w:val="0000A990"/>
     <w:multiLevelType w:val="multilevel"/>
-    <w:tmpl w:val="9208B0F0"/>
+    <w:tmpl w:val="C0340210"/>
     <w:lvl w:ilvl="0">
       <w:numFmt w:val="bullet"/>
       <w:lvlText w:val=" "/>
@@ -9863,7 +9835,7 @@
   <w:num w:numId="1" w16cid:durableId="954337032">
     <w:abstractNumId w:val="1"/>
   </w:num>
-  <w:num w:numId="2" w16cid:durableId="619381051">
+  <w:num w:numId="2" w16cid:durableId="1802645550">
     <w:abstractNumId w:val="0"/>
   </w:num>
 </w:numbering>
@@ -11177,7 +11149,7 @@
     <w:next w:val="a"/>
     <w:autoRedefine/>
     <w:uiPriority w:val="39"/>
-    <w:rsid w:val="00E26288"/>
+    <w:rsid w:val="0012541D"/>
     <w:rPr>
       <w:b/>
     </w:rPr>
@@ -11188,7 +11160,7 @@
     <w:next w:val="a"/>
     <w:autoRedefine/>
     <w:uiPriority w:val="39"/>
-    <w:rsid w:val="00E26288"/>
+    <w:rsid w:val="0012541D"/>
     <w:pPr>
       <w:ind w:leftChars="200" w:left="420"/>
     </w:pPr>
@@ -11199,7 +11171,7 @@
     <w:next w:val="a"/>
     <w:autoRedefine/>
     <w:uiPriority w:val="39"/>
-    <w:rsid w:val="00E26288"/>
+    <w:rsid w:val="0012541D"/>
     <w:pPr>
       <w:ind w:leftChars="400" w:left="840"/>
     </w:pPr>

</xml_diff>

<commit_message>
Fix v1.2 TOC sizes and explicit black heading fonts
</commit_message>
<xml_diff>
--- a/examples/long-formula-mathtype.docx
+++ b/examples/long-formula-mathtype.docx
@@ -8,7 +8,7 @@
         <w:ind w:firstLine="0"/>
       </w:pPr>
       <w:r>
-        <w:pict w14:anchorId="28AC6839">
+        <w:pict w14:anchorId="303D685F">
           <v:shapetype id="_x0000_t202" coordsize="21600,21600" o:spt="202" path="m,l,21600r21600,l21600,xe">
             <v:stroke joinstyle="miter"/>
             <v:path gradientshapeok="t" o:connecttype="rect"/>
@@ -36,7 +36,7 @@
         </w:pict>
       </w:r>
       <w:r>
-        <w:pict w14:anchorId="792722A7">
+        <w:pict w14:anchorId="3ED9BECE">
           <v:shape id="native_front_10002" o:spid="_x0000_s2115" type="#_x0000_t202" style="position:absolute;left:0;text-align:left;margin-left:390.05pt;margin-top:74.6pt;width:26pt;height:19.2pt;z-index:251624960;mso-position-horizontal-relative:page;mso-position-vertical-relative:page" filled="f" stroked="f">
             <v:textbox inset="0,0,0,0">
               <w:txbxContent>
@@ -60,7 +60,7 @@
         </w:pict>
       </w:r>
       <w:r>
-        <w:pict w14:anchorId="6D69599A">
+        <w:pict w14:anchorId="4279CAD0">
           <v:shape id="native_front_10003" o:spid="_x0000_s2114" type="#_x0000_t202" style="position:absolute;left:0;text-align:left;margin-left:89.85pt;margin-top:96.2pt;width:33.35pt;height:19.2pt;z-index:251625984;mso-position-horizontal-relative:page;mso-position-vertical-relative:page" filled="f" stroked="f">
             <v:textbox inset="0,0,0,0">
               <w:txbxContent>
@@ -84,7 +84,7 @@
         </w:pict>
       </w:r>
       <w:r>
-        <w:pict w14:anchorId="7D9F4960">
+        <w:pict w14:anchorId="55666F91">
           <v:shape id="native_front_10004" o:spid="_x0000_s2113" type="#_x0000_t202" style="position:absolute;left:0;text-align:left;margin-left:390.05pt;margin-top:96.2pt;width:26pt;height:19.2pt;z-index:251627008;mso-position-horizontal-relative:page;mso-position-vertical-relative:page" filled="f" stroked="f">
             <v:textbox inset="0,0,0,0">
               <w:txbxContent>
@@ -108,7 +108,7 @@
         </w:pict>
       </w:r>
       <w:r>
-        <w:pict w14:anchorId="62CEDF62">
+        <w:pict w14:anchorId="55D2FDFE">
           <v:shape id="native_front_10005" o:spid="_x0000_s2112" type="#_x0000_t202" style="position:absolute;left:0;text-align:left;margin-left:219.65pt;margin-top:202.9pt;width:158pt;height:41.6pt;z-index:251628032;mso-position-horizontal-relative:page;mso-position-vertical-relative:page" filled="f" stroked="f">
             <v:textbox inset="0,0,0,0">
               <w:txbxContent>
@@ -133,7 +133,7 @@
         </w:pict>
       </w:r>
       <w:r>
-        <w:pict w14:anchorId="355CA804">
+        <w:pict w14:anchorId="1A66DDD4">
           <v:shape id="native_front_10006" o:spid="_x0000_s2111" type="#_x0000_t202" style="position:absolute;left:0;text-align:left;margin-left:167.65pt;margin-top:284.95pt;width:262pt;height:41.6pt;z-index:251629056;mso-position-horizontal-relative:page;mso-position-vertical-relative:page" filled="f" stroked="f">
             <v:textbox inset="0,0,0,0">
               <w:txbxContent>
@@ -158,7 +158,7 @@
         </w:pict>
       </w:r>
       <w:r>
-        <w:pict w14:anchorId="3EA66D22">
+        <w:pict w14:anchorId="7758DEB6">
           <v:shape id="native_front_10007" o:spid="_x0000_s2110" type="#_x0000_t202" style="position:absolute;left:0;text-align:left;margin-left:222.55pt;margin-top:450.85pt;width:74pt;height:19.2pt;z-index:251630080;mso-position-horizontal-relative:page;mso-position-vertical-relative:page" filled="f" stroked="f">
             <v:textbox inset="0,0,0,0">
               <w:txbxContent>
@@ -182,7 +182,7 @@
         </w:pict>
       </w:r>
       <w:r>
-        <w:pict w14:anchorId="11B5765D">
+        <w:pict w14:anchorId="2764DE03">
           <v:shape id="native_front_10008" o:spid="_x0000_s2109" type="#_x0000_t202" style="position:absolute;left:0;text-align:left;margin-left:297.7pt;margin-top:450.85pt;width:50pt;height:19.2pt;z-index:251631104;mso-position-horizontal-relative:page;mso-position-vertical-relative:page" filled="f" stroked="f">
             <v:textbox inset="0,0,0,0">
               <w:txbxContent>
@@ -206,7 +206,7 @@
         </w:pict>
       </w:r>
       <w:r>
-        <w:pict w14:anchorId="798A8C6C">
+        <w:pict w14:anchorId="63A5D029">
           <v:shape id="native_front_10009" o:spid="_x0000_s2108" type="#_x0000_t202" style="position:absolute;left:0;text-align:left;margin-left:234.55pt;margin-top:487.55pt;width:62pt;height:19.2pt;z-index:251632128;mso-position-horizontal-relative:page;mso-position-vertical-relative:page" filled="f" stroked="f">
             <v:textbox inset="0,0,0,0">
               <w:txbxContent>
@@ -230,7 +230,7 @@
         </w:pict>
       </w:r>
       <w:r>
-        <w:pict w14:anchorId="533A05BE">
+        <w:pict w14:anchorId="6B2FA223">
           <v:shape id="native_front_10010" o:spid="_x0000_s2107" type="#_x0000_t202" style="position:absolute;left:0;text-align:left;margin-left:297.7pt;margin-top:487.55pt;width:50pt;height:19.2pt;z-index:251633152;mso-position-horizontal-relative:page;mso-position-vertical-relative:page" filled="f" stroked="f">
             <v:textbox inset="0,0,0,0">
               <w:txbxContent>
@@ -254,7 +254,7 @@
         </w:pict>
       </w:r>
       <w:r>
-        <w:pict w14:anchorId="73FB2343">
+        <w:pict w14:anchorId="1D6C127A">
           <v:shape id="native_front_10011" o:spid="_x0000_s2106" type="#_x0000_t202" style="position:absolute;left:0;text-align:left;margin-left:348.7pt;margin-top:487.55pt;width:26pt;height:19.2pt;z-index:251634176;mso-position-horizontal-relative:page;mso-position-vertical-relative:page" filled="f" stroked="f">
             <v:textbox inset="0,0,0,0">
               <w:txbxContent>
@@ -278,7 +278,7 @@
         </w:pict>
       </w:r>
       <w:r>
-        <w:pict w14:anchorId="0484A7FF">
+        <w:pict w14:anchorId="560D8C3D">
           <v:shape id="native_front_10012" o:spid="_x0000_s2105" type="#_x0000_t202" style="position:absolute;left:0;text-align:left;margin-left:234.55pt;margin-top:524.25pt;width:62pt;height:19.2pt;z-index:251635200;mso-position-horizontal-relative:page;mso-position-vertical-relative:page" filled="f" stroked="f">
             <v:textbox inset="0,0,0,0">
               <w:txbxContent>
@@ -302,7 +302,7 @@
         </w:pict>
       </w:r>
       <w:r>
-        <w:pict w14:anchorId="702D8F6A">
+        <w:pict w14:anchorId="60C9E9A8">
           <v:shape id="native_front_10013" o:spid="_x0000_s2104" type="#_x0000_t202" style="position:absolute;left:0;text-align:left;margin-left:297.7pt;margin-top:524.25pt;width:74pt;height:19.2pt;z-index:251636224;mso-position-horizontal-relative:page;mso-position-vertical-relative:page" filled="f" stroked="f">
             <v:textbox inset="0,0,0,0">
               <w:txbxContent>
@@ -326,7 +326,7 @@
         </w:pict>
       </w:r>
       <w:r>
-        <w:pict w14:anchorId="1EE3D50A">
+        <w:pict w14:anchorId="3D15C8A5">
           <v:shape id="native_front_10014" o:spid="_x0000_s2103" type="#_x0000_t202" style="position:absolute;left:0;text-align:left;margin-left:234.55pt;margin-top:561pt;width:62pt;height:19.2pt;z-index:251637248;mso-position-horizontal-relative:page;mso-position-vertical-relative:page" filled="f" stroked="f">
             <v:textbox inset="0,0,0,0">
               <w:txbxContent>
@@ -350,7 +350,7 @@
         </w:pict>
       </w:r>
       <w:r>
-        <w:pict w14:anchorId="25709A1B">
+        <w:pict w14:anchorId="07BF2A07">
           <v:shape id="native_front_10015" o:spid="_x0000_s2102" type="#_x0000_t202" style="position:absolute;left:0;text-align:left;margin-left:297.7pt;margin-top:561pt;width:74pt;height:19.2pt;z-index:251638272;mso-position-horizontal-relative:page;mso-position-vertical-relative:page" filled="f" stroked="f">
             <v:textbox inset="0,0,0,0">
               <w:txbxContent>
@@ -374,7 +374,7 @@
         </w:pict>
       </w:r>
       <w:r>
-        <w:pict w14:anchorId="6BD4BD7F">
+        <w:pict w14:anchorId="4BBBF7FA">
           <v:shape id="native_front_10016" o:spid="_x0000_s2101" type="#_x0000_t202" style="position:absolute;left:0;text-align:left;margin-left:234.55pt;margin-top:597.7pt;width:62pt;height:19.2pt;z-index:251639296;mso-position-horizontal-relative:page;mso-position-vertical-relative:page" filled="f" stroked="f">
             <v:textbox inset="0,0,0,0">
               <w:txbxContent>
@@ -398,7 +398,7 @@
         </w:pict>
       </w:r>
       <w:r>
-        <w:pict w14:anchorId="5B769A1C">
+        <w:pict w14:anchorId="05251CD2">
           <v:shape id="native_front_10017" o:spid="_x0000_s2100" type="#_x0000_t202" style="position:absolute;left:0;text-align:left;margin-left:297.7pt;margin-top:597.7pt;width:74pt;height:19.2pt;z-index:251640320;mso-position-horizontal-relative:page;mso-position-vertical-relative:page" filled="f" stroked="f">
             <v:textbox inset="0,0,0,0">
               <w:txbxContent>
@@ -422,7 +422,7 @@
         </w:pict>
       </w:r>
       <w:r>
-        <w:pict w14:anchorId="70031071">
+        <w:pict w14:anchorId="7BCF6673">
           <v:shape id="native_front_10018" o:spid="_x0000_s2099" type="#_x0000_t202" style="position:absolute;left:0;text-align:left;margin-left:257.4pt;margin-top:740.9pt;width:30pt;height:22.4pt;z-index:251641344;mso-position-horizontal-relative:page;mso-position-vertical-relative:page" filled="f" stroked="f">
             <v:textbox inset="0,0,0,0">
               <w:txbxContent>
@@ -447,7 +447,7 @@
         </w:pict>
       </w:r>
       <w:r>
-        <w:pict w14:anchorId="409AAAF3">
+        <w:pict w14:anchorId="5E9A3287">
           <v:shape id="native_front_10019" o:spid="_x0000_s2098" type="#_x0000_t202" style="position:absolute;left:0;text-align:left;margin-left:285.4pt;margin-top:740.9pt;width:19.5pt;height:22.4pt;z-index:251642368;mso-position-horizontal-relative:page;mso-position-vertical-relative:page" filled="f" stroked="f">
             <v:textbox inset="0,0,0,0">
               <w:txbxContent>
@@ -483,7 +483,7 @@
         </w:pict>
       </w:r>
       <w:r>
-        <w:pict w14:anchorId="089CF556">
+        <w:pict w14:anchorId="5C913C7C">
           <v:shape id="native_front_10020" o:spid="_x0000_s2097" type="#_x0000_t202" style="position:absolute;left:0;text-align:left;margin-left:306.4pt;margin-top:740.9pt;width:16pt;height:22.4pt;z-index:251643392;mso-position-horizontal-relative:page;mso-position-vertical-relative:page" filled="f" stroked="f">
             <v:textbox inset="0,0,0,0">
               <w:txbxContent>
@@ -508,7 +508,7 @@
         </w:pict>
       </w:r>
       <w:r>
-        <w:pict w14:anchorId="087C9B8B">
+        <w:pict w14:anchorId="4ACA39E9">
           <v:shape id="native_front_10021" o:spid="_x0000_s2096" type="#_x0000_t202" style="position:absolute;left:0;text-align:left;margin-left:320.4pt;margin-top:740.9pt;width:19.5pt;height:22.4pt;z-index:251644416;mso-position-horizontal-relative:page;mso-position-vertical-relative:page" filled="f" stroked="f">
             <v:textbox inset="0,0,0,0">
               <w:txbxContent>
@@ -544,7 +544,7 @@
         </w:pict>
       </w:r>
       <w:r>
-        <w:pict w14:anchorId="2F67D8EC">
+        <w:pict w14:anchorId="4B1C89D1">
           <v:shape id="native_front_10022" o:spid="_x0000_s2095" type="#_x0000_t202" style="position:absolute;left:0;text-align:left;margin-left:55.75pt;margin-top:136.9pt;width:14pt;height:19.2pt;z-index:251645440;mso-position-horizontal-relative:page;mso-position-vertical-relative:page" filled="f" stroked="f">
             <v:textbox inset="0,0,0,0">
               <w:txbxContent>
@@ -568,7 +568,7 @@
         </w:pict>
       </w:r>
       <w:r>
-        <w:pict w14:anchorId="3DF99CC4">
+        <w:pict w14:anchorId="20DFFF87">
           <v:shape id="native_front_10023" o:spid="_x0000_s2094" type="#_x0000_t202" style="position:absolute;left:0;text-align:left;margin-left:55.75pt;margin-top:154.9pt;width:14pt;height:19.2pt;z-index:251646464;mso-position-horizontal-relative:page;mso-position-vertical-relative:page" filled="f" stroked="f">
             <v:textbox inset="0,0,0,0">
               <w:txbxContent>
@@ -592,7 +592,7 @@
         </w:pict>
       </w:r>
       <w:r>
-        <w:pict w14:anchorId="2BFFEC89">
+        <w:pict w14:anchorId="4C5AA766">
           <v:shape id="native_front_10024" o:spid="_x0000_s2093" type="#_x0000_t202" style="position:absolute;left:0;text-align:left;margin-left:55.75pt;margin-top:172.9pt;width:14pt;height:19.2pt;z-index:251647488;mso-position-horizontal-relative:page;mso-position-vertical-relative:page" filled="f" stroked="f">
             <v:textbox inset="0,0,0,0">
               <w:txbxContent>
@@ -616,7 +616,7 @@
         </w:pict>
       </w:r>
       <w:r>
-        <w:pict w14:anchorId="14221BBD">
+        <w:pict w14:anchorId="4CD4C73A">
           <v:shape id="native_front_10025" o:spid="_x0000_s2092" type="#_x0000_t202" style="position:absolute;left:0;text-align:left;margin-left:55.75pt;margin-top:190.9pt;width:14pt;height:19.2pt;z-index:251648512;mso-position-horizontal-relative:page;mso-position-vertical-relative:page" filled="f" stroked="f">
             <v:textbox inset="0,0,0,0">
               <w:txbxContent>
@@ -640,7 +640,7 @@
         </w:pict>
       </w:r>
       <w:r>
-        <w:pict w14:anchorId="7B8EDE93">
+        <w:pict w14:anchorId="19EBC760">
           <v:shape id="native_front_10026" o:spid="_x0000_s2091" type="#_x0000_t202" style="position:absolute;left:0;text-align:left;margin-left:55.75pt;margin-top:208.9pt;width:14pt;height:19.2pt;z-index:251649536;mso-position-horizontal-relative:page;mso-position-vertical-relative:page" filled="f" stroked="f">
             <v:textbox inset="0,0,0,0">
               <w:txbxContent>
@@ -664,7 +664,7 @@
         </w:pict>
       </w:r>
       <w:r>
-        <w:pict w14:anchorId="32FDA118">
+        <w:pict w14:anchorId="054C7669">
           <v:shape id="native_front_10027" o:spid="_x0000_s2090" type="#_x0000_t202" style="position:absolute;left:0;text-align:left;margin-left:55.75pt;margin-top:226.9pt;width:14pt;height:19.2pt;z-index:251650560;mso-position-horizontal-relative:page;mso-position-vertical-relative:page" filled="f" stroked="f">
             <v:textbox inset="0,0,0,0">
               <w:txbxContent>
@@ -688,7 +688,7 @@
         </w:pict>
       </w:r>
       <w:r>
-        <w:pict w14:anchorId="4719DA94">
+        <w:pict w14:anchorId="61674706">
           <v:shape id="native_front_10028" o:spid="_x0000_s2089" type="#_x0000_t202" style="position:absolute;left:0;text-align:left;margin-left:55.75pt;margin-top:244.9pt;width:14pt;height:19.2pt;z-index:251651584;mso-position-horizontal-relative:page;mso-position-vertical-relative:page" filled="f" stroked="f">
             <v:textbox inset="0,0,0,0">
               <w:txbxContent>
@@ -712,7 +712,7 @@
         </w:pict>
       </w:r>
       <w:r>
-        <w:pict w14:anchorId="45E336D5">
+        <w:pict w14:anchorId="521CA9D0">
           <v:shape id="native_front_10029" o:spid="_x0000_s2088" type="#_x0000_t202" style="position:absolute;left:0;text-align:left;margin-left:55.75pt;margin-top:262.9pt;width:14pt;height:19.2pt;z-index:251652608;mso-position-horizontal-relative:page;mso-position-vertical-relative:page" filled="f" stroked="f">
             <v:textbox inset="0,0,0,0">
               <w:txbxContent>
@@ -736,7 +736,7 @@
         </w:pict>
       </w:r>
       <w:r>
-        <w:pict w14:anchorId="38BB65C4">
+        <w:pict w14:anchorId="30AB7B56">
           <v:shape id="native_front_10030" o:spid="_x0000_s2087" type="#_x0000_t202" style="position:absolute;left:0;text-align:left;margin-left:55.75pt;margin-top:280.9pt;width:14pt;height:19.2pt;z-index:251653632;mso-position-horizontal-relative:page;mso-position-vertical-relative:page" filled="f" stroked="f">
             <v:textbox inset="0,0,0,0">
               <w:txbxContent>
@@ -760,7 +760,7 @@
         </w:pict>
       </w:r>
       <w:r>
-        <w:pict w14:anchorId="083BE89F">
+        <w:pict w14:anchorId="3DA765DD">
           <v:shape id="native_front_10031" o:spid="_x0000_s2086" type="#_x0000_t202" style="position:absolute;left:0;text-align:left;margin-left:55.75pt;margin-top:298.9pt;width:14pt;height:19.2pt;z-index:251654656;mso-position-horizontal-relative:page;mso-position-vertical-relative:page" filled="f" stroked="f">
             <v:textbox inset="0,0,0,0">
               <w:txbxContent>
@@ -784,7 +784,7 @@
         </w:pict>
       </w:r>
       <w:r>
-        <w:pict w14:anchorId="7D57DC1F">
+        <w:pict w14:anchorId="59FB9E09">
           <v:shape id="native_front_10032" o:spid="_x0000_s2085" type="#_x0000_t202" style="position:absolute;left:0;text-align:left;margin-left:55.75pt;margin-top:352.9pt;width:14pt;height:19.2pt;z-index:251655680;mso-position-horizontal-relative:page;mso-position-vertical-relative:page" filled="f" stroked="f">
             <v:textbox inset="0,0,0,0">
               <w:txbxContent>
@@ -808,7 +808,7 @@
         </w:pict>
       </w:r>
       <w:r>
-        <w:pict w14:anchorId="2EA49297">
+        <w:pict w14:anchorId="24EA9570">
           <v:shape id="native_front_10033" o:spid="_x0000_s2084" type="#_x0000_t202" style="position:absolute;left:0;text-align:left;margin-left:55.75pt;margin-top:370.9pt;width:14pt;height:19.2pt;z-index:251656704;mso-position-horizontal-relative:page;mso-position-vertical-relative:page" filled="f" stroked="f">
             <v:textbox inset="0,0,0,0">
               <w:txbxContent>
@@ -832,7 +832,7 @@
         </w:pict>
       </w:r>
       <w:r>
-        <w:pict w14:anchorId="7A98721C">
+        <w:pict w14:anchorId="5673BF2E">
           <v:shape id="native_front_10034" o:spid="_x0000_s2083" type="#_x0000_t202" style="position:absolute;left:0;text-align:left;margin-left:55.75pt;margin-top:388.9pt;width:14pt;height:19.2pt;z-index:251657728;mso-position-horizontal-relative:page;mso-position-vertical-relative:page" filled="f" stroked="f">
             <v:textbox inset="0,0,0,0">
               <w:txbxContent>
@@ -856,7 +856,7 @@
         </w:pict>
       </w:r>
       <w:r>
-        <w:pict w14:anchorId="455E9269">
+        <w:pict w14:anchorId="317A2B38">
           <v:shape id="native_front_10035" o:spid="_x0000_s2082" type="#_x0000_t202" style="position:absolute;left:0;text-align:left;margin-left:55.75pt;margin-top:406.9pt;width:14pt;height:19.2pt;z-index:251658752;mso-position-horizontal-relative:page;mso-position-vertical-relative:page" filled="f" stroked="f">
             <v:textbox inset="0,0,0,0">
               <w:txbxContent>
@@ -880,28 +880,28 @@
         </w:pict>
       </w:r>
       <w:r>
-        <w:pict w14:anchorId="582391E5">
+        <w:pict w14:anchorId="36D8BF36">
           <v:line id="_x0000_s2081" style="position:absolute;left:0;text-align:left;z-index:251682304;mso-position-horizontal-relative:page;mso-position-vertical-relative:page" from="137.85pt,89.45pt" to="217.25pt,89.45pt" strokeweight=".5pt">
             <w10:wrap anchorx="page" anchory="page"/>
           </v:line>
         </w:pict>
       </w:r>
       <w:r>
-        <w:pict w14:anchorId="67A0F088">
+        <w:pict w14:anchorId="342C597A">
           <v:line id="_x0000_s2080" style="position:absolute;left:0;text-align:left;z-index:251683328;mso-position-horizontal-relative:page;mso-position-vertical-relative:page" from="426.05pt,89.45pt" to="505.4pt,89.45pt" strokeweight=".5pt">
             <w10:wrap anchorx="page" anchory="page"/>
           </v:line>
         </w:pict>
       </w:r>
       <w:r>
-        <w:pict w14:anchorId="2438724A">
+        <w:pict w14:anchorId="24717583">
           <v:line id="_x0000_s2079" style="position:absolute;left:0;text-align:left;z-index:251684352;mso-position-horizontal-relative:page;mso-position-vertical-relative:page" from="137.85pt,111.05pt" to="217.25pt,111.05pt" strokeweight=".5pt">
             <w10:wrap anchorx="page" anchory="page"/>
           </v:line>
         </w:pict>
       </w:r>
       <w:r>
-        <w:pict w14:anchorId="24855567">
+        <w:pict w14:anchorId="2FB5F46A">
           <v:line id="_x0000_s2078" style="position:absolute;left:0;text-align:left;z-index:251685376;mso-position-horizontal-relative:page;mso-position-vertical-relative:page" from="426.05pt,111.05pt" to="505.4pt,111.05pt" strokeweight=".5pt">
             <w10:wrap anchorx="page" anchory="page"/>
           </v:line>
@@ -916,7 +916,7 @@
       </w:pPr>
       <w:r>
         <w:lastRenderedPageBreak/>
-        <w:pict w14:anchorId="2A2A2610">
+        <w:pict w14:anchorId="726E4778">
           <v:shape id="native_front_10036" o:spid="_x0000_s2077" type="#_x0000_t202" style="position:absolute;left:0;text-align:left;margin-left:208.1pt;margin-top:138.55pt;width:181.1pt;height:25.6pt;z-index:251659776;mso-position-horizontal-relative:page;mso-position-vertical-relative:page" filled="f" stroked="f">
             <v:textbox inset="0,0,0,0">
               <w:txbxContent>
@@ -941,7 +941,7 @@
         </w:pict>
       </w:r>
       <w:r>
-        <w:pict w14:anchorId="2E02FEE4">
+        <w:pict w14:anchorId="0BB8B2F2">
           <v:shape id="native_front_10037" o:spid="_x0000_s2076" type="#_x0000_t202" style="position:absolute;left:0;text-align:left;margin-left:249.65pt;margin-top:176.95pt;width:98pt;height:25.6pt;z-index:251660800;mso-position-horizontal-relative:page;mso-position-vertical-relative:page" filled="f" stroked="f">
             <v:textbox inset="0,0,0,0">
               <w:txbxContent>
@@ -966,7 +966,7 @@
         </w:pict>
       </w:r>
       <w:r>
-        <w:pict w14:anchorId="43F94AD1">
+        <w:pict w14:anchorId="47B59434">
           <v:shape id="native_front_10038" o:spid="_x0000_s2075" type="#_x0000_t202" style="position:absolute;left:0;text-align:left;margin-left:99.25pt;margin-top:261.3pt;width:398.75pt;height:35.2pt;z-index:251661824;mso-position-horizontal-relative:page;mso-position-vertical-relative:page" filled="f" stroked="f">
             <v:textbox inset="0,0,0,0">
               <w:txbxContent>
@@ -992,7 +992,7 @@
         </w:pict>
       </w:r>
       <w:r>
-        <w:pict w14:anchorId="4DB81389">
+        <w:pict w14:anchorId="1C0361C4">
           <v:shape id="native_front_10039" o:spid="_x0000_s2074" type="#_x0000_t202" style="position:absolute;left:0;text-align:left;margin-left:286.55pt;margin-top:432.45pt;width:24.25pt;height:25.6pt;z-index:251662848;mso-position-horizontal-relative:page;mso-position-vertical-relative:page" filled="f" stroked="f">
             <v:textbox inset="0,0,0,0">
               <w:txbxContent>
@@ -1017,7 +1017,7 @@
         </w:pict>
       </w:r>
       <w:r>
-        <w:pict w14:anchorId="29D23FEB">
+        <w:pict w14:anchorId="48CA4BA2">
           <v:shape id="native_front_10040" o:spid="_x0000_s2073" type="#_x0000_t202" style="position:absolute;left:0;text-align:left;margin-left:265.65pt;margin-top:474.05pt;width:66pt;height:25.6pt;z-index:251663872;mso-position-horizontal-relative:page;mso-position-vertical-relative:page" filled="f" stroked="f">
             <v:textbox inset="0,0,0,0">
               <w:txbxContent>
@@ -1042,7 +1042,7 @@
         </w:pict>
       </w:r>
       <w:r>
-        <w:pict w14:anchorId="01EAE95A">
+        <w:pict w14:anchorId="13C45EDF">
           <v:shape id="native_front_10041" o:spid="_x0000_s2072" type="#_x0000_t202" style="position:absolute;left:0;text-align:left;margin-left:252.1pt;margin-top:553.9pt;width:93.1pt;height:25.6pt;z-index:251664896;mso-position-horizontal-relative:page;mso-position-vertical-relative:page" filled="f" stroked="f">
             <v:textbox inset="0,0,0,0">
               <w:txbxContent>
@@ -1067,7 +1067,7 @@
         </w:pict>
       </w:r>
       <w:r>
-        <w:pict w14:anchorId="2C06C00B">
+        <w:pict w14:anchorId="6F783C65">
           <v:shape id="native_front_10042" o:spid="_x0000_s2071" type="#_x0000_t202" style="position:absolute;left:0;text-align:left;margin-left:247.65pt;margin-top:595.5pt;width:66pt;height:25.6pt;z-index:251665920;mso-position-horizontal-relative:page;mso-position-vertical-relative:page" filled="f" stroked="f">
             <v:textbox inset="0,0,0,0">
               <w:txbxContent>
@@ -1092,7 +1092,7 @@
         </w:pict>
       </w:r>
       <w:r>
-        <w:pict w14:anchorId="1A022F22">
+        <w:pict w14:anchorId="72B1CF0C">
           <v:shape id="native_front_10043" o:spid="_x0000_s2070" type="#_x0000_t202" style="position:absolute;left:0;text-align:left;margin-left:315.6pt;margin-top:595.5pt;width:34pt;height:25.6pt;z-index:251666944;mso-position-horizontal-relative:page;mso-position-vertical-relative:page" filled="f" stroked="f">
             <v:textbox inset="0,0,0,0">
               <w:txbxContent>
@@ -1117,7 +1117,7 @@
         </w:pict>
       </w:r>
       <w:r>
-        <w:pict w14:anchorId="60D6DA41">
+        <w:pict w14:anchorId="2A60EFFA">
           <v:shape id="native_front_10044" o:spid="_x0000_s2069" type="#_x0000_t202" style="position:absolute;left:0;text-align:left;margin-left:259.35pt;margin-top:755.25pt;width:78.6pt;height:22.4pt;z-index:251667968;mso-position-horizontal-relative:page;mso-position-vertical-relative:page" filled="f" stroked="f">
             <v:textbox inset="0,0,0,0">
               <w:txbxContent>
@@ -1150,7 +1150,7 @@
       </w:pPr>
       <w:r>
         <w:lastRenderedPageBreak/>
-        <w:pict w14:anchorId="2D7FE494">
+        <w:pict w14:anchorId="63E323F5">
           <v:shape id="native_front_10045" o:spid="_x0000_s2068" type="#_x0000_t202" style="position:absolute;left:0;text-align:left;margin-left:225.65pt;margin-top:96.05pt;width:146pt;height:25.6pt;z-index:251668992;mso-position-horizontal-relative:page;mso-position-vertical-relative:page" filled="f" stroked="f">
             <v:textbox inset="0,0,0,0">
               <w:txbxContent>
@@ -1175,7 +1175,7 @@
         </w:pict>
       </w:r>
       <w:r>
-        <w:pict w14:anchorId="1E70CA00">
+        <w:pict w14:anchorId="1BE75B8D">
           <v:shape id="native_front_10046" o:spid="_x0000_s2067" type="#_x0000_t202" style="position:absolute;left:0;text-align:left;margin-left:113.85pt;margin-top:145.75pt;width:393.55pt;height:19.2pt;z-index:251670016;mso-position-horizontal-relative:page;mso-position-vertical-relative:page" filled="f" stroked="f">
             <v:textbox inset="0,0,0,0">
               <w:txbxContent>
@@ -1208,7 +1208,7 @@
         </w:pict>
       </w:r>
       <w:r>
-        <w:pict w14:anchorId="6802195F">
+        <w:pict w14:anchorId="15AFF921">
           <v:shape id="native_front_10047" o:spid="_x0000_s2066" type="#_x0000_t202" style="position:absolute;left:0;text-align:left;margin-left:89.85pt;margin-top:167.35pt;width:417.55pt;height:19.2pt;z-index:251671040;mso-position-horizontal-relative:page;mso-position-vertical-relative:page" filled="f" stroked="f">
             <v:textbox inset="0,0,0,0">
               <w:txbxContent>
@@ -1242,7 +1242,7 @@
         </w:pict>
       </w:r>
       <w:r>
-        <w:pict w14:anchorId="33943445">
+        <w:pict w14:anchorId="1AF536B7">
           <v:shape id="native_front_10048" o:spid="_x0000_s2065" type="#_x0000_t202" style="position:absolute;left:0;text-align:left;margin-left:89.85pt;margin-top:188.95pt;width:134pt;height:19.2pt;z-index:251672064;mso-position-horizontal-relative:page;mso-position-vertical-relative:page" filled="f" stroked="f">
             <v:textbox inset="0,0,0,0">
               <w:txbxContent>
@@ -1266,7 +1266,7 @@
         </w:pict>
       </w:r>
       <w:r>
-        <w:pict w14:anchorId="57A5FDFA">
+        <w:pict w14:anchorId="4C40C825">
           <v:shape id="native_front_10049" o:spid="_x0000_s2064" type="#_x0000_t202" style="position:absolute;left:0;text-align:left;margin-left:113.85pt;margin-top:267.2pt;width:74pt;height:19.2pt;z-index:251673088;mso-position-horizontal-relative:page;mso-position-vertical-relative:page" filled="f" stroked="f">
             <v:textbox inset="0,0,0,0">
               <w:txbxContent>
@@ -1290,7 +1290,7 @@
         </w:pict>
       </w:r>
       <w:r>
-        <w:pict w14:anchorId="160D4188">
+        <w:pict w14:anchorId="6C4B2016">
           <v:shape id="native_front_10050" o:spid="_x0000_s2063" type="#_x0000_t202" style="position:absolute;left:0;text-align:left;margin-left:384.4pt;margin-top:267.2pt;width:38pt;height:19.2pt;z-index:251674112;mso-position-horizontal-relative:page;mso-position-vertical-relative:page" filled="f" stroked="f">
             <v:textbox inset="0,0,0,0">
               <w:txbxContent>
@@ -1314,7 +1314,7 @@
         </w:pict>
       </w:r>
       <w:r>
-        <w:pict w14:anchorId="1597AC7D">
+        <w:pict w14:anchorId="191AD45F">
           <v:shape id="native_front_10051" o:spid="_x0000_s2062" type="#_x0000_t202" style="position:absolute;left:0;text-align:left;margin-left:209.65pt;margin-top:354.3pt;width:178pt;height:25.6pt;z-index:251675136;mso-position-horizontal-relative:page;mso-position-vertical-relative:page" filled="f" stroked="f">
             <v:textbox inset="0,0,0,0">
               <w:txbxContent>
@@ -1339,7 +1339,7 @@
         </w:pict>
       </w:r>
       <w:r>
-        <w:pict w14:anchorId="76C10615">
+        <w:pict w14:anchorId="3551F50A">
           <v:shape id="native_front_10052" o:spid="_x0000_s2061" type="#_x0000_t202" style="position:absolute;left:0;text-align:left;margin-left:89.85pt;margin-top:393pt;width:417.55pt;height:19.2pt;z-index:251676160;mso-position-horizontal-relative:page;mso-position-vertical-relative:page" filled="f" stroked="f">
             <v:textbox inset="0,0,0,0">
               <w:txbxContent>
@@ -1372,7 +1372,7 @@
         </w:pict>
       </w:r>
       <w:r>
-        <w:pict w14:anchorId="66134930">
+        <w:pict w14:anchorId="243240C6">
           <v:shape id="native_front_10053" o:spid="_x0000_s2060" type="#_x0000_t202" style="position:absolute;left:0;text-align:left;margin-left:89.85pt;margin-top:414.6pt;width:410pt;height:19.2pt;z-index:251677184;mso-position-horizontal-relative:page;mso-position-vertical-relative:page" filled="f" stroked="f">
             <v:textbox inset="0,0,0,0">
               <w:txbxContent>
@@ -1396,7 +1396,7 @@
         </w:pict>
       </w:r>
       <w:r>
-        <w:pict w14:anchorId="0CEBB67E">
+        <w:pict w14:anchorId="36EBB1FD">
           <v:shape id="native_front_10054" o:spid="_x0000_s2059" type="#_x0000_t202" style="position:absolute;left:0;text-align:left;margin-left:113.85pt;margin-top:492.9pt;width:74pt;height:19.2pt;z-index:251678208;mso-position-horizontal-relative:page;mso-position-vertical-relative:page" filled="f" stroked="f">
             <v:textbox inset="0,0,0,0">
               <w:txbxContent>
@@ -1420,7 +1420,7 @@
         </w:pict>
       </w:r>
       <w:r>
-        <w:pict w14:anchorId="49C4C382">
+        <w:pict w14:anchorId="0B180A62">
           <v:shape id="native_front_10055" o:spid="_x0000_s2058" type="#_x0000_t202" style="position:absolute;left:0;text-align:left;margin-left:360.4pt;margin-top:492.9pt;width:62pt;height:19.2pt;z-index:251679232;mso-position-horizontal-relative:page;mso-position-vertical-relative:page" filled="f" stroked="f">
             <v:textbox inset="0,0,0,0">
               <w:txbxContent>
@@ -1444,7 +1444,7 @@
         </w:pict>
       </w:r>
       <w:r>
-        <w:pict w14:anchorId="1C8D33DC">
+        <w:pict w14:anchorId="3453126A">
           <v:shape id="native_front_10056" o:spid="_x0000_s2057" type="#_x0000_t202" style="position:absolute;left:0;text-align:left;margin-left:113.85pt;margin-top:542.85pt;width:38pt;height:19.2pt;z-index:251680256;mso-position-horizontal-relative:page;mso-position-vertical-relative:page" filled="f" stroked="f">
             <v:textbox inset="0,0,0,0">
               <w:txbxContent>
@@ -1468,7 +1468,7 @@
         </w:pict>
       </w:r>
       <w:r>
-        <w:pict w14:anchorId="700B4C65">
+        <w:pict w14:anchorId="71F64AEA">
           <v:shape id="native_front_10057" o:spid="_x0000_s2056" type="#_x0000_t202" style="position:absolute;left:0;text-align:left;margin-left:384.4pt;margin-top:542.85pt;width:38pt;height:19.2pt;z-index:251681280;mso-position-horizontal-relative:page;mso-position-vertical-relative:page" filled="f" stroked="f">
             <v:textbox inset="0,0,0,0">
               <w:txbxContent>
@@ -1492,42 +1492,42 @@
         </w:pict>
       </w:r>
       <w:r>
-        <w:pict w14:anchorId="7C7EB7D9">
+        <w:pict w14:anchorId="10A4EE1E">
           <v:line id="_x0000_s2055" style="position:absolute;left:0;text-align:left;z-index:251686400;mso-position-horizontal-relative:page;mso-position-vertical-relative:page" from="185.85pt,282.1pt" to="299.25pt,282.1pt" strokeweight=".5pt">
             <w10:wrap anchorx="page" anchory="page"/>
           </v:line>
         </w:pict>
       </w:r>
       <w:r>
-        <w:pict w14:anchorId="245FF519">
+        <w:pict w14:anchorId="224FB929">
           <v:line id="_x0000_s2054" style="position:absolute;left:0;text-align:left;z-index:251687424;mso-position-horizontal-relative:page;mso-position-vertical-relative:page" from="420.4pt,282.1pt" to="505.4pt,282.1pt" strokeweight=".5pt">
             <w10:wrap anchorx="page" anchory="page"/>
           </v:line>
         </w:pict>
       </w:r>
       <w:r>
-        <w:pict w14:anchorId="104A7DE7">
+        <w:pict w14:anchorId="677F1F93">
           <v:line id="_x0000_s2053" style="position:absolute;left:0;text-align:left;z-index:251688448;mso-position-horizontal-relative:page;mso-position-vertical-relative:page" from="185.85pt,507.8pt" to="270.9pt,507.8pt" strokeweight=".5pt">
             <w10:wrap anchorx="page" anchory="page"/>
           </v:line>
         </w:pict>
       </w:r>
       <w:r>
-        <w:pict w14:anchorId="14CCB4C7">
+        <w:pict w14:anchorId="12EB47C3">
           <v:line id="_x0000_s2052" style="position:absolute;left:0;text-align:left;z-index:251689472;mso-position-horizontal-relative:page;mso-position-vertical-relative:page" from="420.4pt,507.8pt" to="505.4pt,507.8pt" strokeweight=".5pt">
             <w10:wrap anchorx="page" anchory="page"/>
           </v:line>
         </w:pict>
       </w:r>
       <w:r>
-        <w:pict w14:anchorId="0C3FF011">
+        <w:pict w14:anchorId="672CB2E5">
           <v:line id="_x0000_s2051" style="position:absolute;left:0;text-align:left;z-index:251690496;mso-position-horizontal-relative:page;mso-position-vertical-relative:page" from="149.85pt,557.75pt" to="234.9pt,557.75pt" strokeweight=".5pt">
             <w10:wrap anchorx="page" anchory="page"/>
           </v:line>
         </w:pict>
       </w:r>
       <w:r>
-        <w:pict w14:anchorId="0BE97161">
+        <w:pict w14:anchorId="38D7D7BB">
           <v:line id="_x0000_s2050" style="position:absolute;left:0;text-align:left;z-index:251691520;mso-position-horizontal-relative:page;mso-position-vertical-relative:page" from="420.4pt,557.75pt" to="505.4pt,557.75pt" strokeweight=".5pt">
             <w10:wrap anchorx="page" anchory="page"/>
           </v:line>
@@ -1560,15 +1560,24 @@
         <w:pStyle w:val="1"/>
         <w:pageBreakBefore w:val="0"/>
       </w:pPr>
-      <w:bookmarkStart w:id="0" w:name="_Toc242734600"/>
-      <w:r>
+      <w:bookmarkStart w:id="0" w:name="_Toc242740653"/>
+      <w:r>
+        <w:rPr>
+          <w:rFonts w:eastAsia="SimHei" w:ascii="Times New Roman" w:hAnsi="Times New Roman"/>
+        </w:rPr>
         <w:lastRenderedPageBreak/>
         <w:t>摘</w:t>
       </w:r>
       <w:r>
+        <w:rPr>
+          <w:rFonts w:eastAsia="SimHei" w:ascii="Times New Roman" w:hAnsi="Times New Roman"/>
+        </w:rPr>
         <w:t xml:space="preserve">  </w:t>
       </w:r>
       <w:r>
+        <w:rPr>
+          <w:rFonts w:eastAsia="SimHei" w:ascii="Times New Roman" w:hAnsi="Times New Roman"/>
+        </w:rPr>
         <w:t>要</w:t>
       </w:r>
       <w:bookmarkEnd w:id="0"/>
@@ -1643,8 +1652,11 @@
       <w:pPr>
         <w:pStyle w:val="1"/>
       </w:pPr>
-      <w:bookmarkStart w:id="2" w:name="_Toc242734601"/>
-      <w:r>
+      <w:bookmarkStart w:id="2" w:name="_Toc242740654"/>
+      <w:r>
+        <w:rPr>
+          <w:rFonts w:eastAsia="SimHei" w:ascii="Times New Roman" w:hAnsi="Times New Roman"/>
+        </w:rPr>
         <w:lastRenderedPageBreak/>
         <w:t>ABSTRACT</w:t>
       </w:r>
@@ -1722,14 +1734,17 @@
           <w:noProof/>
           <w:color w:val="auto"/>
           <w:kern w:val="2"/>
-          <w:sz w:val="22"/>
+          <w:szCs w:val="28"/>
           <w14:ligatures w14:val="standardContextual"/>
+          <w:sz w:val="28"/>
         </w:rPr>
       </w:pPr>
       <w:r>
         <w:rPr>
           <w:rFonts w:eastAsia="SimHei" w:ascii="Times New Roman" w:hAnsi="Times New Roman"/>
           <w:bCs w:val="1"/>
+          <w:szCs w:val="28"/>
+          <w:sz w:val="28"/>
           <w:b w:val="1"/>
         </w:rPr>
         <w:fldChar w:fldCharType="begin"/>
@@ -1738,6 +1753,8 @@
         <w:rPr>
           <w:rFonts w:eastAsia="SimHei" w:ascii="Times New Roman" w:hAnsi="Times New Roman"/>
           <w:bCs w:val="1"/>
+          <w:szCs w:val="28"/>
+          <w:sz w:val="28"/>
           <w:b w:val="1"/>
         </w:rPr>
         <w:instrText xml:space="preserve"> TOC \o "1-3" \h \z \u </w:instrText>
@@ -1746,17 +1763,21 @@
         <w:rPr>
           <w:rFonts w:eastAsia="SimHei" w:ascii="Times New Roman" w:hAnsi="Times New Roman"/>
           <w:bCs w:val="1"/>
+          <w:szCs w:val="28"/>
+          <w:sz w:val="28"/>
           <w:b w:val="1"/>
         </w:rPr>
         <w:fldChar w:fldCharType="separate"/>
       </w:r>
-      <w:hyperlink w:anchor="_Toc242734600" w:history="1">
+      <w:hyperlink w:anchor="_Toc242740653" w:history="1">
         <w:r>
           <w:rPr>
             <w:rStyle w:val="af"/>
             <w:rFonts w:eastAsia="SimHei" w:ascii="Times New Roman" w:hAnsi="Times New Roman"/>
             <w:bCs w:val="1"/>
             <w:noProof/>
+            <w:szCs w:val="28"/>
+            <w:sz w:val="28"/>
             <w:b w:val="1"/>
           </w:rPr>
           <w:t>摘</w:t>
@@ -1767,6 +1788,8 @@
             <w:rFonts w:eastAsia="SimHei" w:ascii="Times New Roman" w:hAnsi="Times New Roman"/>
             <w:bCs w:val="1"/>
             <w:noProof/>
+            <w:szCs w:val="28"/>
+            <w:sz w:val="28"/>
             <w:b w:val="1"/>
           </w:rPr>
           <w:t xml:space="preserve">  </w:t>
@@ -1777,6 +1800,8 @@
             <w:rFonts w:eastAsia="SimHei" w:ascii="Times New Roman" w:hAnsi="Times New Roman"/>
             <w:bCs w:val="1"/>
             <w:noProof/>
+            <w:szCs w:val="28"/>
+            <w:sz w:val="28"/>
             <w:b w:val="1"/>
           </w:rPr>
           <w:t>要</w:t>
@@ -1787,6 +1812,8 @@
             <w:bCs w:val="1"/>
             <w:noProof/>
             <w:webHidden/>
+            <w:szCs w:val="28"/>
+            <w:sz w:val="28"/>
             <w:b w:val="1"/>
           </w:rPr>
           <w:tab/>
@@ -1797,6 +1824,8 @@
             <w:b w:val="0"/>
             <w:noProof/>
             <w:webHidden/>
+            <w:szCs w:val="28"/>
+            <w:sz w:val="28"/>
             <w:bCs w:val="0"/>
           </w:rPr>
           <w:fldChar w:fldCharType="begin"/>
@@ -1807,6 +1836,8 @@
             <w:b w:val="0"/>
             <w:noProof/>
             <w:webHidden/>
+            <w:szCs w:val="28"/>
+            <w:sz w:val="28"/>
             <w:bCs w:val="0"/>
           </w:rPr>
           <w:instrText xml:space="preserve"> </w:instrText>
@@ -1817,9 +1848,11 @@
             <w:b w:val="0"/>
             <w:noProof/>
             <w:webHidden/>
+            <w:szCs w:val="28"/>
+            <w:sz w:val="28"/>
             <w:bCs w:val="0"/>
           </w:rPr>
-          <w:instrText>PAGEREF _Toc242734600 \h</w:instrText>
+          <w:instrText>PAGEREF _Toc242740653 \h</w:instrText>
         </w:r>
         <w:r>
           <w:rPr>
@@ -1827,6 +1860,8 @@
             <w:b w:val="0"/>
             <w:noProof/>
             <w:webHidden/>
+            <w:szCs w:val="28"/>
+            <w:sz w:val="28"/>
             <w:bCs w:val="0"/>
           </w:rPr>
           <w:instrText xml:space="preserve"> </w:instrText>
@@ -1837,6 +1872,8 @@
             <w:b w:val="0"/>
             <w:noProof/>
             <w:webHidden/>
+            <w:szCs w:val="28"/>
+            <w:sz w:val="28"/>
             <w:bCs w:val="0"/>
           </w:rPr>
         </w:r>
@@ -1846,6 +1883,8 @@
             <w:b w:val="0"/>
             <w:noProof/>
             <w:webHidden/>
+            <w:szCs w:val="28"/>
+            <w:sz w:val="28"/>
             <w:bCs w:val="0"/>
           </w:rPr>
           <w:fldChar w:fldCharType="separate"/>
@@ -1856,6 +1895,8 @@
             <w:b w:val="0"/>
             <w:noProof/>
             <w:webHidden/>
+            <w:szCs w:val="28"/>
+            <w:sz w:val="28"/>
             <w:bCs w:val="0"/>
           </w:rPr>
           <w:t>i</w:t>
@@ -1866,6 +1907,8 @@
             <w:b w:val="0"/>
             <w:noProof/>
             <w:webHidden/>
+            <w:szCs w:val="28"/>
+            <w:sz w:val="28"/>
             <w:bCs w:val="0"/>
           </w:rPr>
           <w:fldChar w:fldCharType="end"/>
@@ -1883,11 +1926,12 @@
           <w:noProof/>
           <w:color w:val="auto"/>
           <w:kern w:val="2"/>
-          <w:sz w:val="22"/>
+          <w:szCs w:val="28"/>
           <w14:ligatures w14:val="standardContextual"/>
-        </w:rPr>
-      </w:pPr>
-      <w:hyperlink w:anchor="_Toc242734601" w:history="1">
+          <w:sz w:val="28"/>
+        </w:rPr>
+      </w:pPr>
+      <w:hyperlink w:anchor="_Toc242740654" w:history="1">
         <w:r>
           <w:rPr>
             <w:rStyle w:val="af"/>
@@ -1895,6 +1939,8 @@
             <w:b w:val="1"/>
             <w:bCs w:val="1"/>
             <w:noProof/>
+            <w:szCs w:val="28"/>
+            <w:sz w:val="28"/>
           </w:rPr>
           <w:t>ABSTRACT</w:t>
         </w:r>
@@ -1905,6 +1951,8 @@
             <w:bCs w:val="1"/>
             <w:noProof/>
             <w:webHidden/>
+            <w:szCs w:val="28"/>
+            <w:sz w:val="28"/>
           </w:rPr>
           <w:tab/>
         </w:r>
@@ -1914,6 +1962,8 @@
             <w:b w:val="0"/>
             <w:noProof/>
             <w:webHidden/>
+            <w:szCs w:val="28"/>
+            <w:sz w:val="28"/>
             <w:bCs w:val="0"/>
           </w:rPr>
           <w:fldChar w:fldCharType="begin"/>
@@ -1924,6 +1974,8 @@
             <w:b w:val="0"/>
             <w:noProof/>
             <w:webHidden/>
+            <w:szCs w:val="28"/>
+            <w:sz w:val="28"/>
             <w:bCs w:val="0"/>
           </w:rPr>
           <w:instrText xml:space="preserve"> </w:instrText>
@@ -1934,9 +1986,11 @@
             <w:b w:val="0"/>
             <w:noProof/>
             <w:webHidden/>
+            <w:szCs w:val="28"/>
+            <w:sz w:val="28"/>
             <w:bCs w:val="0"/>
           </w:rPr>
-          <w:instrText>PAGEREF _Toc242734601 \h</w:instrText>
+          <w:instrText>PAGEREF _Toc242740654 \h</w:instrText>
         </w:r>
         <w:r>
           <w:rPr>
@@ -1944,6 +1998,8 @@
             <w:b w:val="0"/>
             <w:noProof/>
             <w:webHidden/>
+            <w:szCs w:val="28"/>
+            <w:sz w:val="28"/>
             <w:bCs w:val="0"/>
           </w:rPr>
           <w:instrText xml:space="preserve"> </w:instrText>
@@ -1954,6 +2010,8 @@
             <w:b w:val="0"/>
             <w:noProof/>
             <w:webHidden/>
+            <w:szCs w:val="28"/>
+            <w:sz w:val="28"/>
             <w:bCs w:val="0"/>
           </w:rPr>
         </w:r>
@@ -1963,6 +2021,8 @@
             <w:b w:val="0"/>
             <w:noProof/>
             <w:webHidden/>
+            <w:szCs w:val="28"/>
+            <w:sz w:val="28"/>
             <w:bCs w:val="0"/>
           </w:rPr>
           <w:fldChar w:fldCharType="separate"/>
@@ -1973,6 +2033,8 @@
             <w:b w:val="0"/>
             <w:noProof/>
             <w:webHidden/>
+            <w:szCs w:val="28"/>
+            <w:sz w:val="28"/>
             <w:bCs w:val="0"/>
           </w:rPr>
           <w:t>ii</w:t>
@@ -1983,6 +2045,8 @@
             <w:b w:val="0"/>
             <w:noProof/>
             <w:webHidden/>
+            <w:szCs w:val="28"/>
+            <w:sz w:val="28"/>
             <w:bCs w:val="0"/>
           </w:rPr>
           <w:fldChar w:fldCharType="end"/>
@@ -2000,11 +2064,12 @@
           <w:noProof/>
           <w:color w:val="auto"/>
           <w:kern w:val="2"/>
-          <w:sz w:val="22"/>
+          <w:szCs w:val="28"/>
           <w14:ligatures w14:val="standardContextual"/>
-        </w:rPr>
-      </w:pPr>
-      <w:hyperlink w:anchor="_Toc242734602" w:history="1">
+          <w:sz w:val="28"/>
+        </w:rPr>
+      </w:pPr>
+      <w:hyperlink w:anchor="_Toc242740655" w:history="1">
         <w:r>
           <w:rPr>
             <w:rStyle w:val="af"/>
@@ -2012,6 +2077,8 @@
             <w:b w:val="1"/>
             <w:bCs w:val="1"/>
             <w:noProof/>
+            <w:szCs w:val="28"/>
+            <w:sz w:val="28"/>
           </w:rPr>
           <w:t>第一章</w:t>
         </w:r>
@@ -2022,6 +2089,8 @@
             <w:b w:val="1"/>
             <w:bCs w:val="1"/>
             <w:noProof/>
+            <w:szCs w:val="28"/>
+            <w:sz w:val="28"/>
           </w:rPr>
           <w:t xml:space="preserve">  </w:t>
         </w:r>
@@ -2032,6 +2101,8 @@
             <w:b w:val="1"/>
             <w:bCs w:val="1"/>
             <w:noProof/>
+            <w:szCs w:val="28"/>
+            <w:sz w:val="28"/>
           </w:rPr>
           <w:t>绪论</w:t>
         </w:r>
@@ -2042,6 +2113,8 @@
             <w:bCs w:val="1"/>
             <w:noProof/>
             <w:webHidden/>
+            <w:szCs w:val="28"/>
+            <w:sz w:val="28"/>
           </w:rPr>
           <w:tab/>
         </w:r>
@@ -2051,6 +2124,8 @@
             <w:b w:val="0"/>
             <w:noProof/>
             <w:webHidden/>
+            <w:szCs w:val="28"/>
+            <w:sz w:val="28"/>
             <w:bCs w:val="0"/>
           </w:rPr>
           <w:fldChar w:fldCharType="begin"/>
@@ -2061,6 +2136,8 @@
             <w:b w:val="0"/>
             <w:noProof/>
             <w:webHidden/>
+            <w:szCs w:val="28"/>
+            <w:sz w:val="28"/>
             <w:bCs w:val="0"/>
           </w:rPr>
           <w:instrText xml:space="preserve"> </w:instrText>
@@ -2071,9 +2148,11 @@
             <w:b w:val="0"/>
             <w:noProof/>
             <w:webHidden/>
+            <w:szCs w:val="28"/>
+            <w:sz w:val="28"/>
             <w:bCs w:val="0"/>
           </w:rPr>
-          <w:instrText>PAGEREF _Toc242734602 \h</w:instrText>
+          <w:instrText>PAGEREF _Toc242740655 \h</w:instrText>
         </w:r>
         <w:r>
           <w:rPr>
@@ -2081,6 +2160,8 @@
             <w:b w:val="0"/>
             <w:noProof/>
             <w:webHidden/>
+            <w:szCs w:val="28"/>
+            <w:sz w:val="28"/>
             <w:bCs w:val="0"/>
           </w:rPr>
           <w:instrText xml:space="preserve"> </w:instrText>
@@ -2091,6 +2172,8 @@
             <w:b w:val="0"/>
             <w:noProof/>
             <w:webHidden/>
+            <w:szCs w:val="28"/>
+            <w:sz w:val="28"/>
             <w:bCs w:val="0"/>
           </w:rPr>
         </w:r>
@@ -2100,6 +2183,8 @@
             <w:b w:val="0"/>
             <w:noProof/>
             <w:webHidden/>
+            <w:szCs w:val="28"/>
+            <w:sz w:val="28"/>
             <w:bCs w:val="0"/>
           </w:rPr>
           <w:fldChar w:fldCharType="separate"/>
@@ -2110,6 +2195,8 @@
             <w:b w:val="0"/>
             <w:noProof/>
             <w:webHidden/>
+            <w:szCs w:val="28"/>
+            <w:sz w:val="28"/>
             <w:bCs w:val="0"/>
           </w:rPr>
           <w:t>1</w:t>
@@ -2120,6 +2207,8 @@
             <w:b w:val="0"/>
             <w:noProof/>
             <w:webHidden/>
+            <w:szCs w:val="28"/>
+            <w:sz w:val="28"/>
             <w:bCs w:val="0"/>
           </w:rPr>
           <w:fldChar w:fldCharType="end"/>
@@ -2138,15 +2227,18 @@
           <w:noProof/>
           <w:color w:val="auto"/>
           <w:kern w:val="2"/>
-          <w:sz w:val="22"/>
           <w14:ligatures w14:val="standardContextual"/>
-        </w:rPr>
-      </w:pPr>
-      <w:hyperlink w:anchor="_Toc242734603" w:history="1">
+          <w:sz w:val="24"/>
+          <w:szCs w:val="24"/>
+        </w:rPr>
+      </w:pPr>
+      <w:hyperlink w:anchor="_Toc242740656" w:history="1">
         <w:r>
           <w:rPr>
             <w:rStyle w:val="af"/>
             <w:noProof/>
+            <w:sz w:val="24"/>
+            <w:szCs w:val="24"/>
           </w:rPr>
           <w:t xml:space="preserve">1.1  </w:t>
         </w:r>
@@ -2154,6 +2246,8 @@
           <w:rPr>
             <w:rStyle w:val="af"/>
             <w:noProof/>
+            <w:sz w:val="24"/>
+            <w:szCs w:val="24"/>
           </w:rPr>
           <w:t>研究背景与意义</w:t>
         </w:r>
@@ -2162,6 +2256,8 @@
             <w:rFonts w:hint="eastAsia"/>
             <w:noProof/>
             <w:webHidden/>
+            <w:sz w:val="24"/>
+            <w:szCs w:val="24"/>
           </w:rPr>
           <w:tab/>
         </w:r>
@@ -2170,6 +2266,8 @@
             <w:rFonts w:hint="eastAsia"/>
             <w:noProof/>
             <w:webHidden/>
+            <w:sz w:val="24"/>
+            <w:szCs w:val="24"/>
           </w:rPr>
           <w:fldChar w:fldCharType="begin"/>
         </w:r>
@@ -2178,6 +2276,8 @@
             <w:rFonts w:hint="eastAsia"/>
             <w:noProof/>
             <w:webHidden/>
+            <w:sz w:val="24"/>
+            <w:szCs w:val="24"/>
           </w:rPr>
           <w:instrText xml:space="preserve"> </w:instrText>
         </w:r>
@@ -2185,14 +2285,18 @@
           <w:rPr>
             <w:noProof/>
             <w:webHidden/>
-          </w:rPr>
-          <w:instrText>PAGEREF _Toc242734603 \h</w:instrText>
+            <w:sz w:val="24"/>
+            <w:szCs w:val="24"/>
+          </w:rPr>
+          <w:instrText>PAGEREF _Toc242740656 \h</w:instrText>
         </w:r>
         <w:r>
           <w:rPr>
             <w:rFonts w:hint="eastAsia"/>
             <w:noProof/>
             <w:webHidden/>
+            <w:sz w:val="24"/>
+            <w:szCs w:val="24"/>
           </w:rPr>
           <w:instrText xml:space="preserve"> </w:instrText>
         </w:r>
@@ -2201,6 +2305,8 @@
             <w:rFonts w:hint="eastAsia"/>
             <w:noProof/>
             <w:webHidden/>
+            <w:sz w:val="24"/>
+            <w:szCs w:val="24"/>
           </w:rPr>
         </w:r>
         <w:r>
@@ -2208,6 +2314,8 @@
             <w:rFonts w:hint="eastAsia"/>
             <w:noProof/>
             <w:webHidden/>
+            <w:sz w:val="24"/>
+            <w:szCs w:val="24"/>
           </w:rPr>
           <w:fldChar w:fldCharType="separate"/>
         </w:r>
@@ -2215,6 +2323,8 @@
           <w:rPr>
             <w:noProof/>
             <w:webHidden/>
+            <w:sz w:val="24"/>
+            <w:szCs w:val="24"/>
           </w:rPr>
           <w:t>1</w:t>
         </w:r>
@@ -2223,6 +2333,8 @@
             <w:rFonts w:hint="eastAsia"/>
             <w:noProof/>
             <w:webHidden/>
+            <w:sz w:val="24"/>
+            <w:szCs w:val="24"/>
           </w:rPr>
           <w:fldChar w:fldCharType="end"/>
         </w:r>
@@ -2240,15 +2352,18 @@
           <w:noProof/>
           <w:color w:val="auto"/>
           <w:kern w:val="2"/>
-          <w:sz w:val="22"/>
           <w14:ligatures w14:val="standardContextual"/>
-        </w:rPr>
-      </w:pPr>
-      <w:hyperlink w:anchor="_Toc242734604" w:history="1">
+          <w:sz w:val="24"/>
+          <w:szCs w:val="24"/>
+        </w:rPr>
+      </w:pPr>
+      <w:hyperlink w:anchor="_Toc242740657" w:history="1">
         <w:r>
           <w:rPr>
             <w:rStyle w:val="af"/>
             <w:noProof/>
+            <w:sz w:val="24"/>
+            <w:szCs w:val="24"/>
           </w:rPr>
           <w:t xml:space="preserve">1.1.1  </w:t>
         </w:r>
@@ -2256,6 +2371,8 @@
           <w:rPr>
             <w:rStyle w:val="af"/>
             <w:noProof/>
+            <w:sz w:val="24"/>
+            <w:szCs w:val="24"/>
           </w:rPr>
           <w:t>研究背景</w:t>
         </w:r>
@@ -2264,6 +2381,8 @@
             <w:rFonts w:hint="eastAsia"/>
             <w:noProof/>
             <w:webHidden/>
+            <w:sz w:val="24"/>
+            <w:szCs w:val="24"/>
           </w:rPr>
           <w:tab/>
         </w:r>
@@ -2272,6 +2391,8 @@
             <w:rFonts w:hint="eastAsia"/>
             <w:noProof/>
             <w:webHidden/>
+            <w:sz w:val="24"/>
+            <w:szCs w:val="24"/>
           </w:rPr>
           <w:fldChar w:fldCharType="begin"/>
         </w:r>
@@ -2280,6 +2401,8 @@
             <w:rFonts w:hint="eastAsia"/>
             <w:noProof/>
             <w:webHidden/>
+            <w:sz w:val="24"/>
+            <w:szCs w:val="24"/>
           </w:rPr>
           <w:instrText xml:space="preserve"> </w:instrText>
         </w:r>
@@ -2287,14 +2410,18 @@
           <w:rPr>
             <w:noProof/>
             <w:webHidden/>
-          </w:rPr>
-          <w:instrText>PAGEREF _Toc242734604 \h</w:instrText>
+            <w:sz w:val="24"/>
+            <w:szCs w:val="24"/>
+          </w:rPr>
+          <w:instrText>PAGEREF _Toc242740657 \h</w:instrText>
         </w:r>
         <w:r>
           <w:rPr>
             <w:rFonts w:hint="eastAsia"/>
             <w:noProof/>
             <w:webHidden/>
+            <w:sz w:val="24"/>
+            <w:szCs w:val="24"/>
           </w:rPr>
           <w:instrText xml:space="preserve"> </w:instrText>
         </w:r>
@@ -2303,6 +2430,8 @@
             <w:rFonts w:hint="eastAsia"/>
             <w:noProof/>
             <w:webHidden/>
+            <w:sz w:val="24"/>
+            <w:szCs w:val="24"/>
           </w:rPr>
         </w:r>
         <w:r>
@@ -2310,6 +2439,8 @@
             <w:rFonts w:hint="eastAsia"/>
             <w:noProof/>
             <w:webHidden/>
+            <w:sz w:val="24"/>
+            <w:szCs w:val="24"/>
           </w:rPr>
           <w:fldChar w:fldCharType="separate"/>
         </w:r>
@@ -2317,6 +2448,8 @@
           <w:rPr>
             <w:noProof/>
             <w:webHidden/>
+            <w:sz w:val="24"/>
+            <w:szCs w:val="24"/>
           </w:rPr>
           <w:t>1</w:t>
         </w:r>
@@ -2325,6 +2458,8 @@
             <w:rFonts w:hint="eastAsia"/>
             <w:noProof/>
             <w:webHidden/>
+            <w:sz w:val="24"/>
+            <w:szCs w:val="24"/>
           </w:rPr>
           <w:fldChar w:fldCharType="end"/>
         </w:r>
@@ -2342,15 +2477,18 @@
           <w:noProof/>
           <w:color w:val="auto"/>
           <w:kern w:val="2"/>
-          <w:sz w:val="22"/>
           <w14:ligatures w14:val="standardContextual"/>
-        </w:rPr>
-      </w:pPr>
-      <w:hyperlink w:anchor="_Toc242734605" w:history="1">
+          <w:sz w:val="24"/>
+          <w:szCs w:val="24"/>
+        </w:rPr>
+      </w:pPr>
+      <w:hyperlink w:anchor="_Toc242740658" w:history="1">
         <w:r>
           <w:rPr>
             <w:rStyle w:val="af"/>
             <w:noProof/>
+            <w:sz w:val="24"/>
+            <w:szCs w:val="24"/>
           </w:rPr>
           <w:t xml:space="preserve">1.1.2  </w:t>
         </w:r>
@@ -2358,6 +2496,8 @@
           <w:rPr>
             <w:rStyle w:val="af"/>
             <w:noProof/>
+            <w:sz w:val="24"/>
+            <w:szCs w:val="24"/>
           </w:rPr>
           <w:t>研究意义</w:t>
         </w:r>
@@ -2366,6 +2506,8 @@
             <w:rFonts w:hint="eastAsia"/>
             <w:noProof/>
             <w:webHidden/>
+            <w:sz w:val="24"/>
+            <w:szCs w:val="24"/>
           </w:rPr>
           <w:tab/>
         </w:r>
@@ -2374,6 +2516,8 @@
             <w:rFonts w:hint="eastAsia"/>
             <w:noProof/>
             <w:webHidden/>
+            <w:sz w:val="24"/>
+            <w:szCs w:val="24"/>
           </w:rPr>
           <w:fldChar w:fldCharType="begin"/>
         </w:r>
@@ -2382,6 +2526,8 @@
             <w:rFonts w:hint="eastAsia"/>
             <w:noProof/>
             <w:webHidden/>
+            <w:sz w:val="24"/>
+            <w:szCs w:val="24"/>
           </w:rPr>
           <w:instrText xml:space="preserve"> </w:instrText>
         </w:r>
@@ -2389,14 +2535,18 @@
           <w:rPr>
             <w:noProof/>
             <w:webHidden/>
-          </w:rPr>
-          <w:instrText>PAGEREF _Toc242734605 \h</w:instrText>
+            <w:sz w:val="24"/>
+            <w:szCs w:val="24"/>
+          </w:rPr>
+          <w:instrText>PAGEREF _Toc242740658 \h</w:instrText>
         </w:r>
         <w:r>
           <w:rPr>
             <w:rFonts w:hint="eastAsia"/>
             <w:noProof/>
             <w:webHidden/>
+            <w:sz w:val="24"/>
+            <w:szCs w:val="24"/>
           </w:rPr>
           <w:instrText xml:space="preserve"> </w:instrText>
         </w:r>
@@ -2405,6 +2555,8 @@
             <w:rFonts w:hint="eastAsia"/>
             <w:noProof/>
             <w:webHidden/>
+            <w:sz w:val="24"/>
+            <w:szCs w:val="24"/>
           </w:rPr>
         </w:r>
         <w:r>
@@ -2412,6 +2564,8 @@
             <w:rFonts w:hint="eastAsia"/>
             <w:noProof/>
             <w:webHidden/>
+            <w:sz w:val="24"/>
+            <w:szCs w:val="24"/>
           </w:rPr>
           <w:fldChar w:fldCharType="separate"/>
         </w:r>
@@ -2419,6 +2573,8 @@
           <w:rPr>
             <w:noProof/>
             <w:webHidden/>
+            <w:sz w:val="24"/>
+            <w:szCs w:val="24"/>
           </w:rPr>
           <w:t>1</w:t>
         </w:r>
@@ -2427,6 +2583,8 @@
             <w:rFonts w:hint="eastAsia"/>
             <w:noProof/>
             <w:webHidden/>
+            <w:sz w:val="24"/>
+            <w:szCs w:val="24"/>
           </w:rPr>
           <w:fldChar w:fldCharType="end"/>
         </w:r>
@@ -2444,15 +2602,18 @@
           <w:noProof/>
           <w:color w:val="auto"/>
           <w:kern w:val="2"/>
-          <w:sz w:val="22"/>
           <w14:ligatures w14:val="standardContextual"/>
-        </w:rPr>
-      </w:pPr>
-      <w:hyperlink w:anchor="_Toc242734606" w:history="1">
+          <w:sz w:val="24"/>
+          <w:szCs w:val="24"/>
+        </w:rPr>
+      </w:pPr>
+      <w:hyperlink w:anchor="_Toc242740659" w:history="1">
         <w:r>
           <w:rPr>
             <w:rStyle w:val="af"/>
             <w:noProof/>
+            <w:sz w:val="24"/>
+            <w:szCs w:val="24"/>
           </w:rPr>
           <w:t xml:space="preserve">1.2  </w:t>
         </w:r>
@@ -2460,6 +2621,8 @@
           <w:rPr>
             <w:rStyle w:val="af"/>
             <w:noProof/>
+            <w:sz w:val="24"/>
+            <w:szCs w:val="24"/>
           </w:rPr>
           <w:t>研究内容与技术路线</w:t>
         </w:r>
@@ -2468,6 +2631,8 @@
             <w:rFonts w:hint="eastAsia"/>
             <w:noProof/>
             <w:webHidden/>
+            <w:sz w:val="24"/>
+            <w:szCs w:val="24"/>
           </w:rPr>
           <w:tab/>
         </w:r>
@@ -2476,6 +2641,8 @@
             <w:rFonts w:hint="eastAsia"/>
             <w:noProof/>
             <w:webHidden/>
+            <w:sz w:val="24"/>
+            <w:szCs w:val="24"/>
           </w:rPr>
           <w:fldChar w:fldCharType="begin"/>
         </w:r>
@@ -2484,6 +2651,8 @@
             <w:rFonts w:hint="eastAsia"/>
             <w:noProof/>
             <w:webHidden/>
+            <w:sz w:val="24"/>
+            <w:szCs w:val="24"/>
           </w:rPr>
           <w:instrText xml:space="preserve"> </w:instrText>
         </w:r>
@@ -2491,14 +2660,18 @@
           <w:rPr>
             <w:noProof/>
             <w:webHidden/>
-          </w:rPr>
-          <w:instrText>PAGEREF _Toc242734606 \h</w:instrText>
+            <w:sz w:val="24"/>
+            <w:szCs w:val="24"/>
+          </w:rPr>
+          <w:instrText>PAGEREF _Toc242740659 \h</w:instrText>
         </w:r>
         <w:r>
           <w:rPr>
             <w:rFonts w:hint="eastAsia"/>
             <w:noProof/>
             <w:webHidden/>
+            <w:sz w:val="24"/>
+            <w:szCs w:val="24"/>
           </w:rPr>
           <w:instrText xml:space="preserve"> </w:instrText>
         </w:r>
@@ -2507,6 +2680,8 @@
             <w:rFonts w:hint="eastAsia"/>
             <w:noProof/>
             <w:webHidden/>
+            <w:sz w:val="24"/>
+            <w:szCs w:val="24"/>
           </w:rPr>
         </w:r>
         <w:r>
@@ -2514,6 +2689,8 @@
             <w:rFonts w:hint="eastAsia"/>
             <w:noProof/>
             <w:webHidden/>
+            <w:sz w:val="24"/>
+            <w:szCs w:val="24"/>
           </w:rPr>
           <w:fldChar w:fldCharType="separate"/>
         </w:r>
@@ -2521,6 +2698,8 @@
           <w:rPr>
             <w:noProof/>
             <w:webHidden/>
+            <w:sz w:val="24"/>
+            <w:szCs w:val="24"/>
           </w:rPr>
           <w:t>1</w:t>
         </w:r>
@@ -2529,6 +2708,8 @@
             <w:rFonts w:hint="eastAsia"/>
             <w:noProof/>
             <w:webHidden/>
+            <w:sz w:val="24"/>
+            <w:szCs w:val="24"/>
           </w:rPr>
           <w:fldChar w:fldCharType="end"/>
         </w:r>
@@ -2545,11 +2726,12 @@
           <w:noProof/>
           <w:color w:val="auto"/>
           <w:kern w:val="2"/>
-          <w:sz w:val="22"/>
+          <w:szCs w:val="28"/>
           <w14:ligatures w14:val="standardContextual"/>
-        </w:rPr>
-      </w:pPr>
-      <w:hyperlink w:anchor="_Toc242734607" w:history="1">
+          <w:sz w:val="28"/>
+        </w:rPr>
+      </w:pPr>
+      <w:hyperlink w:anchor="_Toc242740660" w:history="1">
         <w:r>
           <w:rPr>
             <w:rStyle w:val="af"/>
@@ -2557,6 +2739,8 @@
             <w:b w:val="1"/>
             <w:bCs w:val="1"/>
             <w:noProof/>
+            <w:szCs w:val="28"/>
+            <w:sz w:val="28"/>
           </w:rPr>
           <w:t>第二章</w:t>
         </w:r>
@@ -2567,6 +2751,8 @@
             <w:b w:val="1"/>
             <w:bCs w:val="1"/>
             <w:noProof/>
+            <w:szCs w:val="28"/>
+            <w:sz w:val="28"/>
           </w:rPr>
           <w:t xml:space="preserve">  </w:t>
         </w:r>
@@ -2577,6 +2763,8 @@
             <w:b w:val="1"/>
             <w:bCs w:val="1"/>
             <w:noProof/>
+            <w:szCs w:val="28"/>
+            <w:sz w:val="28"/>
           </w:rPr>
           <w:t>理论基础与方法</w:t>
         </w:r>
@@ -2587,6 +2775,8 @@
             <w:bCs w:val="1"/>
             <w:noProof/>
             <w:webHidden/>
+            <w:szCs w:val="28"/>
+            <w:sz w:val="28"/>
           </w:rPr>
           <w:tab/>
         </w:r>
@@ -2596,6 +2786,8 @@
             <w:b w:val="0"/>
             <w:noProof/>
             <w:webHidden/>
+            <w:szCs w:val="28"/>
+            <w:sz w:val="28"/>
             <w:bCs w:val="0"/>
           </w:rPr>
           <w:fldChar w:fldCharType="begin"/>
@@ -2606,6 +2798,8 @@
             <w:b w:val="0"/>
             <w:noProof/>
             <w:webHidden/>
+            <w:szCs w:val="28"/>
+            <w:sz w:val="28"/>
             <w:bCs w:val="0"/>
           </w:rPr>
           <w:instrText xml:space="preserve"> </w:instrText>
@@ -2616,9 +2810,11 @@
             <w:b w:val="0"/>
             <w:noProof/>
             <w:webHidden/>
+            <w:szCs w:val="28"/>
+            <w:sz w:val="28"/>
             <w:bCs w:val="0"/>
           </w:rPr>
-          <w:instrText>PAGEREF _Toc242734607 \h</w:instrText>
+          <w:instrText>PAGEREF _Toc242740660 \h</w:instrText>
         </w:r>
         <w:r>
           <w:rPr>
@@ -2626,6 +2822,8 @@
             <w:b w:val="0"/>
             <w:noProof/>
             <w:webHidden/>
+            <w:szCs w:val="28"/>
+            <w:sz w:val="28"/>
             <w:bCs w:val="0"/>
           </w:rPr>
           <w:instrText xml:space="preserve"> </w:instrText>
@@ -2636,6 +2834,8 @@
             <w:b w:val="0"/>
             <w:noProof/>
             <w:webHidden/>
+            <w:szCs w:val="28"/>
+            <w:sz w:val="28"/>
             <w:bCs w:val="0"/>
           </w:rPr>
         </w:r>
@@ -2645,6 +2845,8 @@
             <w:b w:val="0"/>
             <w:noProof/>
             <w:webHidden/>
+            <w:szCs w:val="28"/>
+            <w:sz w:val="28"/>
             <w:bCs w:val="0"/>
           </w:rPr>
           <w:fldChar w:fldCharType="separate"/>
@@ -2655,6 +2857,8 @@
             <w:b w:val="0"/>
             <w:noProof/>
             <w:webHidden/>
+            <w:szCs w:val="28"/>
+            <w:sz w:val="28"/>
             <w:bCs w:val="0"/>
           </w:rPr>
           <w:t>4</w:t>
@@ -2665,6 +2869,8 @@
             <w:b w:val="0"/>
             <w:noProof/>
             <w:webHidden/>
+            <w:szCs w:val="28"/>
+            <w:sz w:val="28"/>
             <w:bCs w:val="0"/>
           </w:rPr>
           <w:fldChar w:fldCharType="end"/>
@@ -2683,15 +2889,18 @@
           <w:noProof/>
           <w:color w:val="auto"/>
           <w:kern w:val="2"/>
-          <w:sz w:val="22"/>
           <w14:ligatures w14:val="standardContextual"/>
-        </w:rPr>
-      </w:pPr>
-      <w:hyperlink w:anchor="_Toc242734608" w:history="1">
+          <w:sz w:val="24"/>
+          <w:szCs w:val="24"/>
+        </w:rPr>
+      </w:pPr>
+      <w:hyperlink w:anchor="_Toc242740661" w:history="1">
         <w:r>
           <w:rPr>
             <w:rStyle w:val="af"/>
             <w:noProof/>
+            <w:sz w:val="24"/>
+            <w:szCs w:val="24"/>
           </w:rPr>
           <w:t xml:space="preserve">2.1  </w:t>
         </w:r>
@@ -2699,6 +2908,8 @@
           <w:rPr>
             <w:rStyle w:val="af"/>
             <w:noProof/>
+            <w:sz w:val="24"/>
+            <w:szCs w:val="24"/>
           </w:rPr>
           <w:t>基本理论</w:t>
         </w:r>
@@ -2707,6 +2918,8 @@
             <w:rFonts w:hint="eastAsia"/>
             <w:noProof/>
             <w:webHidden/>
+            <w:sz w:val="24"/>
+            <w:szCs w:val="24"/>
           </w:rPr>
           <w:tab/>
         </w:r>
@@ -2715,6 +2928,8 @@
             <w:rFonts w:hint="eastAsia"/>
             <w:noProof/>
             <w:webHidden/>
+            <w:sz w:val="24"/>
+            <w:szCs w:val="24"/>
           </w:rPr>
           <w:fldChar w:fldCharType="begin"/>
         </w:r>
@@ -2723,6 +2938,8 @@
             <w:rFonts w:hint="eastAsia"/>
             <w:noProof/>
             <w:webHidden/>
+            <w:sz w:val="24"/>
+            <w:szCs w:val="24"/>
           </w:rPr>
           <w:instrText xml:space="preserve"> </w:instrText>
         </w:r>
@@ -2730,14 +2947,18 @@
           <w:rPr>
             <w:noProof/>
             <w:webHidden/>
-          </w:rPr>
-          <w:instrText>PAGEREF _Toc242734608 \h</w:instrText>
+            <w:sz w:val="24"/>
+            <w:szCs w:val="24"/>
+          </w:rPr>
+          <w:instrText>PAGEREF _Toc242740661 \h</w:instrText>
         </w:r>
         <w:r>
           <w:rPr>
             <w:rFonts w:hint="eastAsia"/>
             <w:noProof/>
             <w:webHidden/>
+            <w:sz w:val="24"/>
+            <w:szCs w:val="24"/>
           </w:rPr>
           <w:instrText xml:space="preserve"> </w:instrText>
         </w:r>
@@ -2746,6 +2967,8 @@
             <w:rFonts w:hint="eastAsia"/>
             <w:noProof/>
             <w:webHidden/>
+            <w:sz w:val="24"/>
+            <w:szCs w:val="24"/>
           </w:rPr>
         </w:r>
         <w:r>
@@ -2753,6 +2976,8 @@
             <w:rFonts w:hint="eastAsia"/>
             <w:noProof/>
             <w:webHidden/>
+            <w:sz w:val="24"/>
+            <w:szCs w:val="24"/>
           </w:rPr>
           <w:fldChar w:fldCharType="separate"/>
         </w:r>
@@ -2760,6 +2985,8 @@
           <w:rPr>
             <w:noProof/>
             <w:webHidden/>
+            <w:sz w:val="24"/>
+            <w:szCs w:val="24"/>
           </w:rPr>
           <w:t>4</w:t>
         </w:r>
@@ -2768,6 +2995,8 @@
             <w:rFonts w:hint="eastAsia"/>
             <w:noProof/>
             <w:webHidden/>
+            <w:sz w:val="24"/>
+            <w:szCs w:val="24"/>
           </w:rPr>
           <w:fldChar w:fldCharType="end"/>
         </w:r>
@@ -2785,15 +3014,18 @@
           <w:noProof/>
           <w:color w:val="auto"/>
           <w:kern w:val="2"/>
-          <w:sz w:val="22"/>
           <w14:ligatures w14:val="standardContextual"/>
-        </w:rPr>
-      </w:pPr>
-      <w:hyperlink w:anchor="_Toc242734609" w:history="1">
+          <w:sz w:val="24"/>
+          <w:szCs w:val="24"/>
+        </w:rPr>
+      </w:pPr>
+      <w:hyperlink w:anchor="_Toc242740662" w:history="1">
         <w:r>
           <w:rPr>
             <w:rStyle w:val="af"/>
             <w:noProof/>
+            <w:sz w:val="24"/>
+            <w:szCs w:val="24"/>
           </w:rPr>
           <w:t xml:space="preserve">2.2  </w:t>
         </w:r>
@@ -2801,6 +3033,8 @@
           <w:rPr>
             <w:rStyle w:val="af"/>
             <w:noProof/>
+            <w:sz w:val="24"/>
+            <w:szCs w:val="24"/>
           </w:rPr>
           <w:t>模型表示与计算步骤</w:t>
         </w:r>
@@ -2809,6 +3043,8 @@
             <w:rFonts w:hint="eastAsia"/>
             <w:noProof/>
             <w:webHidden/>
+            <w:sz w:val="24"/>
+            <w:szCs w:val="24"/>
           </w:rPr>
           <w:tab/>
         </w:r>
@@ -2817,6 +3053,8 @@
             <w:rFonts w:hint="eastAsia"/>
             <w:noProof/>
             <w:webHidden/>
+            <w:sz w:val="24"/>
+            <w:szCs w:val="24"/>
           </w:rPr>
           <w:fldChar w:fldCharType="begin"/>
         </w:r>
@@ -2825,6 +3063,8 @@
             <w:rFonts w:hint="eastAsia"/>
             <w:noProof/>
             <w:webHidden/>
+            <w:sz w:val="24"/>
+            <w:szCs w:val="24"/>
           </w:rPr>
           <w:instrText xml:space="preserve"> </w:instrText>
         </w:r>
@@ -2832,14 +3072,18 @@
           <w:rPr>
             <w:noProof/>
             <w:webHidden/>
-          </w:rPr>
-          <w:instrText>PAGEREF _Toc242734609 \h</w:instrText>
+            <w:sz w:val="24"/>
+            <w:szCs w:val="24"/>
+          </w:rPr>
+          <w:instrText>PAGEREF _Toc242740662 \h</w:instrText>
         </w:r>
         <w:r>
           <w:rPr>
             <w:rFonts w:hint="eastAsia"/>
             <w:noProof/>
             <w:webHidden/>
+            <w:sz w:val="24"/>
+            <w:szCs w:val="24"/>
           </w:rPr>
           <w:instrText xml:space="preserve"> </w:instrText>
         </w:r>
@@ -2848,6 +3092,8 @@
             <w:rFonts w:hint="eastAsia"/>
             <w:noProof/>
             <w:webHidden/>
+            <w:sz w:val="24"/>
+            <w:szCs w:val="24"/>
           </w:rPr>
         </w:r>
         <w:r>
@@ -2855,6 +3101,8 @@
             <w:rFonts w:hint="eastAsia"/>
             <w:noProof/>
             <w:webHidden/>
+            <w:sz w:val="24"/>
+            <w:szCs w:val="24"/>
           </w:rPr>
           <w:fldChar w:fldCharType="separate"/>
         </w:r>
@@ -2862,6 +3110,8 @@
           <w:rPr>
             <w:noProof/>
             <w:webHidden/>
+            <w:sz w:val="24"/>
+            <w:szCs w:val="24"/>
           </w:rPr>
           <w:t>4</w:t>
         </w:r>
@@ -2870,6 +3120,8 @@
             <w:rFonts w:hint="eastAsia"/>
             <w:noProof/>
             <w:webHidden/>
+            <w:sz w:val="24"/>
+            <w:szCs w:val="24"/>
           </w:rPr>
           <w:fldChar w:fldCharType="end"/>
         </w:r>
@@ -2886,11 +3138,12 @@
           <w:noProof/>
           <w:color w:val="auto"/>
           <w:kern w:val="2"/>
-          <w:sz w:val="22"/>
+          <w:szCs w:val="28"/>
           <w14:ligatures w14:val="standardContextual"/>
-        </w:rPr>
-      </w:pPr>
-      <w:hyperlink w:anchor="_Toc242734610" w:history="1">
+          <w:sz w:val="28"/>
+        </w:rPr>
+      </w:pPr>
+      <w:hyperlink w:anchor="_Toc242740663" w:history="1">
         <w:r>
           <w:rPr>
             <w:rStyle w:val="af"/>
@@ -2898,6 +3151,8 @@
             <w:b w:val="1"/>
             <w:bCs w:val="1"/>
             <w:noProof/>
+            <w:szCs w:val="28"/>
+            <w:sz w:val="28"/>
           </w:rPr>
           <w:t>第三章</w:t>
         </w:r>
@@ -2908,6 +3163,8 @@
             <w:b w:val="1"/>
             <w:bCs w:val="1"/>
             <w:noProof/>
+            <w:szCs w:val="28"/>
+            <w:sz w:val="28"/>
           </w:rPr>
           <w:t xml:space="preserve">  </w:t>
         </w:r>
@@ -2918,6 +3175,8 @@
             <w:b w:val="1"/>
             <w:bCs w:val="1"/>
             <w:noProof/>
+            <w:szCs w:val="28"/>
+            <w:sz w:val="28"/>
           </w:rPr>
           <w:t>模型构建与结果分析</w:t>
         </w:r>
@@ -2928,6 +3187,8 @@
             <w:bCs w:val="1"/>
             <w:noProof/>
             <w:webHidden/>
+            <w:szCs w:val="28"/>
+            <w:sz w:val="28"/>
           </w:rPr>
           <w:tab/>
         </w:r>
@@ -2937,6 +3198,8 @@
             <w:b w:val="0"/>
             <w:noProof/>
             <w:webHidden/>
+            <w:szCs w:val="28"/>
+            <w:sz w:val="28"/>
             <w:bCs w:val="0"/>
           </w:rPr>
           <w:fldChar w:fldCharType="begin"/>
@@ -2947,6 +3210,8 @@
             <w:b w:val="0"/>
             <w:noProof/>
             <w:webHidden/>
+            <w:szCs w:val="28"/>
+            <w:sz w:val="28"/>
             <w:bCs w:val="0"/>
           </w:rPr>
           <w:instrText xml:space="preserve"> </w:instrText>
@@ -2957,9 +3222,11 @@
             <w:b w:val="0"/>
             <w:noProof/>
             <w:webHidden/>
+            <w:szCs w:val="28"/>
+            <w:sz w:val="28"/>
             <w:bCs w:val="0"/>
           </w:rPr>
-          <w:instrText>PAGEREF _Toc242734610 \h</w:instrText>
+          <w:instrText>PAGEREF _Toc242740663 \h</w:instrText>
         </w:r>
         <w:r>
           <w:rPr>
@@ -2967,6 +3234,8 @@
             <w:b w:val="0"/>
             <w:noProof/>
             <w:webHidden/>
+            <w:szCs w:val="28"/>
+            <w:sz w:val="28"/>
             <w:bCs w:val="0"/>
           </w:rPr>
           <w:instrText xml:space="preserve"> </w:instrText>
@@ -2977,6 +3246,8 @@
             <w:b w:val="0"/>
             <w:noProof/>
             <w:webHidden/>
+            <w:szCs w:val="28"/>
+            <w:sz w:val="28"/>
             <w:bCs w:val="0"/>
           </w:rPr>
         </w:r>
@@ -2986,6 +3257,8 @@
             <w:b w:val="0"/>
             <w:noProof/>
             <w:webHidden/>
+            <w:szCs w:val="28"/>
+            <w:sz w:val="28"/>
             <w:bCs w:val="0"/>
           </w:rPr>
           <w:fldChar w:fldCharType="separate"/>
@@ -2996,6 +3269,8 @@
             <w:b w:val="0"/>
             <w:noProof/>
             <w:webHidden/>
+            <w:szCs w:val="28"/>
+            <w:sz w:val="28"/>
             <w:bCs w:val="0"/>
           </w:rPr>
           <w:t>6</w:t>
@@ -3006,6 +3281,8 @@
             <w:b w:val="0"/>
             <w:noProof/>
             <w:webHidden/>
+            <w:szCs w:val="28"/>
+            <w:sz w:val="28"/>
             <w:bCs w:val="0"/>
           </w:rPr>
           <w:fldChar w:fldCharType="end"/>
@@ -3024,15 +3301,18 @@
           <w:noProof/>
           <w:color w:val="auto"/>
           <w:kern w:val="2"/>
-          <w:sz w:val="22"/>
           <w14:ligatures w14:val="standardContextual"/>
-        </w:rPr>
-      </w:pPr>
-      <w:hyperlink w:anchor="_Toc242734611" w:history="1">
+          <w:sz w:val="24"/>
+          <w:szCs w:val="24"/>
+        </w:rPr>
+      </w:pPr>
+      <w:hyperlink w:anchor="_Toc242740664" w:history="1">
         <w:r>
           <w:rPr>
             <w:rStyle w:val="af"/>
             <w:noProof/>
+            <w:sz w:val="24"/>
+            <w:szCs w:val="24"/>
           </w:rPr>
           <w:t xml:space="preserve">3.1  </w:t>
         </w:r>
@@ -3040,6 +3320,8 @@
           <w:rPr>
             <w:rStyle w:val="af"/>
             <w:noProof/>
+            <w:sz w:val="24"/>
+            <w:szCs w:val="24"/>
           </w:rPr>
           <w:t>模型构建</w:t>
         </w:r>
@@ -3048,6 +3330,8 @@
             <w:rFonts w:hint="eastAsia"/>
             <w:noProof/>
             <w:webHidden/>
+            <w:sz w:val="24"/>
+            <w:szCs w:val="24"/>
           </w:rPr>
           <w:tab/>
         </w:r>
@@ -3056,6 +3340,8 @@
             <w:rFonts w:hint="eastAsia"/>
             <w:noProof/>
             <w:webHidden/>
+            <w:sz w:val="24"/>
+            <w:szCs w:val="24"/>
           </w:rPr>
           <w:fldChar w:fldCharType="begin"/>
         </w:r>
@@ -3064,6 +3350,8 @@
             <w:rFonts w:hint="eastAsia"/>
             <w:noProof/>
             <w:webHidden/>
+            <w:sz w:val="24"/>
+            <w:szCs w:val="24"/>
           </w:rPr>
           <w:instrText xml:space="preserve"> </w:instrText>
         </w:r>
@@ -3071,14 +3359,18 @@
           <w:rPr>
             <w:noProof/>
             <w:webHidden/>
-          </w:rPr>
-          <w:instrText>PAGEREF _Toc242734611 \h</w:instrText>
+            <w:sz w:val="24"/>
+            <w:szCs w:val="24"/>
+          </w:rPr>
+          <w:instrText>PAGEREF _Toc242740664 \h</w:instrText>
         </w:r>
         <w:r>
           <w:rPr>
             <w:rFonts w:hint="eastAsia"/>
             <w:noProof/>
             <w:webHidden/>
+            <w:sz w:val="24"/>
+            <w:szCs w:val="24"/>
           </w:rPr>
           <w:instrText xml:space="preserve"> </w:instrText>
         </w:r>
@@ -3087,6 +3379,8 @@
             <w:rFonts w:hint="eastAsia"/>
             <w:noProof/>
             <w:webHidden/>
+            <w:sz w:val="24"/>
+            <w:szCs w:val="24"/>
           </w:rPr>
         </w:r>
         <w:r>
@@ -3094,6 +3388,8 @@
             <w:rFonts w:hint="eastAsia"/>
             <w:noProof/>
             <w:webHidden/>
+            <w:sz w:val="24"/>
+            <w:szCs w:val="24"/>
           </w:rPr>
           <w:fldChar w:fldCharType="separate"/>
         </w:r>
@@ -3101,6 +3397,8 @@
           <w:rPr>
             <w:noProof/>
             <w:webHidden/>
+            <w:sz w:val="24"/>
+            <w:szCs w:val="24"/>
           </w:rPr>
           <w:t>6</w:t>
         </w:r>
@@ -3109,6 +3407,8 @@
             <w:rFonts w:hint="eastAsia"/>
             <w:noProof/>
             <w:webHidden/>
+            <w:sz w:val="24"/>
+            <w:szCs w:val="24"/>
           </w:rPr>
           <w:fldChar w:fldCharType="end"/>
         </w:r>
@@ -3126,15 +3426,18 @@
           <w:noProof/>
           <w:color w:val="auto"/>
           <w:kern w:val="2"/>
-          <w:sz w:val="22"/>
           <w14:ligatures w14:val="standardContextual"/>
-        </w:rPr>
-      </w:pPr>
-      <w:hyperlink w:anchor="_Toc242734612" w:history="1">
+          <w:sz w:val="24"/>
+          <w:szCs w:val="24"/>
+        </w:rPr>
+      </w:pPr>
+      <w:hyperlink w:anchor="_Toc242740665" w:history="1">
         <w:r>
           <w:rPr>
             <w:rStyle w:val="af"/>
             <w:noProof/>
+            <w:sz w:val="24"/>
+            <w:szCs w:val="24"/>
           </w:rPr>
           <w:t xml:space="preserve">3.2  </w:t>
         </w:r>
@@ -3142,6 +3445,8 @@
           <w:rPr>
             <w:rStyle w:val="af"/>
             <w:noProof/>
+            <w:sz w:val="24"/>
+            <w:szCs w:val="24"/>
           </w:rPr>
           <w:t>实验设计与结果比较</w:t>
         </w:r>
@@ -3150,6 +3455,8 @@
             <w:rFonts w:hint="eastAsia"/>
             <w:noProof/>
             <w:webHidden/>
+            <w:sz w:val="24"/>
+            <w:szCs w:val="24"/>
           </w:rPr>
           <w:tab/>
         </w:r>
@@ -3158,6 +3465,8 @@
             <w:rFonts w:hint="eastAsia"/>
             <w:noProof/>
             <w:webHidden/>
+            <w:sz w:val="24"/>
+            <w:szCs w:val="24"/>
           </w:rPr>
           <w:fldChar w:fldCharType="begin"/>
         </w:r>
@@ -3166,6 +3475,8 @@
             <w:rFonts w:hint="eastAsia"/>
             <w:noProof/>
             <w:webHidden/>
+            <w:sz w:val="24"/>
+            <w:szCs w:val="24"/>
           </w:rPr>
           <w:instrText xml:space="preserve"> </w:instrText>
         </w:r>
@@ -3173,14 +3484,18 @@
           <w:rPr>
             <w:noProof/>
             <w:webHidden/>
-          </w:rPr>
-          <w:instrText>PAGEREF _Toc242734612 \h</w:instrText>
+            <w:sz w:val="24"/>
+            <w:szCs w:val="24"/>
+          </w:rPr>
+          <w:instrText>PAGEREF _Toc242740665 \h</w:instrText>
         </w:r>
         <w:r>
           <w:rPr>
             <w:rFonts w:hint="eastAsia"/>
             <w:noProof/>
             <w:webHidden/>
+            <w:sz w:val="24"/>
+            <w:szCs w:val="24"/>
           </w:rPr>
           <w:instrText xml:space="preserve"> </w:instrText>
         </w:r>
@@ -3189,6 +3504,8 @@
             <w:rFonts w:hint="eastAsia"/>
             <w:noProof/>
             <w:webHidden/>
+            <w:sz w:val="24"/>
+            <w:szCs w:val="24"/>
           </w:rPr>
         </w:r>
         <w:r>
@@ -3196,6 +3513,8 @@
             <w:rFonts w:hint="eastAsia"/>
             <w:noProof/>
             <w:webHidden/>
+            <w:sz w:val="24"/>
+            <w:szCs w:val="24"/>
           </w:rPr>
           <w:fldChar w:fldCharType="separate"/>
         </w:r>
@@ -3203,6 +3522,8 @@
           <w:rPr>
             <w:noProof/>
             <w:webHidden/>
+            <w:sz w:val="24"/>
+            <w:szCs w:val="24"/>
           </w:rPr>
           <w:t>6</w:t>
         </w:r>
@@ -3211,6 +3532,8 @@
             <w:rFonts w:hint="eastAsia"/>
             <w:noProof/>
             <w:webHidden/>
+            <w:sz w:val="24"/>
+            <w:szCs w:val="24"/>
           </w:rPr>
           <w:fldChar w:fldCharType="end"/>
         </w:r>
@@ -3228,15 +3551,18 @@
           <w:noProof/>
           <w:color w:val="auto"/>
           <w:kern w:val="2"/>
-          <w:sz w:val="22"/>
           <w14:ligatures w14:val="standardContextual"/>
-        </w:rPr>
-      </w:pPr>
-      <w:hyperlink w:anchor="_Toc242734613" w:history="1">
+          <w:sz w:val="24"/>
+          <w:szCs w:val="24"/>
+        </w:rPr>
+      </w:pPr>
+      <w:hyperlink w:anchor="_Toc242740666" w:history="1">
         <w:r>
           <w:rPr>
             <w:rStyle w:val="af"/>
             <w:noProof/>
+            <w:sz w:val="24"/>
+            <w:szCs w:val="24"/>
           </w:rPr>
           <w:t xml:space="preserve">3.3  </w:t>
         </w:r>
@@ -3244,6 +3570,8 @@
           <w:rPr>
             <w:rStyle w:val="af"/>
             <w:noProof/>
+            <w:sz w:val="24"/>
+            <w:szCs w:val="24"/>
           </w:rPr>
           <w:t>本章小结</w:t>
         </w:r>
@@ -3252,6 +3580,8 @@
             <w:rFonts w:hint="eastAsia"/>
             <w:noProof/>
             <w:webHidden/>
+            <w:sz w:val="24"/>
+            <w:szCs w:val="24"/>
           </w:rPr>
           <w:tab/>
         </w:r>
@@ -3260,6 +3590,8 @@
             <w:rFonts w:hint="eastAsia"/>
             <w:noProof/>
             <w:webHidden/>
+            <w:sz w:val="24"/>
+            <w:szCs w:val="24"/>
           </w:rPr>
           <w:fldChar w:fldCharType="begin"/>
         </w:r>
@@ -3268,6 +3600,8 @@
             <w:rFonts w:hint="eastAsia"/>
             <w:noProof/>
             <w:webHidden/>
+            <w:sz w:val="24"/>
+            <w:szCs w:val="24"/>
           </w:rPr>
           <w:instrText xml:space="preserve"> </w:instrText>
         </w:r>
@@ -3275,14 +3609,18 @@
           <w:rPr>
             <w:noProof/>
             <w:webHidden/>
-          </w:rPr>
-          <w:instrText>PAGEREF _Toc242734613 \h</w:instrText>
+            <w:sz w:val="24"/>
+            <w:szCs w:val="24"/>
+          </w:rPr>
+          <w:instrText>PAGEREF _Toc242740666 \h</w:instrText>
         </w:r>
         <w:r>
           <w:rPr>
             <w:rFonts w:hint="eastAsia"/>
             <w:noProof/>
             <w:webHidden/>
+            <w:sz w:val="24"/>
+            <w:szCs w:val="24"/>
           </w:rPr>
           <w:instrText xml:space="preserve"> </w:instrText>
         </w:r>
@@ -3291,6 +3629,8 @@
             <w:rFonts w:hint="eastAsia"/>
             <w:noProof/>
             <w:webHidden/>
+            <w:sz w:val="24"/>
+            <w:szCs w:val="24"/>
           </w:rPr>
         </w:r>
         <w:r>
@@ -3298,6 +3638,8 @@
             <w:rFonts w:hint="eastAsia"/>
             <w:noProof/>
             <w:webHidden/>
+            <w:sz w:val="24"/>
+            <w:szCs w:val="24"/>
           </w:rPr>
           <w:fldChar w:fldCharType="separate"/>
         </w:r>
@@ -3305,6 +3647,8 @@
           <w:rPr>
             <w:noProof/>
             <w:webHidden/>
+            <w:sz w:val="24"/>
+            <w:szCs w:val="24"/>
           </w:rPr>
           <w:t>8</w:t>
         </w:r>
@@ -3313,6 +3657,8 @@
             <w:rFonts w:hint="eastAsia"/>
             <w:noProof/>
             <w:webHidden/>
+            <w:sz w:val="24"/>
+            <w:szCs w:val="24"/>
           </w:rPr>
           <w:fldChar w:fldCharType="end"/>
         </w:r>
@@ -3329,11 +3675,12 @@
           <w:noProof/>
           <w:color w:val="auto"/>
           <w:kern w:val="2"/>
-          <w:sz w:val="22"/>
+          <w:szCs w:val="28"/>
           <w14:ligatures w14:val="standardContextual"/>
-        </w:rPr>
-      </w:pPr>
-      <w:hyperlink w:anchor="_Toc242734614" w:history="1">
+          <w:sz w:val="28"/>
+        </w:rPr>
+      </w:pPr>
+      <w:hyperlink w:anchor="_Toc242740667" w:history="1">
         <w:r>
           <w:rPr>
             <w:rStyle w:val="af"/>
@@ -3341,6 +3688,8 @@
             <w:b w:val="1"/>
             <w:bCs w:val="1"/>
             <w:noProof/>
+            <w:szCs w:val="28"/>
+            <w:sz w:val="28"/>
           </w:rPr>
           <w:t>第四章</w:t>
         </w:r>
@@ -3351,6 +3700,8 @@
             <w:b w:val="1"/>
             <w:bCs w:val="1"/>
             <w:noProof/>
+            <w:szCs w:val="28"/>
+            <w:sz w:val="28"/>
           </w:rPr>
           <w:t xml:space="preserve">  </w:t>
         </w:r>
@@ -3361,6 +3712,8 @@
             <w:b w:val="1"/>
             <w:bCs w:val="1"/>
             <w:noProof/>
+            <w:szCs w:val="28"/>
+            <w:sz w:val="28"/>
           </w:rPr>
           <w:t>长公式与多行公式测试</w:t>
         </w:r>
@@ -3371,6 +3724,8 @@
             <w:bCs w:val="1"/>
             <w:noProof/>
             <w:webHidden/>
+            <w:szCs w:val="28"/>
+            <w:sz w:val="28"/>
           </w:rPr>
           <w:tab/>
         </w:r>
@@ -3380,6 +3735,8 @@
             <w:b w:val="0"/>
             <w:noProof/>
             <w:webHidden/>
+            <w:szCs w:val="28"/>
+            <w:sz w:val="28"/>
             <w:bCs w:val="0"/>
           </w:rPr>
           <w:fldChar w:fldCharType="begin"/>
@@ -3390,6 +3747,8 @@
             <w:b w:val="0"/>
             <w:noProof/>
             <w:webHidden/>
+            <w:szCs w:val="28"/>
+            <w:sz w:val="28"/>
             <w:bCs w:val="0"/>
           </w:rPr>
           <w:instrText xml:space="preserve"> </w:instrText>
@@ -3400,9 +3759,11 @@
             <w:b w:val="0"/>
             <w:noProof/>
             <w:webHidden/>
+            <w:szCs w:val="28"/>
+            <w:sz w:val="28"/>
             <w:bCs w:val="0"/>
           </w:rPr>
-          <w:instrText>PAGEREF _Toc242734614 \h</w:instrText>
+          <w:instrText>PAGEREF _Toc242740667 \h</w:instrText>
         </w:r>
         <w:r>
           <w:rPr>
@@ -3410,6 +3771,8 @@
             <w:b w:val="0"/>
             <w:noProof/>
             <w:webHidden/>
+            <w:szCs w:val="28"/>
+            <w:sz w:val="28"/>
             <w:bCs w:val="0"/>
           </w:rPr>
           <w:instrText xml:space="preserve"> </w:instrText>
@@ -3420,6 +3783,8 @@
             <w:b w:val="0"/>
             <w:noProof/>
             <w:webHidden/>
+            <w:szCs w:val="28"/>
+            <w:sz w:val="28"/>
             <w:bCs w:val="0"/>
           </w:rPr>
         </w:r>
@@ -3429,6 +3794,8 @@
             <w:b w:val="0"/>
             <w:noProof/>
             <w:webHidden/>
+            <w:szCs w:val="28"/>
+            <w:sz w:val="28"/>
             <w:bCs w:val="0"/>
           </w:rPr>
           <w:fldChar w:fldCharType="separate"/>
@@ -3439,6 +3806,8 @@
             <w:b w:val="0"/>
             <w:noProof/>
             <w:webHidden/>
+            <w:szCs w:val="28"/>
+            <w:sz w:val="28"/>
             <w:bCs w:val="0"/>
           </w:rPr>
           <w:t>9</w:t>
@@ -3449,6 +3818,8 @@
             <w:b w:val="0"/>
             <w:noProof/>
             <w:webHidden/>
+            <w:szCs w:val="28"/>
+            <w:sz w:val="28"/>
             <w:bCs w:val="0"/>
           </w:rPr>
           <w:fldChar w:fldCharType="end"/>
@@ -3466,11 +3837,12 @@
           <w:noProof/>
           <w:color w:val="auto"/>
           <w:kern w:val="2"/>
-          <w:sz w:val="22"/>
+          <w:szCs w:val="28"/>
           <w14:ligatures w14:val="standardContextual"/>
-        </w:rPr>
-      </w:pPr>
-      <w:hyperlink w:anchor="_Toc242734615" w:history="1">
+          <w:sz w:val="28"/>
+        </w:rPr>
+      </w:pPr>
+      <w:hyperlink w:anchor="_Toc242740668" w:history="1">
         <w:r>
           <w:rPr>
             <w:rStyle w:val="af"/>
@@ -3478,6 +3850,8 @@
             <w:b w:val="1"/>
             <w:bCs w:val="1"/>
             <w:noProof/>
+            <w:szCs w:val="28"/>
+            <w:sz w:val="28"/>
           </w:rPr>
           <w:t>附录</w:t>
         </w:r>
@@ -3488,6 +3862,8 @@
             <w:b w:val="1"/>
             <w:bCs w:val="1"/>
             <w:noProof/>
+            <w:szCs w:val="28"/>
+            <w:sz w:val="28"/>
           </w:rPr>
           <w:t xml:space="preserve"> A  </w:t>
         </w:r>
@@ -3498,6 +3874,8 @@
             <w:b w:val="1"/>
             <w:bCs w:val="1"/>
             <w:noProof/>
+            <w:szCs w:val="28"/>
+            <w:sz w:val="28"/>
           </w:rPr>
           <w:t>补充材料</w:t>
         </w:r>
@@ -3508,6 +3886,8 @@
             <w:bCs w:val="1"/>
             <w:noProof/>
             <w:webHidden/>
+            <w:szCs w:val="28"/>
+            <w:sz w:val="28"/>
           </w:rPr>
           <w:tab/>
         </w:r>
@@ -3517,6 +3897,8 @@
             <w:b w:val="0"/>
             <w:noProof/>
             <w:webHidden/>
+            <w:szCs w:val="28"/>
+            <w:sz w:val="28"/>
             <w:bCs w:val="0"/>
           </w:rPr>
           <w:fldChar w:fldCharType="begin"/>
@@ -3527,6 +3909,8 @@
             <w:b w:val="0"/>
             <w:noProof/>
             <w:webHidden/>
+            <w:szCs w:val="28"/>
+            <w:sz w:val="28"/>
             <w:bCs w:val="0"/>
           </w:rPr>
           <w:instrText xml:space="preserve"> </w:instrText>
@@ -3537,9 +3921,11 @@
             <w:b w:val="0"/>
             <w:noProof/>
             <w:webHidden/>
+            <w:szCs w:val="28"/>
+            <w:sz w:val="28"/>
             <w:bCs w:val="0"/>
           </w:rPr>
-          <w:instrText>PAGEREF _Toc242734615 \h</w:instrText>
+          <w:instrText>PAGEREF _Toc242740668 \h</w:instrText>
         </w:r>
         <w:r>
           <w:rPr>
@@ -3547,6 +3933,8 @@
             <w:b w:val="0"/>
             <w:noProof/>
             <w:webHidden/>
+            <w:szCs w:val="28"/>
+            <w:sz w:val="28"/>
             <w:bCs w:val="0"/>
           </w:rPr>
           <w:instrText xml:space="preserve"> </w:instrText>
@@ -3557,6 +3945,8 @@
             <w:b w:val="0"/>
             <w:noProof/>
             <w:webHidden/>
+            <w:szCs w:val="28"/>
+            <w:sz w:val="28"/>
             <w:bCs w:val="0"/>
           </w:rPr>
         </w:r>
@@ -3566,6 +3956,8 @@
             <w:b w:val="0"/>
             <w:noProof/>
             <w:webHidden/>
+            <w:szCs w:val="28"/>
+            <w:sz w:val="28"/>
             <w:bCs w:val="0"/>
           </w:rPr>
           <w:fldChar w:fldCharType="separate"/>
@@ -3576,6 +3968,8 @@
             <w:b w:val="0"/>
             <w:noProof/>
             <w:webHidden/>
+            <w:szCs w:val="28"/>
+            <w:sz w:val="28"/>
             <w:bCs w:val="0"/>
           </w:rPr>
           <w:t>11</w:t>
@@ -3586,6 +3980,8 @@
             <w:b w:val="0"/>
             <w:noProof/>
             <w:webHidden/>
+            <w:szCs w:val="28"/>
+            <w:sz w:val="28"/>
             <w:bCs w:val="0"/>
           </w:rPr>
           <w:fldChar w:fldCharType="end"/>
@@ -3603,11 +3999,12 @@
           <w:noProof/>
           <w:color w:val="auto"/>
           <w:kern w:val="2"/>
-          <w:sz w:val="22"/>
+          <w:szCs w:val="28"/>
           <w14:ligatures w14:val="standardContextual"/>
-        </w:rPr>
-      </w:pPr>
-      <w:hyperlink w:anchor="_Toc242734616" w:history="1">
+          <w:sz w:val="28"/>
+        </w:rPr>
+      </w:pPr>
+      <w:hyperlink w:anchor="_Toc242740669" w:history="1">
         <w:r>
           <w:rPr>
             <w:rStyle w:val="af"/>
@@ -3615,6 +4012,8 @@
             <w:b w:val="1"/>
             <w:bCs w:val="1"/>
             <w:noProof/>
+            <w:szCs w:val="28"/>
+            <w:sz w:val="28"/>
           </w:rPr>
           <w:t>参考文献</w:t>
         </w:r>
@@ -3625,6 +4024,8 @@
             <w:bCs w:val="1"/>
             <w:noProof/>
             <w:webHidden/>
+            <w:szCs w:val="28"/>
+            <w:sz w:val="28"/>
           </w:rPr>
           <w:tab/>
         </w:r>
@@ -3634,6 +4035,8 @@
             <w:b w:val="0"/>
             <w:noProof/>
             <w:webHidden/>
+            <w:szCs w:val="28"/>
+            <w:sz w:val="28"/>
             <w:bCs w:val="0"/>
           </w:rPr>
           <w:fldChar w:fldCharType="begin"/>
@@ -3644,6 +4047,8 @@
             <w:b w:val="0"/>
             <w:noProof/>
             <w:webHidden/>
+            <w:szCs w:val="28"/>
+            <w:sz w:val="28"/>
             <w:bCs w:val="0"/>
           </w:rPr>
           <w:instrText xml:space="preserve"> </w:instrText>
@@ -3654,9 +4059,11 @@
             <w:b w:val="0"/>
             <w:noProof/>
             <w:webHidden/>
+            <w:szCs w:val="28"/>
+            <w:sz w:val="28"/>
             <w:bCs w:val="0"/>
           </w:rPr>
-          <w:instrText>PAGEREF _Toc242734616 \h</w:instrText>
+          <w:instrText>PAGEREF _Toc242740669 \h</w:instrText>
         </w:r>
         <w:r>
           <w:rPr>
@@ -3664,6 +4071,8 @@
             <w:b w:val="0"/>
             <w:noProof/>
             <w:webHidden/>
+            <w:szCs w:val="28"/>
+            <w:sz w:val="28"/>
             <w:bCs w:val="0"/>
           </w:rPr>
           <w:instrText xml:space="preserve"> </w:instrText>
@@ -3674,6 +4083,8 @@
             <w:b w:val="0"/>
             <w:noProof/>
             <w:webHidden/>
+            <w:szCs w:val="28"/>
+            <w:sz w:val="28"/>
             <w:bCs w:val="0"/>
           </w:rPr>
         </w:r>
@@ -3683,6 +4094,8 @@
             <w:b w:val="0"/>
             <w:noProof/>
             <w:webHidden/>
+            <w:szCs w:val="28"/>
+            <w:sz w:val="28"/>
             <w:bCs w:val="0"/>
           </w:rPr>
           <w:fldChar w:fldCharType="separate"/>
@@ -3693,6 +4106,8 @@
             <w:b w:val="0"/>
             <w:noProof/>
             <w:webHidden/>
+            <w:szCs w:val="28"/>
+            <w:sz w:val="28"/>
             <w:bCs w:val="0"/>
           </w:rPr>
           <w:t>12</w:t>
@@ -3703,6 +4118,8 @@
             <w:b w:val="0"/>
             <w:noProof/>
             <w:webHidden/>
+            <w:szCs w:val="28"/>
+            <w:sz w:val="28"/>
             <w:bCs w:val="0"/>
           </w:rPr>
           <w:fldChar w:fldCharType="end"/>
@@ -3720,11 +4137,12 @@
           <w:noProof/>
           <w:color w:val="auto"/>
           <w:kern w:val="2"/>
-          <w:sz w:val="22"/>
+          <w:szCs w:val="28"/>
           <w14:ligatures w14:val="standardContextual"/>
-        </w:rPr>
-      </w:pPr>
-      <w:hyperlink w:anchor="_Toc242734617" w:history="1">
+          <w:sz w:val="28"/>
+        </w:rPr>
+      </w:pPr>
+      <w:hyperlink w:anchor="_Toc242740670" w:history="1">
         <w:r>
           <w:rPr>
             <w:rStyle w:val="af"/>
@@ -3732,6 +4150,8 @@
             <w:b w:val="1"/>
             <w:bCs w:val="1"/>
             <w:noProof/>
+            <w:szCs w:val="28"/>
+            <w:sz w:val="28"/>
           </w:rPr>
           <w:t>攻读博士学位期间的科研成果</w:t>
         </w:r>
@@ -3742,6 +4162,8 @@
             <w:bCs w:val="1"/>
             <w:noProof/>
             <w:webHidden/>
+            <w:szCs w:val="28"/>
+            <w:sz w:val="28"/>
           </w:rPr>
           <w:tab/>
         </w:r>
@@ -3751,6 +4173,8 @@
             <w:b w:val="0"/>
             <w:noProof/>
             <w:webHidden/>
+            <w:szCs w:val="28"/>
+            <w:sz w:val="28"/>
             <w:bCs w:val="0"/>
           </w:rPr>
           <w:fldChar w:fldCharType="begin"/>
@@ -3761,6 +4185,8 @@
             <w:b w:val="0"/>
             <w:noProof/>
             <w:webHidden/>
+            <w:szCs w:val="28"/>
+            <w:sz w:val="28"/>
             <w:bCs w:val="0"/>
           </w:rPr>
           <w:instrText xml:space="preserve"> </w:instrText>
@@ -3771,9 +4197,11 @@
             <w:b w:val="0"/>
             <w:noProof/>
             <w:webHidden/>
+            <w:szCs w:val="28"/>
+            <w:sz w:val="28"/>
             <w:bCs w:val="0"/>
           </w:rPr>
-          <w:instrText>PAGEREF _Toc242734617 \h</w:instrText>
+          <w:instrText>PAGEREF _Toc242740670 \h</w:instrText>
         </w:r>
         <w:r>
           <w:rPr>
@@ -3781,6 +4209,8 @@
             <w:b w:val="0"/>
             <w:noProof/>
             <w:webHidden/>
+            <w:szCs w:val="28"/>
+            <w:sz w:val="28"/>
             <w:bCs w:val="0"/>
           </w:rPr>
           <w:instrText xml:space="preserve"> </w:instrText>
@@ -3791,6 +4221,8 @@
             <w:b w:val="0"/>
             <w:noProof/>
             <w:webHidden/>
+            <w:szCs w:val="28"/>
+            <w:sz w:val="28"/>
             <w:bCs w:val="0"/>
           </w:rPr>
         </w:r>
@@ -3800,6 +4232,8 @@
             <w:b w:val="0"/>
             <w:noProof/>
             <w:webHidden/>
+            <w:szCs w:val="28"/>
+            <w:sz w:val="28"/>
             <w:bCs w:val="0"/>
           </w:rPr>
           <w:fldChar w:fldCharType="separate"/>
@@ -3810,6 +4244,8 @@
             <w:b w:val="0"/>
             <w:noProof/>
             <w:webHidden/>
+            <w:szCs w:val="28"/>
+            <w:sz w:val="28"/>
             <w:bCs w:val="0"/>
           </w:rPr>
           <w:t>13</w:t>
@@ -3820,6 +4256,8 @@
             <w:b w:val="0"/>
             <w:noProof/>
             <w:webHidden/>
+            <w:szCs w:val="28"/>
+            <w:sz w:val="28"/>
             <w:bCs w:val="0"/>
           </w:rPr>
           <w:fldChar w:fldCharType="end"/>
@@ -3837,11 +4275,12 @@
           <w:noProof/>
           <w:color w:val="auto"/>
           <w:kern w:val="2"/>
-          <w:sz w:val="22"/>
+          <w:szCs w:val="28"/>
           <w14:ligatures w14:val="standardContextual"/>
-        </w:rPr>
-      </w:pPr>
-      <w:hyperlink w:anchor="_Toc242734618" w:history="1">
+          <w:sz w:val="28"/>
+        </w:rPr>
+      </w:pPr>
+      <w:hyperlink w:anchor="_Toc242740671" w:history="1">
         <w:r>
           <w:rPr>
             <w:rStyle w:val="af"/>
@@ -3849,6 +4288,8 @@
             <w:b w:val="1"/>
             <w:bCs w:val="1"/>
             <w:noProof/>
+            <w:szCs w:val="28"/>
+            <w:sz w:val="28"/>
           </w:rPr>
           <w:t>致</w:t>
         </w:r>
@@ -3859,6 +4300,8 @@
             <w:b w:val="1"/>
             <w:bCs w:val="1"/>
             <w:noProof/>
+            <w:szCs w:val="28"/>
+            <w:sz w:val="28"/>
           </w:rPr>
           <w:t xml:space="preserve">  </w:t>
         </w:r>
@@ -3869,6 +4312,8 @@
             <w:b w:val="1"/>
             <w:bCs w:val="1"/>
             <w:noProof/>
+            <w:szCs w:val="28"/>
+            <w:sz w:val="28"/>
           </w:rPr>
           <w:t>谢</w:t>
         </w:r>
@@ -3879,6 +4324,8 @@
             <w:bCs w:val="1"/>
             <w:noProof/>
             <w:webHidden/>
+            <w:szCs w:val="28"/>
+            <w:sz w:val="28"/>
           </w:rPr>
           <w:tab/>
         </w:r>
@@ -3888,6 +4335,8 @@
             <w:b w:val="0"/>
             <w:noProof/>
             <w:webHidden/>
+            <w:szCs w:val="28"/>
+            <w:sz w:val="28"/>
             <w:bCs w:val="0"/>
           </w:rPr>
           <w:fldChar w:fldCharType="begin"/>
@@ -3898,6 +4347,8 @@
             <w:b w:val="0"/>
             <w:noProof/>
             <w:webHidden/>
+            <w:szCs w:val="28"/>
+            <w:sz w:val="28"/>
             <w:bCs w:val="0"/>
           </w:rPr>
           <w:instrText xml:space="preserve"> </w:instrText>
@@ -3908,9 +4359,11 @@
             <w:b w:val="0"/>
             <w:noProof/>
             <w:webHidden/>
+            <w:szCs w:val="28"/>
+            <w:sz w:val="28"/>
             <w:bCs w:val="0"/>
           </w:rPr>
-          <w:instrText>PAGEREF _Toc242734618 \h</w:instrText>
+          <w:instrText>PAGEREF _Toc242740671 \h</w:instrText>
         </w:r>
         <w:r>
           <w:rPr>
@@ -3918,6 +4371,8 @@
             <w:b w:val="0"/>
             <w:noProof/>
             <w:webHidden/>
+            <w:szCs w:val="28"/>
+            <w:sz w:val="28"/>
             <w:bCs w:val="0"/>
           </w:rPr>
           <w:instrText xml:space="preserve"> </w:instrText>
@@ -3928,6 +4383,8 @@
             <w:b w:val="0"/>
             <w:noProof/>
             <w:webHidden/>
+            <w:szCs w:val="28"/>
+            <w:sz w:val="28"/>
             <w:bCs w:val="0"/>
           </w:rPr>
         </w:r>
@@ -3937,6 +4394,8 @@
             <w:b w:val="0"/>
             <w:noProof/>
             <w:webHidden/>
+            <w:szCs w:val="28"/>
+            <w:sz w:val="28"/>
             <w:bCs w:val="0"/>
           </w:rPr>
           <w:fldChar w:fldCharType="separate"/>
@@ -3947,6 +4406,8 @@
             <w:b w:val="0"/>
             <w:noProof/>
             <w:webHidden/>
+            <w:szCs w:val="28"/>
+            <w:sz w:val="28"/>
             <w:bCs w:val="0"/>
           </w:rPr>
           <w:t>14</w:t>
@@ -3957,6 +4418,8 @@
             <w:b w:val="0"/>
             <w:noProof/>
             <w:webHidden/>
+            <w:szCs w:val="28"/>
+            <w:sz w:val="28"/>
             <w:bCs w:val="0"/>
           </w:rPr>
           <w:fldChar w:fldCharType="end"/>
@@ -3988,15 +4451,24 @@
         <w:pStyle w:val="1"/>
         <w:pageBreakBefore w:val="0"/>
       </w:pPr>
-      <w:bookmarkStart w:id="4" w:name="_Toc242734602"/>
-      <w:r>
+      <w:bookmarkStart w:id="4" w:name="_Toc242740655"/>
+      <w:r>
+        <w:rPr>
+          <w:rFonts w:eastAsia="SimHei" w:ascii="Times New Roman" w:hAnsi="Times New Roman"/>
+        </w:rPr>
         <w:lastRenderedPageBreak/>
         <w:t>第一章</w:t>
       </w:r>
       <w:r>
+        <w:rPr>
+          <w:rFonts w:eastAsia="SimHei" w:ascii="Times New Roman" w:hAnsi="Times New Roman"/>
+        </w:rPr>
         <w:t xml:space="preserve">  </w:t>
       </w:r>
       <w:r>
+        <w:rPr>
+          <w:rFonts w:eastAsia="SimHei" w:ascii="Times New Roman" w:hAnsi="Times New Roman"/>
+        </w:rPr>
         <w:t>绪论</w:t>
       </w:r>
       <w:bookmarkEnd w:id="4"/>
@@ -4005,12 +4477,18 @@
       <w:pPr>
         <w:pStyle w:val="2"/>
       </w:pPr>
-      <w:bookmarkStart w:id="5" w:name="_Toc242734603"/>
+      <w:bookmarkStart w:id="5" w:name="_Toc242740656"/>
       <w:bookmarkStart w:id="6" w:name="研究背景与意义"/>
       <w:r>
+        <w:rPr>
+          <w:rFonts w:eastAsia="SimHei" w:ascii="Times New Roman" w:hAnsi="Times New Roman"/>
+        </w:rPr>
         <w:t xml:space="preserve">1.1  </w:t>
       </w:r>
       <w:r>
+        <w:rPr>
+          <w:rFonts w:eastAsia="SimHei" w:ascii="Times New Roman" w:hAnsi="Times New Roman"/>
+        </w:rPr>
         <w:t>研究背景与意义</w:t>
       </w:r>
       <w:bookmarkEnd w:id="5"/>
@@ -4019,12 +4497,18 @@
       <w:pPr>
         <w:pStyle w:val="3"/>
       </w:pPr>
-      <w:bookmarkStart w:id="7" w:name="_Toc242734604"/>
+      <w:bookmarkStart w:id="7" w:name="_Toc242740657"/>
       <w:bookmarkStart w:id="8" w:name="研究背景"/>
       <w:r>
+        <w:rPr>
+          <w:rFonts w:eastAsia="SimHei" w:ascii="Times New Roman" w:hAnsi="Times New Roman"/>
+        </w:rPr>
         <w:t xml:space="preserve">1.1.1  </w:t>
       </w:r>
       <w:r>
+        <w:rPr>
+          <w:rFonts w:eastAsia="SimHei" w:ascii="Times New Roman" w:hAnsi="Times New Roman"/>
+        </w:rPr>
         <w:t>研究背景</w:t>
       </w:r>
       <w:bookmarkEnd w:id="7"/>
@@ -4140,13 +4624,19 @@
       <w:pPr>
         <w:pStyle w:val="3"/>
       </w:pPr>
-      <w:bookmarkStart w:id="9" w:name="_Toc242734605"/>
+      <w:bookmarkStart w:id="9" w:name="_Toc242740658"/>
       <w:bookmarkStart w:id="10" w:name="研究意义"/>
       <w:bookmarkEnd w:id="8"/>
       <w:r>
+        <w:rPr>
+          <w:rFonts w:eastAsia="SimHei" w:ascii="Times New Roman" w:hAnsi="Times New Roman"/>
+        </w:rPr>
         <w:t xml:space="preserve">1.1.2  </w:t>
       </w:r>
       <w:r>
+        <w:rPr>
+          <w:rFonts w:eastAsia="SimHei" w:ascii="Times New Roman" w:hAnsi="Times New Roman"/>
+        </w:rPr>
         <w:t>研究意义</w:t>
       </w:r>
       <w:bookmarkEnd w:id="9"/>
@@ -4162,7 +4652,6 @@
         </w:rPr>
         <w:t>模板中的公式、图片、表格均按章编号，并支持交叉引用。式</w:t>
       </w:r>
-      <w:r/>
       <w:hyperlink w:anchor="eq:model">
         <w:r>
           <w:rPr>
@@ -4197,7 +4686,7 @@
         <w:rPr>
           <w:position w:val="-28"/>
         </w:rPr>
-        <w:object w:dxaOrig="2680" w:dyaOrig="680" w14:anchorId="3AD5F081">
+        <w:object w:dxaOrig="2680" w:dyaOrig="680" w14:anchorId="69F074F9">
           <v:shapetype id="_x0000_t75" coordsize="21600,21600" o:spt="75" o:preferrelative="t" path="m@4@5l@4@11@9@11@9@5xe" filled="f" stroked="f">
             <v:stroke joinstyle="miter"/>
             <v:formulas>
@@ -4220,7 +4709,7 @@
           <v:shape id="_x0000_mtshape0" o:spid="_x0000_i1025" type="#_x0000_t75" style="width:134.15pt;height:33.85pt" o:ole="">
             <v:imagedata r:id="rId25" o:title=""/>
           </v:shape>
-          <o:OLEObject Type="Embed" ProgID="Equation.DSMT4" ShapeID="_x0000_mtshape0" DrawAspect="Content" ObjectID="_1853347364" r:id="rId26"/>
+          <o:OLEObject Type="Embed" ProgID="Equation.DSMT4" ShapeID="_x0000_mtshape0" DrawAspect="Content" ObjectID="_1853353489" r:id="rId26"/>
         </w:object>
       </w:r>
       <w:r>
@@ -4242,7 +4731,7 @@
           <w:noProof/>
         </w:rPr>
         <w:drawing>
-          <wp:inline distT="0" distB="0" distL="0" distR="0" wp14:anchorId="15AF485E" wp14:editId="0078057C">
+          <wp:inline distT="0" distB="0" distL="0" distR="0" wp14:anchorId="4B7BE0EC" wp14:editId="6A709C37">
             <wp:extent cx="3588807" cy="2063027"/>
             <wp:effectExtent l="0" t="0" r="0" b="0"/>
             <wp:docPr id="16" name="Picture"/>
@@ -4323,7 +4812,6 @@
         </w:rPr>
         <w:t>图</w:t>
       </w:r>
-      <w:r/>
       <w:hyperlink w:anchor="fig:vector">
         <w:r>
           <w:rPr>
@@ -4367,14 +4855,20 @@
       <w:pPr>
         <w:pStyle w:val="2"/>
       </w:pPr>
-      <w:bookmarkStart w:id="13" w:name="_Toc242734606"/>
+      <w:bookmarkStart w:id="13" w:name="_Toc242740659"/>
       <w:bookmarkStart w:id="14" w:name="研究内容与技术路线"/>
       <w:bookmarkEnd w:id="6"/>
       <w:bookmarkEnd w:id="10"/>
       <w:r>
+        <w:rPr>
+          <w:rFonts w:eastAsia="SimHei" w:ascii="Times New Roman" w:hAnsi="Times New Roman"/>
+        </w:rPr>
         <w:t xml:space="preserve">1.2  </w:t>
       </w:r>
       <w:r>
+        <w:rPr>
+          <w:rFonts w:eastAsia="SimHei" w:ascii="Times New Roman" w:hAnsi="Times New Roman"/>
+        </w:rPr>
         <w:t>研究内容与技术路线</w:t>
       </w:r>
       <w:bookmarkEnd w:id="13"/>
@@ -4423,11 +4917,11 @@
         <w:rPr>
           <w:position w:val="-12"/>
         </w:rPr>
-        <w:object w:dxaOrig="240" w:dyaOrig="360" w14:anchorId="09D2D927">
+        <w:object w:dxaOrig="240" w:dyaOrig="360" w14:anchorId="17DCCD40">
           <v:shape id="_x0000_mtshape1" o:spid="_x0000_i1026" type="#_x0000_t75" style="width:12pt;height:18pt" o:ole="">
             <v:imagedata r:id="rId28" o:title=""/>
           </v:shape>
-          <o:OLEObject Type="Embed" ProgID="Equation.DSMT4" ShapeID="_x0000_mtshape1" DrawAspect="Content" ObjectID="_1853347365" r:id="rId29"/>
+          <o:OLEObject Type="Embed" ProgID="Equation.DSMT4" ShapeID="_x0000_mtshape1" DrawAspect="Content" ObjectID="_1853353490" r:id="rId29"/>
         </w:object>
       </w:r>
       <w:r>
@@ -4540,11 +5034,11 @@
         <w:rPr>
           <w:position w:val="-12"/>
         </w:rPr>
-        <w:object w:dxaOrig="1480" w:dyaOrig="360" w14:anchorId="3E63363E">
+        <w:object w:dxaOrig="1480" w:dyaOrig="360" w14:anchorId="0F16EEB9">
           <v:shape id="_x0000_mtshape2" o:spid="_x0000_i1027" type="#_x0000_t75" style="width:74.15pt;height:18pt" o:ole="">
             <v:imagedata r:id="rId30" o:title=""/>
           </v:shape>
-          <o:OLEObject Type="Embed" ProgID="Equation.DSMT4" ShapeID="_x0000_mtshape2" DrawAspect="Content" ObjectID="_1853347366" r:id="rId31"/>
+          <o:OLEObject Type="Embed" ProgID="Equation.DSMT4" ShapeID="_x0000_mtshape2" DrawAspect="Content" ObjectID="_1853353491" r:id="rId31"/>
         </w:object>
       </w:r>
       <w:r>
@@ -4553,7 +5047,6 @@
         </w:rPr>
         <w:t>，样本均值和离散程度分别由式</w:t>
       </w:r>
-      <w:r/>
       <w:hyperlink w:anchor="eq:mean">
         <w:r>
           <w:rPr>
@@ -4568,7 +5061,6 @@
         </w:rPr>
         <w:t>与式</w:t>
       </w:r>
-      <w:r/>
       <w:hyperlink w:anchor="eq:variance">
         <w:r>
           <w:rPr>
@@ -4612,11 +5104,11 @@
         <w:rPr>
           <w:position w:val="-28"/>
         </w:rPr>
-        <w:object w:dxaOrig="1180" w:dyaOrig="680" w14:anchorId="0F1C645A">
+        <w:object w:dxaOrig="1180" w:dyaOrig="680" w14:anchorId="0FC2D727">
           <v:shape id="_x0000_mtshape3" o:spid="_x0000_i1028" type="#_x0000_t75" style="width:59.15pt;height:33.85pt" o:ole="">
             <v:imagedata r:id="rId32" o:title=""/>
           </v:shape>
-          <o:OLEObject Type="Embed" ProgID="Equation.DSMT4" ShapeID="_x0000_mtshape3" DrawAspect="Content" ObjectID="_1853347367" r:id="rId33"/>
+          <o:OLEObject Type="Embed" ProgID="Equation.DSMT4" ShapeID="_x0000_mtshape3" DrawAspect="Content" ObjectID="_1853353492" r:id="rId33"/>
         </w:object>
       </w:r>
       <w:r>
@@ -4643,11 +5135,11 @@
         <w:rPr>
           <w:position w:val="-28"/>
         </w:rPr>
-        <w:object w:dxaOrig="2120" w:dyaOrig="680" w14:anchorId="203518CA">
+        <w:object w:dxaOrig="2120" w:dyaOrig="680" w14:anchorId="6AFFBF03">
           <v:shape id="_x0000_mtshape4" o:spid="_x0000_i1029" type="#_x0000_t75" style="width:105.85pt;height:33.85pt" o:ole="">
             <v:imagedata r:id="rId34" o:title=""/>
           </v:shape>
-          <o:OLEObject Type="Embed" ProgID="Equation.DSMT4" ShapeID="_x0000_mtshape4" DrawAspect="Content" ObjectID="_1853347368" r:id="rId35"/>
+          <o:OLEObject Type="Embed" ProgID="Equation.DSMT4" ShapeID="_x0000_mtshape4" DrawAspect="Content" ObjectID="_1853353493" r:id="rId35"/>
         </w:object>
       </w:r>
       <w:r>
@@ -4670,7 +5162,7 @@
           <w:noProof/>
         </w:rPr>
         <w:drawing>
-          <wp:inline distT="0" distB="0" distL="0" distR="0" wp14:anchorId="17771687" wp14:editId="4EA80086">
+          <wp:inline distT="0" distB="0" distL="0" distR="0" wp14:anchorId="7D25EC0D" wp14:editId="32DDBB84">
             <wp:extent cx="3958243" cy="1868290"/>
             <wp:effectExtent l="0" t="0" r="0" b="0"/>
             <wp:docPr id="24" name="Picture"/>
@@ -4751,7 +5243,6 @@
         </w:rPr>
         <w:t>图</w:t>
       </w:r>
-      <w:r/>
       <w:hyperlink w:anchor="fig:abcd">
         <w:r>
           <w:rPr>
@@ -5221,7 +5712,6 @@
         </w:rPr>
         <w:t>排版检查不仅关注单一页面，也需要覆盖跨页段落、章节切换和重复引用。表</w:t>
       </w:r>
-      <w:r/>
       <w:hyperlink w:anchor="tab:scenarios">
         <w:r>
           <w:rPr>
@@ -5276,15 +5766,24 @@
       <w:pPr>
         <w:pStyle w:val="1"/>
       </w:pPr>
-      <w:bookmarkStart w:id="20" w:name="_Toc242734607"/>
-      <w:r>
+      <w:bookmarkStart w:id="20" w:name="_Toc242740660"/>
+      <w:r>
+        <w:rPr>
+          <w:rFonts w:eastAsia="SimHei" w:ascii="Times New Roman" w:hAnsi="Times New Roman"/>
+        </w:rPr>
         <w:lastRenderedPageBreak/>
         <w:t>第二章</w:t>
       </w:r>
       <w:r>
+        <w:rPr>
+          <w:rFonts w:eastAsia="SimHei" w:ascii="Times New Roman" w:hAnsi="Times New Roman"/>
+        </w:rPr>
         <w:t xml:space="preserve">  </w:t>
       </w:r>
       <w:r>
+        <w:rPr>
+          <w:rFonts w:eastAsia="SimHei" w:ascii="Times New Roman" w:hAnsi="Times New Roman"/>
+        </w:rPr>
         <w:t>理论基础与方法</w:t>
       </w:r>
       <w:bookmarkEnd w:id="20"/>
@@ -5293,12 +5792,18 @@
       <w:pPr>
         <w:pStyle w:val="2"/>
       </w:pPr>
-      <w:bookmarkStart w:id="21" w:name="_Toc242734608"/>
+      <w:bookmarkStart w:id="21" w:name="_Toc242740661"/>
       <w:bookmarkStart w:id="22" w:name="基本理论"/>
       <w:r>
+        <w:rPr>
+          <w:rFonts w:eastAsia="SimHei" w:ascii="Times New Roman" w:hAnsi="Times New Roman"/>
+        </w:rPr>
         <w:t xml:space="preserve">2.1  </w:t>
       </w:r>
       <w:r>
+        <w:rPr>
+          <w:rFonts w:eastAsia="SimHei" w:ascii="Times New Roman" w:hAnsi="Times New Roman"/>
+        </w:rPr>
         <w:t>基本理论</w:t>
       </w:r>
       <w:bookmarkEnd w:id="21"/>
@@ -5510,17 +6015,12 @@
               <w:rPr>
                 <w:position w:val="-10"/>
               </w:rPr>
-              <w:object w:dxaOrig="279" w:dyaOrig="360" w14:anchorId="26D4BCDD">
+              <w:object w:dxaOrig="279" w:dyaOrig="360" w14:anchorId="48E92F3A">
                 <v:shape id="_x0000_mtshape5" o:spid="_x0000_i1030" type="#_x0000_t75" style="width:12pt;height:15.85pt" o:ole="">
                   <v:imagedata r:id="rId41" o:title=""/>
                 </v:shape>
-                <o:OLEObject Type="Embed" ProgID="Equation.DSMT4" ShapeID="_x0000_mtshape5" DrawAspect="Content" ObjectID="_1853347369" r:id="rId42"/>
+                <o:OLEObject Type="Embed" ProgID="Equation.DSMT4" ShapeID="_x0000_mtshape5" DrawAspect="Content" ObjectID="_1853353494" r:id="rId42"/>
               </w:object>
-            </w:r>
-            <w:r>
-              <w:rPr>
-                <w:sz w:val="21"/>
-              </w:rPr>
             </w:r>
           </w:p>
         </w:tc>
@@ -5605,17 +6105,12 @@
               <w:rPr>
                 <w:position w:val="-5"/>
               </w:rPr>
-              <w:object w:dxaOrig="200" w:dyaOrig="220" w14:anchorId="58747417">
+              <w:object w:dxaOrig="200" w:dyaOrig="220" w14:anchorId="60567C6E">
                 <v:shape id="_x0000_mtshape6" o:spid="_x0000_i1031" type="#_x0000_t75" style="width:9pt;height:9.85pt" o:ole="">
                   <v:imagedata r:id="rId43" o:title=""/>
                 </v:shape>
-                <o:OLEObject Type="Embed" ProgID="Equation.DSMT4" ShapeID="_x0000_mtshape6" DrawAspect="Content" ObjectID="_1853347370" r:id="rId44"/>
+                <o:OLEObject Type="Embed" ProgID="Equation.DSMT4" ShapeID="_x0000_mtshape6" DrawAspect="Content" ObjectID="_1853353495" r:id="rId44"/>
               </w:object>
-            </w:r>
-            <w:r>
-              <w:rPr>
-                <w:sz w:val="21"/>
-              </w:rPr>
             </w:r>
           </w:p>
         </w:tc>
@@ -5650,14 +6145,20 @@
       <w:pPr>
         <w:pStyle w:val="2"/>
       </w:pPr>
-      <w:bookmarkStart w:id="24" w:name="_Toc242734609"/>
+      <w:bookmarkStart w:id="24" w:name="_Toc242740662"/>
       <w:bookmarkStart w:id="25" w:name="模型表示与计算步骤"/>
       <w:bookmarkEnd w:id="22"/>
       <w:bookmarkEnd w:id="23"/>
       <w:r>
+        <w:rPr>
+          <w:rFonts w:eastAsia="SimHei" w:ascii="Times New Roman" w:hAnsi="Times New Roman"/>
+        </w:rPr>
         <w:t xml:space="preserve">2.2  </w:t>
       </w:r>
       <w:r>
+        <w:rPr>
+          <w:rFonts w:eastAsia="SimHei" w:ascii="Times New Roman" w:hAnsi="Times New Roman"/>
+        </w:rPr>
         <w:t>模型表示与计算步骤</w:t>
       </w:r>
       <w:bookmarkEnd w:id="24"/>
@@ -5674,7 +6175,6 @@
         </w:rPr>
         <w:t>在统一的图结构中，邻接矩阵记录节点间的连接关系。式</w:t>
       </w:r>
-      <w:r/>
       <w:hyperlink w:anchor="eq:matrix">
         <w:r>
           <w:rPr>
@@ -5689,7 +6189,6 @@
         </w:rPr>
         <w:t>给出一个三节点示例，其非零元素用于说明矩阵排版和下标的位置。表</w:t>
       </w:r>
-      <w:r/>
       <w:hyperlink w:anchor="tab:params">
         <w:r>
           <w:rPr>
@@ -5838,11 +6337,11 @@
         <w:rPr>
           <w:position w:val="-50"/>
         </w:rPr>
-        <w:object w:dxaOrig="3060" w:dyaOrig="1120" w14:anchorId="79DBF864">
+        <w:object w:dxaOrig="3060" w:dyaOrig="1120" w14:anchorId="72444401">
           <v:shape id="_x0000_mtshape7" o:spid="_x0000_i1032" type="#_x0000_t75" style="width:153pt;height:56.15pt" o:ole="">
             <v:imagedata r:id="rId45" o:title=""/>
           </v:shape>
-          <o:OLEObject Type="Embed" ProgID="Equation.DSMT4" ShapeID="_x0000_mtshape7" DrawAspect="Content" ObjectID="_1853347371" r:id="rId46"/>
+          <o:OLEObject Type="Embed" ProgID="Equation.DSMT4" ShapeID="_x0000_mtshape7" DrawAspect="Content" ObjectID="_1853353496" r:id="rId46"/>
         </w:object>
       </w:r>
       <w:r>
@@ -5880,11 +6379,11 @@
         <w:rPr>
           <w:position w:val="-18"/>
         </w:rPr>
-        <w:object w:dxaOrig="3320" w:dyaOrig="520" w14:anchorId="34304D29">
+        <w:object w:dxaOrig="3320" w:dyaOrig="520" w14:anchorId="0E914103">
           <v:shape id="_x0000_mtshape8" o:spid="_x0000_i1033" type="#_x0000_t75" style="width:165.85pt;height:26.15pt" o:ole="">
             <v:imagedata r:id="rId47" o:title=""/>
           </v:shape>
-          <o:OLEObject Type="Embed" ProgID="Equation.DSMT4" ShapeID="_x0000_mtshape8" DrawAspect="Content" ObjectID="_1853347372" r:id="rId48"/>
+          <o:OLEObject Type="Embed" ProgID="Equation.DSMT4" ShapeID="_x0000_mtshape8" DrawAspect="Content" ObjectID="_1853353497" r:id="rId48"/>
         </w:object>
       </w:r>
       <w:r>
@@ -5908,7 +6407,7 @@
         </w:rPr>
         <w:lastRenderedPageBreak/>
         <w:drawing>
-          <wp:inline distT="0" distB="0" distL="0" distR="0" wp14:anchorId="1E2904F6" wp14:editId="26B01F4B">
+          <wp:inline distT="0" distB="0" distL="0" distR="0" wp14:anchorId="7F6F761D" wp14:editId="72133B75">
             <wp:extent cx="3958243" cy="1868290"/>
             <wp:effectExtent l="0" t="0" r="0" b="0"/>
             <wp:docPr id="35" name="Picture"/>
@@ -5989,7 +6488,6 @@
         </w:rPr>
         <w:t>图</w:t>
       </w:r>
-      <w:r/>
       <w:hyperlink w:anchor="fig:six">
         <w:r>
           <w:rPr>
@@ -6042,7 +6540,6 @@
         </w:rPr>
         <w:t>算法首先读取数据并计算式</w:t>
       </w:r>
-      <w:r/>
       <w:hyperlink w:anchor="eq:matrix">
         <w:r>
           <w:rPr>
@@ -6057,7 +6554,6 @@
         </w:rPr>
         <w:t>中的节点度，然后根据式</w:t>
       </w:r>
-      <w:r/>
       <w:hyperlink w:anchor="eq:integral">
         <w:r>
           <w:rPr>
@@ -6165,15 +6661,24 @@
       <w:pPr>
         <w:pStyle w:val="1"/>
       </w:pPr>
-      <w:bookmarkStart w:id="30" w:name="_Toc242734610"/>
-      <w:r>
+      <w:bookmarkStart w:id="30" w:name="_Toc242740663"/>
+      <w:r>
+        <w:rPr>
+          <w:rFonts w:eastAsia="SimHei" w:ascii="Times New Roman" w:hAnsi="Times New Roman"/>
+        </w:rPr>
         <w:lastRenderedPageBreak/>
         <w:t>第三章</w:t>
       </w:r>
       <w:r>
+        <w:rPr>
+          <w:rFonts w:eastAsia="SimHei" w:ascii="Times New Roman" w:hAnsi="Times New Roman"/>
+        </w:rPr>
         <w:t xml:space="preserve">  </w:t>
       </w:r>
       <w:r>
+        <w:rPr>
+          <w:rFonts w:eastAsia="SimHei" w:ascii="Times New Roman" w:hAnsi="Times New Roman"/>
+        </w:rPr>
         <w:t>模型构建与结果分析</w:t>
       </w:r>
       <w:bookmarkEnd w:id="30"/>
@@ -6182,12 +6687,18 @@
       <w:pPr>
         <w:pStyle w:val="2"/>
       </w:pPr>
-      <w:bookmarkStart w:id="31" w:name="_Toc242734611"/>
+      <w:bookmarkStart w:id="31" w:name="_Toc242740664"/>
       <w:bookmarkStart w:id="32" w:name="模型构建"/>
       <w:r>
+        <w:rPr>
+          <w:rFonts w:eastAsia="SimHei" w:ascii="Times New Roman" w:hAnsi="Times New Roman"/>
+        </w:rPr>
         <w:t xml:space="preserve">3.1  </w:t>
       </w:r>
       <w:r>
+        <w:rPr>
+          <w:rFonts w:eastAsia="SimHei" w:ascii="Times New Roman" w:hAnsi="Times New Roman"/>
+        </w:rPr>
         <w:t>模型构建</w:t>
       </w:r>
       <w:bookmarkEnd w:id="31"/>
@@ -6222,11 +6733,11 @@
         <w:rPr>
           <w:position w:val="-4"/>
         </w:rPr>
-        <w:object w:dxaOrig="200" w:dyaOrig="200" w14:anchorId="269B8CAA">
+        <w:object w:dxaOrig="200" w:dyaOrig="200" w14:anchorId="789D419B">
           <v:shape id="_x0000_mtshape9" o:spid="_x0000_i1034" type="#_x0000_t75" style="width:9.85pt;height:9.85pt" o:ole="">
             <v:imagedata r:id="rId54" o:title=""/>
           </v:shape>
-          <o:OLEObject Type="Embed" ProgID="Equation.DSMT4" ShapeID="_x0000_mtshape9" DrawAspect="Content" ObjectID="_1853347373" r:id="rId55"/>
+          <o:OLEObject Type="Embed" ProgID="Equation.DSMT4" ShapeID="_x0000_mtshape9" DrawAspect="Content" ObjectID="_1853353498" r:id="rId55"/>
         </w:object>
       </w:r>
       <w:r>
@@ -6235,7 +6746,6 @@
         </w:rPr>
         <w:t>，目标同时考虑误差与正则项。式</w:t>
       </w:r>
-      <w:r/>
       <w:hyperlink w:anchor="eq:objective">
         <w:r>
           <w:rPr>
@@ -6250,7 +6760,6 @@
         </w:rPr>
         <w:t>中出现二范数、转置和分式，式</w:t>
       </w:r>
-      <w:r/>
       <w:hyperlink w:anchor="eq:constraints">
         <w:r>
           <w:rPr>
@@ -6309,11 +6818,11 @@
         <w:rPr>
           <w:position w:val="-24"/>
         </w:rPr>
-        <w:object w:dxaOrig="2640" w:dyaOrig="620" w14:anchorId="5EEADE76">
+        <w:object w:dxaOrig="2640" w:dyaOrig="620" w14:anchorId="7186D488">
           <v:shape id="_x0000_mtshape10" o:spid="_x0000_i1035" type="#_x0000_t75" style="width:132pt;height:30.85pt" o:ole="">
             <v:imagedata r:id="rId56" o:title=""/>
           </v:shape>
-          <o:OLEObject Type="Embed" ProgID="Equation.DSMT4" ShapeID="_x0000_mtshape10" DrawAspect="Content" ObjectID="_1853347374" r:id="rId57"/>
+          <o:OLEObject Type="Embed" ProgID="Equation.DSMT4" ShapeID="_x0000_mtshape10" DrawAspect="Content" ObjectID="_1853353499" r:id="rId57"/>
         </w:object>
       </w:r>
       <w:r>
@@ -6340,11 +6849,11 @@
         <w:rPr>
           <w:position w:val="-46"/>
         </w:rPr>
-        <w:object w:dxaOrig="2320" w:dyaOrig="1040" w14:anchorId="543FB8C9">
+        <w:object w:dxaOrig="2320" w:dyaOrig="1040" w14:anchorId="00218F6D">
           <v:shape id="_x0000_mtshape11" o:spid="_x0000_i1036" type="#_x0000_t75" style="width:125.15pt;height:51.85pt" o:ole="">
             <v:imagedata r:id="rId58" o:title=""/>
           </v:shape>
-          <o:OLEObject Type="Embed" ProgID="Equation.DSMT4" ShapeID="_x0000_mtshape11" DrawAspect="Content" ObjectID="_1853347375" r:id="rId59"/>
+          <o:OLEObject Type="Embed" ProgID="Equation.DSMT4" ShapeID="_x0000_mtshape11" DrawAspect="Content" ObjectID="_1853353500" r:id="rId59"/>
         </w:object>
       </w:r>
       <w:r>
@@ -6356,15 +6865,21 @@
       <w:pPr>
         <w:pStyle w:val="2"/>
       </w:pPr>
-      <w:bookmarkStart w:id="35" w:name="_Toc242734612"/>
+      <w:bookmarkStart w:id="35" w:name="_Toc242740665"/>
       <w:bookmarkStart w:id="36" w:name="实验设计与结果比较"/>
       <w:bookmarkEnd w:id="32"/>
       <w:bookmarkEnd w:id="33"/>
       <w:bookmarkEnd w:id="34"/>
       <w:r>
+        <w:rPr>
+          <w:rFonts w:eastAsia="SimHei" w:ascii="Times New Roman" w:hAnsi="Times New Roman"/>
+        </w:rPr>
         <w:t xml:space="preserve">3.2  </w:t>
       </w:r>
       <w:r>
+        <w:rPr>
+          <w:rFonts w:eastAsia="SimHei" w:ascii="Times New Roman" w:hAnsi="Times New Roman"/>
+        </w:rPr>
         <w:t>实验设计与结果比较</w:t>
       </w:r>
       <w:bookmarkEnd w:id="35"/>
@@ -6900,7 +7415,7 @@
           <w:noProof/>
         </w:rPr>
         <w:drawing>
-          <wp:inline distT="0" distB="0" distL="0" distR="0" wp14:anchorId="4DAD567D" wp14:editId="0DDBD5E0">
+          <wp:inline distT="0" distB="0" distL="0" distR="0" wp14:anchorId="66DCDA55" wp14:editId="41B0DF32">
             <wp:extent cx="4486006" cy="3623313"/>
             <wp:effectExtent l="0" t="0" r="0" b="0"/>
             <wp:docPr id="45" name="Picture"/>
@@ -6988,7 +7503,6 @@
         </w:rPr>
         <w:t>表</w:t>
       </w:r>
-      <w:r/>
       <w:hyperlink w:anchor="tab:results">
         <w:r>
           <w:rPr>
@@ -7003,7 +7517,6 @@
         </w:rPr>
         <w:t>的结果仅用于验证显示格式；图</w:t>
       </w:r>
-      <w:r/>
       <w:hyperlink w:anchor="fig:single">
         <w:r>
           <w:rPr>
@@ -7069,7 +7582,6 @@
         </w:rPr>
         <w:t>图</w:t>
       </w:r>
-      <w:r/>
       <w:hyperlink w:anchor="fig:abcd">
         <w:r>
           <w:rPr>
@@ -7093,7 +7605,6 @@
         </w:rPr>
         <w:t>图</w:t>
       </w:r>
-      <w:r/>
       <w:hyperlink w:anchor="fig:six">
         <w:r>
           <w:rPr>
@@ -7266,13 +7777,19 @@
       <w:pPr>
         <w:pStyle w:val="2"/>
       </w:pPr>
-      <w:bookmarkStart w:id="39" w:name="_Toc242734613"/>
+      <w:bookmarkStart w:id="39" w:name="_Toc242740666"/>
       <w:bookmarkStart w:id="40" w:name="本章小结"/>
       <w:bookmarkEnd w:id="36"/>
       <w:r>
+        <w:rPr>
+          <w:rFonts w:eastAsia="SimHei" w:ascii="Times New Roman" w:hAnsi="Times New Roman"/>
+        </w:rPr>
         <w:t xml:space="preserve">3.3  </w:t>
       </w:r>
       <w:r>
+        <w:rPr>
+          <w:rFonts w:eastAsia="SimHei" w:ascii="Times New Roman" w:hAnsi="Times New Roman"/>
+        </w:rPr>
         <w:t>本章小结</w:t>
       </w:r>
       <w:bookmarkEnd w:id="39"/>
@@ -7320,15 +7837,24 @@
       <w:pPr>
         <w:pStyle w:val="1"/>
       </w:pPr>
-      <w:bookmarkStart w:id="42" w:name="_Toc242734614"/>
-      <w:r>
+      <w:bookmarkStart w:id="42" w:name="_Toc242740667"/>
+      <w:r>
+        <w:rPr>
+          <w:rFonts w:eastAsia="SimHei" w:ascii="Times New Roman" w:hAnsi="Times New Roman"/>
+        </w:rPr>
         <w:lastRenderedPageBreak/>
         <w:t>第四章</w:t>
       </w:r>
       <w:r>
+        <w:rPr>
+          <w:rFonts w:eastAsia="SimHei" w:ascii="Times New Roman" w:hAnsi="Times New Roman"/>
+        </w:rPr>
         <w:t xml:space="preserve">  </w:t>
       </w:r>
       <w:r>
+        <w:rPr>
+          <w:rFonts w:eastAsia="SimHei" w:ascii="Times New Roman" w:hAnsi="Times New Roman"/>
+        </w:rPr>
         <w:t>长公式与多行公式测试</w:t>
       </w:r>
       <w:bookmarkEnd w:id="42"/>
@@ -7343,7 +7869,6 @@
         </w:rPr>
         <w:t>本章用于检查长分数线、长根号及多行公式的边界。式</w:t>
       </w:r>
-      <w:r/>
       <w:hyperlink w:anchor="eq:long-fraction">
         <w:r>
           <w:rPr>
@@ -7358,7 +7883,6 @@
         </w:rPr>
         <w:t>和式</w:t>
       </w:r>
-      <w:r/>
       <w:hyperlink w:anchor="eq:long-system">
         <w:r>
           <w:rPr>
@@ -7394,11 +7918,11 @@
         <w:rPr>
           <w:position w:val="-70"/>
         </w:rPr>
-        <w:object w:dxaOrig="3540" w:dyaOrig="1460" w14:anchorId="70B5BDF8">
+        <w:object w:dxaOrig="3540" w:dyaOrig="1460" w14:anchorId="12CFFCCF">
           <v:shape id="_x0000_mtshape12" o:spid="_x0000_i1037" type="#_x0000_t75" style="width:177pt;height:1in" o:ole="">
             <v:imagedata r:id="rId65" o:title=""/>
           </v:shape>
-          <o:OLEObject Type="Embed" ProgID="Equation.DSMT4" ShapeID="_x0000_mtshape12" DrawAspect="Content" ObjectID="_1853347376" r:id="rId66"/>
+          <o:OLEObject Type="Embed" ProgID="Equation.DSMT4" ShapeID="_x0000_mtshape12" DrawAspect="Content" ObjectID="_1853353501" r:id="rId66"/>
         </w:object>
       </w:r>
       <w:r>
@@ -7438,11 +7962,11 @@
         <w:rPr>
           <w:position w:val="-30"/>
         </w:rPr>
-        <w:object w:dxaOrig="6640" w:dyaOrig="680" w14:anchorId="75114A96">
+        <w:object w:dxaOrig="6640" w:dyaOrig="680" w14:anchorId="6B0D624C">
           <v:shape id="_x0000_mtshape13" o:spid="_x0000_i1038" type="#_x0000_t75" style="width:332.15pt;height:33.85pt" o:ole="">
             <v:imagedata r:id="rId67" o:title=""/>
           </v:shape>
-          <o:OLEObject Type="Embed" ProgID="Equation.DSMT4" ShapeID="_x0000_mtshape13" DrawAspect="Content" ObjectID="_1853347377" r:id="rId68"/>
+          <o:OLEObject Type="Embed" ProgID="Equation.DSMT4" ShapeID="_x0000_mtshape13" DrawAspect="Content" ObjectID="_1853353502" r:id="rId68"/>
         </w:object>
       </w:r>
       <w:r>
@@ -7482,11 +8006,11 @@
         <w:rPr>
           <w:position w:val="-32"/>
         </w:rPr>
-        <w:object w:dxaOrig="4760" w:dyaOrig="780" w14:anchorId="346EAA39">
+        <w:object w:dxaOrig="4760" w:dyaOrig="780" w14:anchorId="2723391C">
           <v:shape id="_x0000_mtshape14" o:spid="_x0000_i1039" type="#_x0000_t75" style="width:237.85pt;height:39pt" o:ole="">
             <v:imagedata r:id="rId69" o:title=""/>
           </v:shape>
-          <o:OLEObject Type="Embed" ProgID="Equation.DSMT4" ShapeID="_x0000_mtshape14" DrawAspect="Content" ObjectID="_1853347378" r:id="rId70"/>
+          <o:OLEObject Type="Embed" ProgID="Equation.DSMT4" ShapeID="_x0000_mtshape14" DrawAspect="Content" ObjectID="_1853353503" r:id="rId70"/>
         </w:object>
       </w:r>
       <w:r>
@@ -7526,11 +8050,11 @@
         <w:rPr>
           <w:position w:val="-80"/>
         </w:rPr>
-        <w:object w:dxaOrig="3180" w:dyaOrig="1719" w14:anchorId="62538568">
+        <w:object w:dxaOrig="3180" w:dyaOrig="1719" w14:anchorId="23E1A960">
           <v:shape id="_x0000_mtshape15" o:spid="_x0000_i1040" type="#_x0000_t75" style="width:150.85pt;height:89.15pt" o:ole="">
             <v:imagedata r:id="rId71" o:title=""/>
           </v:shape>
-          <o:OLEObject Type="Embed" ProgID="Equation.DSMT4" ShapeID="_x0000_mtshape15" DrawAspect="Content" ObjectID="_1853347379" r:id="rId72"/>
+          <o:OLEObject Type="Embed" ProgID="Equation.DSMT4" ShapeID="_x0000_mtshape15" DrawAspect="Content" ObjectID="_1853353504" r:id="rId72"/>
         </w:object>
       </w:r>
       <w:r>
@@ -7570,11 +8094,11 @@
         <w:rPr>
           <w:position w:val="-118"/>
         </w:rPr>
-        <w:object w:dxaOrig="3100" w:dyaOrig="2480" w14:anchorId="034DD39E">
+        <w:object w:dxaOrig="3100" w:dyaOrig="2480" w14:anchorId="34B59D15">
           <v:shape id="_x0000_mtshape16" o:spid="_x0000_i1041" type="#_x0000_t75" style="width:155.15pt;height:123.85pt" o:ole="">
             <v:imagedata r:id="rId73" o:title=""/>
           </v:shape>
-          <o:OLEObject Type="Embed" ProgID="Equation.DSMT4" ShapeID="_x0000_mtshape16" DrawAspect="Content" ObjectID="_1853347380" r:id="rId74"/>
+          <o:OLEObject Type="Embed" ProgID="Equation.DSMT4" ShapeID="_x0000_mtshape16" DrawAspect="Content" ObjectID="_1853353505" r:id="rId74"/>
         </w:object>
       </w:r>
       <w:r>
@@ -7759,17 +8283,12 @@
               <w:rPr>
                 <w:position w:val="-24"/>
               </w:rPr>
-              <w:object w:dxaOrig="1440" w:dyaOrig="680" w14:anchorId="78F95EBB">
+              <w:object w:dxaOrig="1440" w:dyaOrig="680" w14:anchorId="6D39A972">
                 <v:shape id="_x0000_mtshape17" o:spid="_x0000_i1042" type="#_x0000_t75" style="width:1in;height:30.85pt" o:ole="">
                   <v:imagedata r:id="rId75" o:title=""/>
                 </v:shape>
-                <o:OLEObject Type="Embed" ProgID="Equation.DSMT4" ShapeID="_x0000_mtshape17" DrawAspect="Content" ObjectID="_1853347381" r:id="rId76"/>
+                <o:OLEObject Type="Embed" ProgID="Equation.DSMT4" ShapeID="_x0000_mtshape17" DrawAspect="Content" ObjectID="_1853353506" r:id="rId76"/>
               </w:object>
-            </w:r>
-            <w:r>
-              <w:rPr>
-                <w:sz w:val="21"/>
-              </w:rPr>
             </w:r>
           </w:p>
         </w:tc>
@@ -7827,17 +8346,12 @@
               <w:rPr>
                 <w:position w:val="-28"/>
               </w:rPr>
-              <w:object w:dxaOrig="1480" w:dyaOrig="780" w14:anchorId="1099EC8C">
+              <w:object w:dxaOrig="1480" w:dyaOrig="780" w14:anchorId="49E39685">
                 <v:shape id="_x0000_mtshape18" o:spid="_x0000_i1043" type="#_x0000_t75" style="width:66pt;height:35.15pt" o:ole="">
                   <v:imagedata r:id="rId77" o:title=""/>
                 </v:shape>
-                <o:OLEObject Type="Embed" ProgID="Equation.DSMT4" ShapeID="_x0000_mtshape18" DrawAspect="Content" ObjectID="_1853347382" r:id="rId78"/>
+                <o:OLEObject Type="Embed" ProgID="Equation.DSMT4" ShapeID="_x0000_mtshape18" DrawAspect="Content" ObjectID="_1853353507" r:id="rId78"/>
               </w:object>
-            </w:r>
-            <w:r>
-              <w:rPr>
-                <w:sz w:val="21"/>
-              </w:rPr>
             </w:r>
           </w:p>
         </w:tc>
@@ -7861,11 +8375,11 @@
         <w:rPr>
           <w:position w:val="-24"/>
         </w:rPr>
-        <w:object w:dxaOrig="580" w:dyaOrig="620" w14:anchorId="30ECE7C9">
+        <w:object w:dxaOrig="580" w:dyaOrig="620" w14:anchorId="491E16DA">
           <v:shape id="_x0000_mtshape19" o:spid="_x0000_i1044" type="#_x0000_t75" style="width:29.15pt;height:30.85pt" o:ole="">
             <v:imagedata r:id="rId79" o:title=""/>
           </v:shape>
-          <o:OLEObject Type="Embed" ProgID="Equation.DSMT4" ShapeID="_x0000_mtshape19" DrawAspect="Content" ObjectID="_1853347383" r:id="rId80"/>
+          <o:OLEObject Type="Embed" ProgID="Equation.DSMT4" ShapeID="_x0000_mtshape19" DrawAspect="Content" ObjectID="_1853353508" r:id="rId80"/>
         </w:object>
       </w:r>
       <w:r>
@@ -7877,7 +8391,6 @@
         </w:rPr>
         <w:t>同时出现时，应分别采用对应的字号，并保持引用</w:t>
       </w:r>
-      <w:r/>
       <w:hyperlink w:anchor="eq:long-system">
         <w:r>
           <w:rPr>
@@ -7892,7 +8405,6 @@
         </w:rPr>
         <w:t>及</w:t>
       </w:r>
-      <w:r/>
       <w:hyperlink w:anchor="eq:long-cases">
         <w:r>
           <w:rPr>
@@ -7930,15 +8442,24 @@
       <w:pPr>
         <w:pStyle w:val="1"/>
       </w:pPr>
-      <w:bookmarkStart w:id="50" w:name="_Toc242734615"/>
-      <w:r>
+      <w:bookmarkStart w:id="50" w:name="_Toc242740668"/>
+      <w:r>
+        <w:rPr>
+          <w:rFonts w:eastAsia="SimHei" w:ascii="Times New Roman" w:hAnsi="Times New Roman"/>
+        </w:rPr>
         <w:lastRenderedPageBreak/>
         <w:t>附录</w:t>
       </w:r>
       <w:r>
+        <w:rPr>
+          <w:rFonts w:eastAsia="SimHei" w:ascii="Times New Roman" w:hAnsi="Times New Roman"/>
+        </w:rPr>
         <w:t xml:space="preserve"> A  </w:t>
       </w:r>
       <w:r>
+        <w:rPr>
+          <w:rFonts w:eastAsia="SimHei" w:ascii="Times New Roman" w:hAnsi="Times New Roman"/>
+        </w:rPr>
         <w:t>补充材料</w:t>
       </w:r>
       <w:bookmarkEnd w:id="50"/>
@@ -8010,11 +8531,11 @@
         <w:rPr>
           <w:position w:val="-30"/>
         </w:rPr>
-        <w:object w:dxaOrig="2560" w:dyaOrig="760" w14:anchorId="71E93235">
+        <w:object w:dxaOrig="2560" w:dyaOrig="760" w14:anchorId="58ABE935">
           <v:shape id="_x0000_mtshape20" o:spid="_x0000_i1045" type="#_x0000_t75" style="width:126.85pt;height:38.15pt" o:ole="">
             <v:imagedata r:id="rId85" o:title=""/>
           </v:shape>
-          <o:OLEObject Type="Embed" ProgID="Equation.DSMT4" ShapeID="_x0000_mtshape20" DrawAspect="Content" ObjectID="_1853347384" r:id="rId86"/>
+          <o:OLEObject Type="Embed" ProgID="Equation.DSMT4" ShapeID="_x0000_mtshape20" DrawAspect="Content" ObjectID="_1853353509" r:id="rId86"/>
         </w:object>
       </w:r>
       <w:r>
@@ -8045,8 +8566,11 @@
       <w:pPr>
         <w:pStyle w:val="1"/>
       </w:pPr>
-      <w:bookmarkStart w:id="53" w:name="_Toc242734616"/>
-      <w:r>
+      <w:bookmarkStart w:id="53" w:name="_Toc242740669"/>
+      <w:r>
+        <w:rPr>
+          <w:rFonts w:eastAsia="SimHei" w:ascii="Times New Roman" w:hAnsi="Times New Roman"/>
+        </w:rPr>
         <w:lastRenderedPageBreak/>
         <w:t>参考文献</w:t>
       </w:r>
@@ -8483,8 +9007,11 @@
       <w:pPr>
         <w:pStyle w:val="1"/>
       </w:pPr>
-      <w:bookmarkStart w:id="61" w:name="_Toc242734617"/>
-      <w:r>
+      <w:bookmarkStart w:id="61" w:name="_Toc242740670"/>
+      <w:r>
+        <w:rPr>
+          <w:rFonts w:eastAsia="SimHei" w:ascii="Times New Roman" w:hAnsi="Times New Roman"/>
+        </w:rPr>
         <w:lastRenderedPageBreak/>
         <w:t>攻读博士学位期间的科研成果</w:t>
       </w:r>
@@ -8577,15 +9104,24 @@
       <w:pPr>
         <w:pStyle w:val="1"/>
       </w:pPr>
-      <w:bookmarkStart w:id="63" w:name="_Toc242734618"/>
-      <w:r>
+      <w:bookmarkStart w:id="63" w:name="_Toc242740671"/>
+      <w:r>
+        <w:rPr>
+          <w:rFonts w:eastAsia="SimHei" w:ascii="Times New Roman" w:hAnsi="Times New Roman"/>
+        </w:rPr>
         <w:lastRenderedPageBreak/>
         <w:t>致</w:t>
       </w:r>
       <w:r>
+        <w:rPr>
+          <w:rFonts w:eastAsia="SimHei" w:ascii="Times New Roman" w:hAnsi="Times New Roman"/>
+        </w:rPr>
         <w:t xml:space="preserve">  </w:t>
       </w:r>
       <w:r>
+        <w:rPr>
+          <w:rFonts w:eastAsia="SimHei" w:ascii="Times New Roman" w:hAnsi="Times New Roman"/>
+        </w:rPr>
         <w:t>谢</w:t>
       </w:r>
       <w:bookmarkEnd w:id="63"/>
@@ -9945,7 +10481,7 @@
   <w:abstractNum w:abstractNumId="0" w15:restartNumberingAfterBreak="0">
     <w:nsid w:val="0000A990"/>
     <w:multiLevelType w:val="multilevel"/>
-    <w:tmpl w:val="7B40BC58"/>
+    <w:tmpl w:val="85B6FD08"/>
     <w:lvl w:ilvl="0">
       <w:numFmt w:val="bullet"/>
       <w:lvlText w:val=" "/>
@@ -10126,7 +10662,7 @@
   <w:num w:numId="1" w16cid:durableId="954337032">
     <w:abstractNumId w:val="1"/>
   </w:num>
-  <w:num w:numId="2" w16cid:durableId="756488353">
+  <w:num w:numId="2" w16cid:durableId="36131596">
     <w:abstractNumId w:val="0"/>
   </w:num>
 </w:numbering>
@@ -10429,7 +10965,7 @@
       <w:outlineLvl w:val="0"/>
     </w:pPr>
     <w:rPr>
-      <w:rFonts w:asciiTheme="majorHAnsi" w:eastAsiaTheme="majorEastAsia" w:hAnsiTheme="majorHAnsi" w:cstheme="majorBidi"/>
+      <w:rFonts w:eastAsia="SimHei" w:cstheme="majorBidi" w:ascii="Times New Roman" w:hAnsi="Times New Roman"/>
       <w:b/>
       <w:sz w:val="32"/>
       <w:szCs w:val="40"/>
@@ -10454,7 +10990,7 @@
       <w:outlineLvl w:val="1"/>
     </w:pPr>
     <w:rPr>
-      <w:rFonts w:asciiTheme="majorHAnsi" w:eastAsiaTheme="majorEastAsia" w:hAnsiTheme="majorHAnsi" w:cstheme="majorBidi"/>
+      <w:rFonts w:eastAsia="SimHei" w:cstheme="majorBidi" w:ascii="Times New Roman" w:hAnsi="Times New Roman"/>
       <w:b/>
       <w:sz w:val="28"/>
       <w:szCs w:val="32"/>
@@ -10479,7 +11015,7 @@
       <w:outlineLvl w:val="2"/>
     </w:pPr>
     <w:rPr>
-      <w:rFonts w:eastAsiaTheme="majorEastAsia" w:cstheme="majorBidi"/>
+      <w:rFonts w:eastAsia="SimHei" w:cstheme="majorBidi" w:ascii="Times New Roman" w:hAnsi="Times New Roman"/>
       <w:b/>
       <w:szCs w:val="28"/>
     </w:rPr>
@@ -10683,7 +11219,7 @@
       <w:jc w:val="center"/>
     </w:pPr>
     <w:rPr>
-      <w:rFonts w:asciiTheme="majorHAnsi" w:eastAsia="黑体" w:hAnsiTheme="majorHAnsi" w:cstheme="majorBidi"/>
+      <w:rFonts w:eastAsia="黑体" w:cstheme="majorBidi"/>
       <w:b/>
       <w:sz w:val="44"/>
       <w:szCs w:val="56"/>
@@ -11440,10 +11976,11 @@
     <w:next w:val="a"/>
     <w:autoRedefine/>
     <w:uiPriority w:val="39"/>
-    <w:rsid w:val="000554BA"/>
+    <w:rsid w:val="007B396E"/>
     <w:rPr>
       <w:rFonts w:eastAsia="SimHei" w:ascii="Times New Roman" w:hAnsi="Times New Roman"/>
       <w:b/>
+      <w:sz w:val="28"/>
     </w:rPr>
   </w:style>
   <w:style w:type="paragraph" w:styleId="TOC2">
@@ -11452,10 +11989,14 @@
     <w:next w:val="a"/>
     <w:autoRedefine/>
     <w:uiPriority w:val="39"/>
-    <w:rsid w:val="000554BA"/>
+    <w:rsid w:val="007B396E"/>
     <w:pPr>
       <w:ind w:leftChars="200" w:left="420"/>
     </w:pPr>
+    <w:rPr>
+      <w:rFonts w:ascii="Times New Roman" w:hAnsi="Times New Roman" w:eastAsia="SimSun"/>
+      <w:sz w:val="24"/>
+    </w:rPr>
   </w:style>
   <w:style w:type="paragraph" w:styleId="TOC3">
     <w:name w:val="toc 3"/>
@@ -11463,10 +12004,14 @@
     <w:next w:val="a"/>
     <w:autoRedefine/>
     <w:uiPriority w:val="39"/>
-    <w:rsid w:val="000554BA"/>
+    <w:rsid w:val="007B396E"/>
     <w:pPr>
       <w:ind w:leftChars="400" w:left="840"/>
     </w:pPr>
+    <w:rPr>
+      <w:rFonts w:ascii="Times New Roman" w:hAnsi="Times New Roman" w:eastAsia="SimSun"/>
+      <w:sz w:val="24"/>
+    </w:rPr>
   </w:style>
 </w:styles>
 </file>

</xml_diff>